<commit_message>
Add flashlight and stillness screens, update art
Introduce two new interactive screens (adv_flashlight_search and adv_stillness) to support flashlight hotspot searching and a timed "stillness" mechanic; integrate them into adventure chapters 2–5 to change investigation and combat outcomes (found clues, damage/fear, pattern success). Update screens.rpy with full UI for hotspot search and timed input, add GUI asset gui/adventure/flashlight_beam.svg, and new character images (mak_ros, melur phone, zulkifli serious) plus base_chara replacements/removals. Adjust images.rpy to use real transformed sprites (melur, owner, mak_ros, hafiz zoom tweak) and tweak adv_trio xalign values. Also updated several scene scripts to call the new screens and updated docs production lists.
</commit_message>
<xml_diff>
--- a/docs/Bayangan_Audio_Production_List.docx
+++ b/docs/Bayangan_Audio_Production_List.docx
@@ -4,315 +4,90 @@
   <w:body>
     <w:p>
       <w:pPr>
-        <w:spacing w:before="1840" w:after="0"/>
-        <w:jc w:val="center"/>
+        <w:pStyle w:val="Title"/>
+        <w:jc w:val="left"/>
       </w:pPr>
       <w:r>
         <w:rPr>
-          <w:rFonts w:ascii="Aptos Display" w:hAnsi="Aptos Display" w:eastAsia="Aptos Display"/>
           <w:b/>
-          <w:color w:val="5D2525"/>
-          <w:sz w:val="50"/>
         </w:rPr>
         <w:t>Bayangan yang Tertinggal</w:t>
       </w:r>
     </w:p>
     <w:p>
       <w:pPr>
-        <w:spacing w:after="360"/>
-        <w:jc w:val="center"/>
+        <w:pStyle w:val="Subtitle"/>
       </w:pPr>
       <w:r>
         <w:rPr>
-          <w:rFonts w:ascii="Aptos" w:hAnsi="Aptos" w:eastAsia="Aptos"/>
-          <w:color w:val="5A534C"/>
-          <w:sz w:val="24"/>
+          <w:b/>
         </w:rPr>
         <w:t>Current Adventure Route Audio Production List</w:t>
       </w:r>
     </w:p>
+    <w:p>
+      <w:pPr>
+        <w:spacing w:after="80"/>
+      </w:pPr>
+      <w:r>
+        <w:rPr>
+          <w:b/>
+        </w:rPr>
+        <w:t xml:space="preserve">Scope: </w:t>
+      </w:r>
+      <w:r>
+        <w:t>Active adventure route after flashlight search and rhythm stillness mechanics. Deprecated beat files and unused abandoned-route assets are excluded.</w:t>
+      </w:r>
+    </w:p>
+    <w:p>
+      <w:pPr>
+        <w:spacing w:after="120"/>
+      </w:pPr>
+      <w:r>
+        <w:t>Production target: 5 ambience loops, 1 music cue, and 25 SFX. Use .ogg files under game/audio/ambience/, game/audio/music/, and game/audio/sfx/ for Ren'Py.</w:t>
+      </w:r>
+    </w:p>
+    <w:p>
+      <w:pPr>
+        <w:pStyle w:val="Heading1"/>
+      </w:pPr>
+      <w:r>
+        <w:t>Audio Asset List</w:t>
+      </w:r>
+    </w:p>
+    <w:p>
+      <w:pPr>
+        <w:spacing w:after="120"/>
+      </w:pPr>
+      <w:r>
+        <w:t>Existing planned audio plus new mechanic-specific SFX for the flashlight search and rhythm Spacebar mini-game.</w:t>
+      </w:r>
+    </w:p>
     <w:tbl>
       <w:tblPr>
+        <w:tblStyle w:val="TableGrid"/>
         <w:tblW w:type="auto" w:w="0"/>
         <w:jc w:val="center"/>
         <w:tblLayout w:type="fixed"/>
         <w:tblLook w:firstColumn="1" w:firstRow="1" w:lastColumn="0" w:lastRow="0" w:noHBand="0" w:noVBand="1" w:val="04A0"/>
       </w:tblPr>
       <w:tblGrid>
-        <w:gridCol w:w="3672"/>
-        <w:gridCol w:w="3672"/>
-        <w:gridCol w:w="3672"/>
-        <w:gridCol w:w="3672"/>
+        <w:gridCol w:w="3600"/>
+        <w:gridCol w:w="3600"/>
+        <w:gridCol w:w="3600"/>
+        <w:gridCol w:w="3600"/>
       </w:tblGrid>
       <w:tr>
         <w:tc>
           <w:tcPr>
-            <w:tcW w:type="dxa" w:w="8136"/>
+            <w:tcW w:type="dxa" w:w="864"/>
             <w:vAlign w:val="center"/>
-            <w:shd w:fill="EFE6DA"/>
-            <w:tcBorders>
-              <w:top w:val="single" w:sz="8" w:space="0" w:color="C9BBAE"/>
-              <w:left w:val="single" w:sz="8" w:space="0" w:color="C9BBAE"/>
-              <w:bottom w:val="single" w:sz="8" w:space="0" w:color="C9BBAE"/>
-              <w:right w:val="single" w:sz="8" w:space="0" w:color="C9BBAE"/>
-            </w:tcBorders>
-            <w:tcMar>
-              <w:top w:w="110" w:type="dxa"/>
-              <w:start w:w="110" w:type="dxa"/>
-              <w:bottom w:w="110" w:type="dxa"/>
-              <w:end w:w="110" w:type="dxa"/>
-            </w:tcMar>
           </w:tcPr>
           <w:p>
-            <w:pPr>
-              <w:jc w:val="center"/>
-            </w:pPr>
             <w:r>
               <w:rPr>
-                <w:rFonts w:ascii="Aptos" w:hAnsi="Aptos" w:eastAsia="Aptos"/>
+                <w:rFonts w:ascii="Arial" w:hAnsi="Arial"/>
                 <w:b/>
-                <w:color w:val="5D2525"/>
-                <w:sz w:val="17"/>
-              </w:rPr>
-              <w:t>Route</w:t>
-              <w:br/>
-            </w:r>
-            <w:r>
-              <w:rPr>
-                <w:rFonts w:ascii="Aptos" w:hAnsi="Aptos" w:eastAsia="Aptos"/>
-                <w:color w:val="232323"/>
-                <w:sz w:val="18"/>
-              </w:rPr>
-              <w:t>script.rpy -&gt; adventure_start -&gt; scenes/adventure_route.rpy</w:t>
-            </w:r>
-          </w:p>
-        </w:tc>
-        <w:tc>
-          <w:tcPr>
-            <w:tcW w:type="dxa" w:w="2160"/>
-            <w:vAlign w:val="center"/>
-            <w:shd w:fill="EFE6DA"/>
-            <w:tcBorders>
-              <w:top w:val="single" w:sz="8" w:space="0" w:color="C9BBAE"/>
-              <w:left w:val="single" w:sz="8" w:space="0" w:color="C9BBAE"/>
-              <w:bottom w:val="single" w:sz="8" w:space="0" w:color="C9BBAE"/>
-              <w:right w:val="single" w:sz="8" w:space="0" w:color="C9BBAE"/>
-            </w:tcBorders>
-            <w:tcMar>
-              <w:top w:w="110" w:type="dxa"/>
-              <w:start w:w="110" w:type="dxa"/>
-              <w:bottom w:w="110" w:type="dxa"/>
-              <w:end w:w="110" w:type="dxa"/>
-            </w:tcMar>
-          </w:tcPr>
-          <w:p>
-            <w:pPr>
-              <w:jc w:val="center"/>
-            </w:pPr>
-            <w:r>
-              <w:rPr>
-                <w:rFonts w:ascii="Aptos" w:hAnsi="Aptos" w:eastAsia="Aptos"/>
-                <w:b/>
-                <w:color w:val="5D2525"/>
-                <w:sz w:val="17"/>
-              </w:rPr>
-              <w:t>Ambience</w:t>
-              <w:br/>
-            </w:r>
-            <w:r>
-              <w:rPr>
-                <w:rFonts w:ascii="Aptos" w:hAnsi="Aptos" w:eastAsia="Aptos"/>
-                <w:color w:val="232323"/>
-                <w:sz w:val="18"/>
-              </w:rPr>
-              <w:t>5</w:t>
-            </w:r>
-          </w:p>
-        </w:tc>
-        <w:tc>
-          <w:tcPr>
-            <w:tcW w:type="dxa" w:w="2160"/>
-            <w:vAlign w:val="center"/>
-            <w:shd w:fill="EFE6DA"/>
-            <w:tcBorders>
-              <w:top w:val="single" w:sz="8" w:space="0" w:color="C9BBAE"/>
-              <w:left w:val="single" w:sz="8" w:space="0" w:color="C9BBAE"/>
-              <w:bottom w:val="single" w:sz="8" w:space="0" w:color="C9BBAE"/>
-              <w:right w:val="single" w:sz="8" w:space="0" w:color="C9BBAE"/>
-            </w:tcBorders>
-            <w:tcMar>
-              <w:top w:w="110" w:type="dxa"/>
-              <w:start w:w="110" w:type="dxa"/>
-              <w:bottom w:w="110" w:type="dxa"/>
-              <w:end w:w="110" w:type="dxa"/>
-            </w:tcMar>
-          </w:tcPr>
-          <w:p>
-            <w:pPr>
-              <w:jc w:val="center"/>
-            </w:pPr>
-            <w:r>
-              <w:rPr>
-                <w:rFonts w:ascii="Aptos" w:hAnsi="Aptos" w:eastAsia="Aptos"/>
-                <w:b/>
-                <w:color w:val="5D2525"/>
-                <w:sz w:val="17"/>
-              </w:rPr>
-              <w:t>Music</w:t>
-              <w:br/>
-            </w:r>
-            <w:r>
-              <w:rPr>
-                <w:rFonts w:ascii="Aptos" w:hAnsi="Aptos" w:eastAsia="Aptos"/>
-                <w:color w:val="232323"/>
-                <w:sz w:val="18"/>
-              </w:rPr>
-              <w:t>1</w:t>
-            </w:r>
-          </w:p>
-        </w:tc>
-        <w:tc>
-          <w:tcPr>
-            <w:tcW w:type="dxa" w:w="2160"/>
-            <w:vAlign w:val="center"/>
-            <w:shd w:fill="EFE6DA"/>
-            <w:tcBorders>
-              <w:top w:val="single" w:sz="8" w:space="0" w:color="C9BBAE"/>
-              <w:left w:val="single" w:sz="8" w:space="0" w:color="C9BBAE"/>
-              <w:bottom w:val="single" w:sz="8" w:space="0" w:color="C9BBAE"/>
-              <w:right w:val="single" w:sz="8" w:space="0" w:color="C9BBAE"/>
-            </w:tcBorders>
-            <w:tcMar>
-              <w:top w:w="110" w:type="dxa"/>
-              <w:start w:w="110" w:type="dxa"/>
-              <w:bottom w:w="110" w:type="dxa"/>
-              <w:end w:w="110" w:type="dxa"/>
-            </w:tcMar>
-          </w:tcPr>
-          <w:p>
-            <w:pPr>
-              <w:jc w:val="center"/>
-            </w:pPr>
-            <w:r>
-              <w:rPr>
-                <w:rFonts w:ascii="Aptos" w:hAnsi="Aptos" w:eastAsia="Aptos"/>
-                <w:b/>
-                <w:color w:val="5D2525"/>
-                <w:sz w:val="17"/>
-              </w:rPr>
-              <w:t>SFX</w:t>
-              <w:br/>
-            </w:r>
-            <w:r>
-              <w:rPr>
-                <w:rFonts w:ascii="Aptos" w:hAnsi="Aptos" w:eastAsia="Aptos"/>
-                <w:color w:val="232323"/>
-                <w:sz w:val="18"/>
-              </w:rPr>
-              <w:t>17</w:t>
-            </w:r>
-          </w:p>
-        </w:tc>
-      </w:tr>
-    </w:tbl>
-    <w:p>
-      <w:pPr>
-        <w:spacing w:before="280" w:after="0" w:line="252" w:lineRule="auto"/>
-        <w:jc w:val="center"/>
-      </w:pPr>
-      <w:r>
-        <w:rPr>
-          <w:rFonts w:ascii="Aptos" w:hAnsi="Aptos" w:eastAsia="Aptos"/>
-          <w:b w:val="0"/>
-          <w:color w:val="333333"/>
-          <w:sz w:val="19"/>
-        </w:rPr>
-        <w:t xml:space="preserve">Scope: </w:t>
-      </w:r>
-      <w:r>
-        <w:rPr>
-          <w:rFonts w:ascii="Aptos" w:hAnsi="Aptos" w:eastAsia="Aptos"/>
-          <w:b w:val="0"/>
-          <w:color w:val="333333"/>
-          <w:sz w:val="19"/>
-        </w:rPr>
-        <w:t>Active adventure route only. Deprecated beat files and unused abandoned-route assets are excluded.</w:t>
-      </w:r>
-    </w:p>
-    <w:p>
-      <w:pPr>
-        <w:spacing w:after="0" w:line="252" w:lineRule="auto"/>
-        <w:jc w:val="center"/>
-      </w:pPr>
-      <w:r>
-        <w:rPr>
-          <w:rFonts w:ascii="Aptos" w:hAnsi="Aptos" w:eastAsia="Aptos"/>
-          <w:b w:val="0"/>
-          <w:color w:val="333333"/>
-          <w:sz w:val="19"/>
-        </w:rPr>
-        <w:t xml:space="preserve">Folder structure: </w:t>
-      </w:r>
-      <w:r>
-        <w:rPr>
-          <w:rFonts w:ascii="Aptos" w:hAnsi="Aptos" w:eastAsia="Aptos"/>
-          <w:b w:val="0"/>
-          <w:color w:val="333333"/>
-          <w:sz w:val="19"/>
-        </w:rPr>
-        <w:t>game/audio/ambience/, game/audio/music/, and game/audio/sfx/. Use .ogg files for Ren'Py.</w:t>
-      </w:r>
-    </w:p>
-    <w:p>
-      <w:r>
-        <w:br w:type="page"/>
-      </w:r>
-    </w:p>
-    <w:tbl>
-      <w:tblPr>
-        <w:tblW w:type="auto" w:w="0"/>
-        <w:jc w:val="center"/>
-        <w:tblLayout w:type="fixed"/>
-        <w:tblLook w:firstColumn="1" w:firstRow="1" w:lastColumn="0" w:lastRow="0" w:noHBand="0" w:noVBand="1" w:val="04A0"/>
-      </w:tblPr>
-      <w:tblGrid>
-        <w:gridCol w:w="3672"/>
-        <w:gridCol w:w="3672"/>
-        <w:gridCol w:w="3672"/>
-        <w:gridCol w:w="3672"/>
-      </w:tblGrid>
-      <w:tr>
-        <w:trPr>
-          <w:tblHeader w:val="true"/>
-        </w:trPr>
-        <w:tc>
-          <w:tcPr>
-            <w:tcW w:type="dxa" w:w="1512"/>
-            <w:vAlign w:val="center"/>
-            <w:shd w:fill="5D2525"/>
-            <w:tcBorders>
-              <w:top w:val="single" w:sz="8" w:space="0" w:color="5D2525"/>
-              <w:left w:val="single" w:sz="8" w:space="0" w:color="5D2525"/>
-              <w:bottom w:val="single" w:sz="8" w:space="0" w:color="5D2525"/>
-              <w:right w:val="single" w:sz="8" w:space="0" w:color="5D2525"/>
-            </w:tcBorders>
-            <w:tcMar>
-              <w:top w:w="90" w:type="dxa"/>
-              <w:start w:w="110" w:type="dxa"/>
-              <w:bottom w:w="90" w:type="dxa"/>
-              <w:end w:w="110" w:type="dxa"/>
-            </w:tcMar>
-          </w:tcPr>
-          <w:p>
-            <w:pPr>
-              <w:spacing w:after="0" w:line="252" w:lineRule="auto"/>
-              <w:jc w:val="center"/>
-            </w:pPr>
-            <w:r>
-              <w:rPr>
-                <w:rFonts w:ascii="Aptos" w:hAnsi="Aptos" w:eastAsia="Aptos"/>
-                <w:b/>
-                <w:color w:val="FFFFFF"/>
                 <w:sz w:val="17"/>
               </w:rPr>
               <w:t>Type</w:t>
@@ -321,32 +96,14 @@
         </w:tc>
         <w:tc>
           <w:tcPr>
-            <w:tcW w:type="dxa" w:w="2951"/>
+            <w:tcW w:type="dxa" w:w="2016"/>
             <w:vAlign w:val="center"/>
-            <w:shd w:fill="5D2525"/>
-            <w:tcBorders>
-              <w:top w:val="single" w:sz="8" w:space="0" w:color="5D2525"/>
-              <w:left w:val="single" w:sz="8" w:space="0" w:color="5D2525"/>
-              <w:bottom w:val="single" w:sz="8" w:space="0" w:color="5D2525"/>
-              <w:right w:val="single" w:sz="8" w:space="0" w:color="5D2525"/>
-            </w:tcBorders>
-            <w:tcMar>
-              <w:top w:w="90" w:type="dxa"/>
-              <w:start w:w="110" w:type="dxa"/>
-              <w:bottom w:w="90" w:type="dxa"/>
-              <w:end w:w="110" w:type="dxa"/>
-            </w:tcMar>
           </w:tcPr>
           <w:p>
-            <w:pPr>
-              <w:spacing w:after="0" w:line="252" w:lineRule="auto"/>
-              <w:jc w:val="center"/>
-            </w:pPr>
             <w:r>
               <w:rPr>
-                <w:rFonts w:ascii="Aptos" w:hAnsi="Aptos" w:eastAsia="Aptos"/>
+                <w:rFonts w:ascii="Arial" w:hAnsi="Arial"/>
                 <w:b/>
-                <w:color w:val="FFFFFF"/>
                 <w:sz w:val="17"/>
               </w:rPr>
               <w:t>File</w:t>
@@ -355,32 +112,14 @@
         </w:tc>
         <w:tc>
           <w:tcPr>
-            <w:tcW w:type="dxa" w:w="4176"/>
+            <w:tcW w:type="dxa" w:w="2880"/>
             <w:vAlign w:val="center"/>
-            <w:shd w:fill="5D2525"/>
-            <w:tcBorders>
-              <w:top w:val="single" w:sz="8" w:space="0" w:color="5D2525"/>
-              <w:left w:val="single" w:sz="8" w:space="0" w:color="5D2525"/>
-              <w:bottom w:val="single" w:sz="8" w:space="0" w:color="5D2525"/>
-              <w:right w:val="single" w:sz="8" w:space="0" w:color="5D2525"/>
-            </w:tcBorders>
-            <w:tcMar>
-              <w:top w:w="90" w:type="dxa"/>
-              <w:start w:w="110" w:type="dxa"/>
-              <w:bottom w:w="90" w:type="dxa"/>
-              <w:end w:w="110" w:type="dxa"/>
-            </w:tcMar>
           </w:tcPr>
           <w:p>
-            <w:pPr>
-              <w:spacing w:after="0" w:line="252" w:lineRule="auto"/>
-              <w:jc w:val="center"/>
-            </w:pPr>
             <w:r>
               <w:rPr>
-                <w:rFonts w:ascii="Aptos" w:hAnsi="Aptos" w:eastAsia="Aptos"/>
+                <w:rFonts w:ascii="Arial" w:hAnsi="Arial"/>
                 <w:b/>
-                <w:color w:val="FFFFFF"/>
                 <w:sz w:val="17"/>
               </w:rPr>
               <w:t>Used In</w:t>
@@ -389,32 +128,14 @@
         </w:tc>
         <w:tc>
           <w:tcPr>
-            <w:tcW w:type="dxa" w:w="6048"/>
+            <w:tcW w:type="dxa" w:w="8352"/>
             <w:vAlign w:val="center"/>
-            <w:shd w:fill="5D2525"/>
-            <w:tcBorders>
-              <w:top w:val="single" w:sz="8" w:space="0" w:color="5D2525"/>
-              <w:left w:val="single" w:sz="8" w:space="0" w:color="5D2525"/>
-              <w:bottom w:val="single" w:sz="8" w:space="0" w:color="5D2525"/>
-              <w:right w:val="single" w:sz="8" w:space="0" w:color="5D2525"/>
-            </w:tcBorders>
-            <w:tcMar>
-              <w:top w:w="90" w:type="dxa"/>
-              <w:start w:w="110" w:type="dxa"/>
-              <w:bottom w:w="90" w:type="dxa"/>
-              <w:end w:w="110" w:type="dxa"/>
-            </w:tcMar>
           </w:tcPr>
           <w:p>
-            <w:pPr>
-              <w:spacing w:after="0" w:line="252" w:lineRule="auto"/>
-              <w:jc w:val="center"/>
-            </w:pPr>
             <w:r>
               <w:rPr>
-                <w:rFonts w:ascii="Aptos" w:hAnsi="Aptos" w:eastAsia="Aptos"/>
+                <w:rFonts w:ascii="Arial" w:hAnsi="Arial"/>
                 <w:b/>
-                <w:color w:val="FFFFFF"/>
                 <w:sz w:val="17"/>
               </w:rPr>
               <w:t>Purpose</w:t>
@@ -425,32 +146,16 @@
       <w:tr>
         <w:tc>
           <w:tcPr>
-            <w:tcW w:type="dxa" w:w="1512"/>
+            <w:tcW w:type="dxa" w:w="864"/>
             <w:vAlign w:val="center"/>
-            <w:shd w:fill="FCFAF7"/>
-            <w:tcBorders>
-              <w:top w:val="single" w:sz="8" w:space="0" w:color="D9D2C8"/>
-              <w:left w:val="single" w:sz="8" w:space="0" w:color="D9D2C8"/>
-              <w:bottom w:val="single" w:sz="8" w:space="0" w:color="D9D2C8"/>
-              <w:right w:val="single" w:sz="8" w:space="0" w:color="D9D2C8"/>
-            </w:tcBorders>
-            <w:tcMar>
-              <w:top w:w="70" w:type="dxa"/>
-              <w:start w:w="110" w:type="dxa"/>
-              <w:bottom w:w="70" w:type="dxa"/>
-              <w:end w:w="110" w:type="dxa"/>
-            </w:tcMar>
           </w:tcPr>
           <w:p>
             <w:pPr>
-              <w:spacing w:after="0" w:line="252" w:lineRule="auto"/>
-              <w:jc w:val="center"/>
+              <w:spacing w:after="0"/>
             </w:pPr>
             <w:r>
               <w:rPr>
-                <w:rFonts w:ascii="Aptos" w:hAnsi="Aptos" w:eastAsia="Aptos"/>
-                <w:b w:val="0"/>
-                <w:color w:val="222222"/>
+                <w:rFonts w:ascii="Arial" w:hAnsi="Arial"/>
                 <w:sz w:val="16"/>
               </w:rPr>
               <w:t>Ambience</w:t>
@@ -459,32 +164,16 @@
         </w:tc>
         <w:tc>
           <w:tcPr>
-            <w:tcW w:type="dxa" w:w="2951"/>
+            <w:tcW w:type="dxa" w:w="2016"/>
             <w:vAlign w:val="center"/>
-            <w:shd w:fill="FCFAF7"/>
-            <w:tcBorders>
-              <w:top w:val="single" w:sz="8" w:space="0" w:color="D9D2C8"/>
-              <w:left w:val="single" w:sz="8" w:space="0" w:color="D9D2C8"/>
-              <w:bottom w:val="single" w:sz="8" w:space="0" w:color="D9D2C8"/>
-              <w:right w:val="single" w:sz="8" w:space="0" w:color="D9D2C8"/>
-            </w:tcBorders>
-            <w:tcMar>
-              <w:top w:w="70" w:type="dxa"/>
-              <w:start w:w="110" w:type="dxa"/>
-              <w:bottom w:w="70" w:type="dxa"/>
-              <w:end w:w="110" w:type="dxa"/>
-            </w:tcMar>
           </w:tcPr>
           <w:p>
             <w:pPr>
-              <w:spacing w:after="0" w:line="252" w:lineRule="auto"/>
-              <w:jc w:val="left"/>
+              <w:spacing w:after="0"/>
             </w:pPr>
             <w:r>
               <w:rPr>
-                <w:rFonts w:ascii="Aptos" w:hAnsi="Aptos" w:eastAsia="Aptos"/>
-                <w:b w:val="0"/>
-                <w:color w:val="222222"/>
+                <w:rFonts w:ascii="Arial" w:hAnsi="Arial"/>
                 <w:sz w:val="16"/>
               </w:rPr>
               <w:t>amb_village_night.ogg</w:t>
@@ -493,32 +182,16 @@
         </w:tc>
         <w:tc>
           <w:tcPr>
-            <w:tcW w:type="dxa" w:w="4176"/>
+            <w:tcW w:type="dxa" w:w="2880"/>
             <w:vAlign w:val="center"/>
-            <w:shd w:fill="FCFAF7"/>
-            <w:tcBorders>
-              <w:top w:val="single" w:sz="8" w:space="0" w:color="D9D2C8"/>
-              <w:left w:val="single" w:sz="8" w:space="0" w:color="D9D2C8"/>
-              <w:bottom w:val="single" w:sz="8" w:space="0" w:color="D9D2C8"/>
-              <w:right w:val="single" w:sz="8" w:space="0" w:color="D9D2C8"/>
-            </w:tcBorders>
-            <w:tcMar>
-              <w:top w:w="70" w:type="dxa"/>
-              <w:start w:w="110" w:type="dxa"/>
-              <w:bottom w:w="70" w:type="dxa"/>
-              <w:end w:w="110" w:type="dxa"/>
-            </w:tcMar>
           </w:tcPr>
           <w:p>
             <w:pPr>
-              <w:spacing w:after="0" w:line="252" w:lineRule="auto"/>
-              <w:jc w:val="left"/>
+              <w:spacing w:after="0"/>
             </w:pPr>
             <w:r>
               <w:rPr>
-                <w:rFonts w:ascii="Aptos" w:hAnsi="Aptos" w:eastAsia="Aptos"/>
-                <w:b w:val="0"/>
-                <w:color w:val="222222"/>
+                <w:rFonts w:ascii="Arial" w:hAnsi="Arial"/>
                 <w:sz w:val="16"/>
               </w:rPr>
               <w:t>adv_prologue; adv_chapter2; adv_chapter4; adv_abandon_ending</w:t>
@@ -527,35 +200,19 @@
         </w:tc>
         <w:tc>
           <w:tcPr>
-            <w:tcW w:type="dxa" w:w="6048"/>
+            <w:tcW w:type="dxa" w:w="8352"/>
             <w:vAlign w:val="center"/>
-            <w:shd w:fill="FCFAF7"/>
-            <w:tcBorders>
-              <w:top w:val="single" w:sz="8" w:space="0" w:color="D9D2C8"/>
-              <w:left w:val="single" w:sz="8" w:space="0" w:color="D9D2C8"/>
-              <w:bottom w:val="single" w:sz="8" w:space="0" w:color="D9D2C8"/>
-              <w:right w:val="single" w:sz="8" w:space="0" w:color="D9D2C8"/>
-            </w:tcBorders>
-            <w:tcMar>
-              <w:top w:w="70" w:type="dxa"/>
-              <w:start w:w="110" w:type="dxa"/>
-              <w:bottom w:w="70" w:type="dxa"/>
-              <w:end w:w="110" w:type="dxa"/>
-            </w:tcMar>
           </w:tcPr>
           <w:p>
             <w:pPr>
-              <w:spacing w:after="0" w:line="252" w:lineRule="auto"/>
-              <w:jc w:val="left"/>
+              <w:spacing w:after="0"/>
             </w:pPr>
             <w:r>
               <w:rPr>
-                <w:rFonts w:ascii="Aptos" w:hAnsi="Aptos" w:eastAsia="Aptos"/>
-                <w:b w:val="0"/>
-                <w:color w:val="222222"/>
+                <w:rFonts w:ascii="Arial" w:hAnsi="Arial"/>
                 <w:sz w:val="16"/>
               </w:rPr>
-              <w:t>Night village atmosphere for dread, silence, and pocong presence.</w:t>
+              <w:t>Night village atmosphere with dread, silence, and pocong presence.</w:t>
             </w:r>
           </w:p>
         </w:tc>
@@ -563,32 +220,16 @@
       <w:tr>
         <w:tc>
           <w:tcPr>
-            <w:tcW w:type="dxa" w:w="1512"/>
+            <w:tcW w:type="dxa" w:w="864"/>
             <w:vAlign w:val="center"/>
-            <w:shd w:fill="F4EFE8"/>
-            <w:tcBorders>
-              <w:top w:val="single" w:sz="8" w:space="0" w:color="D9D2C8"/>
-              <w:left w:val="single" w:sz="8" w:space="0" w:color="D9D2C8"/>
-              <w:bottom w:val="single" w:sz="8" w:space="0" w:color="D9D2C8"/>
-              <w:right w:val="single" w:sz="8" w:space="0" w:color="D9D2C8"/>
-            </w:tcBorders>
-            <w:tcMar>
-              <w:top w:w="70" w:type="dxa"/>
-              <w:start w:w="110" w:type="dxa"/>
-              <w:bottom w:w="70" w:type="dxa"/>
-              <w:end w:w="110" w:type="dxa"/>
-            </w:tcMar>
           </w:tcPr>
           <w:p>
             <w:pPr>
-              <w:spacing w:after="0" w:line="252" w:lineRule="auto"/>
-              <w:jc w:val="center"/>
+              <w:spacing w:after="0"/>
             </w:pPr>
             <w:r>
               <w:rPr>
-                <w:rFonts w:ascii="Aptos" w:hAnsi="Aptos" w:eastAsia="Aptos"/>
-                <w:b w:val="0"/>
-                <w:color w:val="222222"/>
+                <w:rFonts w:ascii="Arial" w:hAnsi="Arial"/>
                 <w:sz w:val="16"/>
               </w:rPr>
               <w:t>Ambience</w:t>
@@ -597,32 +238,16 @@
         </w:tc>
         <w:tc>
           <w:tcPr>
-            <w:tcW w:type="dxa" w:w="2951"/>
+            <w:tcW w:type="dxa" w:w="2016"/>
             <w:vAlign w:val="center"/>
-            <w:shd w:fill="F4EFE8"/>
-            <w:tcBorders>
-              <w:top w:val="single" w:sz="8" w:space="0" w:color="D9D2C8"/>
-              <w:left w:val="single" w:sz="8" w:space="0" w:color="D9D2C8"/>
-              <w:bottom w:val="single" w:sz="8" w:space="0" w:color="D9D2C8"/>
-              <w:right w:val="single" w:sz="8" w:space="0" w:color="D9D2C8"/>
-            </w:tcBorders>
-            <w:tcMar>
-              <w:top w:w="70" w:type="dxa"/>
-              <w:start w:w="110" w:type="dxa"/>
-              <w:bottom w:w="70" w:type="dxa"/>
-              <w:end w:w="110" w:type="dxa"/>
-            </w:tcMar>
           </w:tcPr>
           <w:p>
             <w:pPr>
-              <w:spacing w:after="0" w:line="252" w:lineRule="auto"/>
-              <w:jc w:val="left"/>
+              <w:spacing w:after="0"/>
             </w:pPr>
             <w:r>
               <w:rPr>
-                <w:rFonts w:ascii="Aptos" w:hAnsi="Aptos" w:eastAsia="Aptos"/>
-                <w:b w:val="0"/>
-                <w:color w:val="222222"/>
+                <w:rFonts w:ascii="Arial" w:hAnsi="Arial"/>
                 <w:sz w:val="16"/>
               </w:rPr>
               <w:t>amb_village_day.ogg</w:t>
@@ -631,32 +256,16 @@
         </w:tc>
         <w:tc>
           <w:tcPr>
-            <w:tcW w:type="dxa" w:w="4176"/>
+            <w:tcW w:type="dxa" w:w="2880"/>
             <w:vAlign w:val="center"/>
-            <w:shd w:fill="F4EFE8"/>
-            <w:tcBorders>
-              <w:top w:val="single" w:sz="8" w:space="0" w:color="D9D2C8"/>
-              <w:left w:val="single" w:sz="8" w:space="0" w:color="D9D2C8"/>
-              <w:bottom w:val="single" w:sz="8" w:space="0" w:color="D9D2C8"/>
-              <w:right w:val="single" w:sz="8" w:space="0" w:color="D9D2C8"/>
-            </w:tcBorders>
-            <w:tcMar>
-              <w:top w:w="70" w:type="dxa"/>
-              <w:start w:w="110" w:type="dxa"/>
-              <w:bottom w:w="70" w:type="dxa"/>
-              <w:end w:w="110" w:type="dxa"/>
-            </w:tcMar>
           </w:tcPr>
           <w:p>
             <w:pPr>
-              <w:spacing w:after="0" w:line="252" w:lineRule="auto"/>
-              <w:jc w:val="left"/>
+              <w:spacing w:after="0"/>
             </w:pPr>
             <w:r>
               <w:rPr>
-                <w:rFonts w:ascii="Aptos" w:hAnsi="Aptos" w:eastAsia="Aptos"/>
-                <w:b w:val="0"/>
-                <w:color w:val="222222"/>
+                <w:rFonts w:ascii="Arial" w:hAnsi="Arial"/>
                 <w:sz w:val="16"/>
               </w:rPr>
               <w:t>adv_chapter3; adv_investigation_hub</w:t>
@@ -665,32 +274,16 @@
         </w:tc>
         <w:tc>
           <w:tcPr>
-            <w:tcW w:type="dxa" w:w="6048"/>
+            <w:tcW w:type="dxa" w:w="8352"/>
             <w:vAlign w:val="center"/>
-            <w:shd w:fill="F4EFE8"/>
-            <w:tcBorders>
-              <w:top w:val="single" w:sz="8" w:space="0" w:color="D9D2C8"/>
-              <w:left w:val="single" w:sz="8" w:space="0" w:color="D9D2C8"/>
-              <w:bottom w:val="single" w:sz="8" w:space="0" w:color="D9D2C8"/>
-              <w:right w:val="single" w:sz="8" w:space="0" w:color="D9D2C8"/>
-            </w:tcBorders>
-            <w:tcMar>
-              <w:top w:w="70" w:type="dxa"/>
-              <w:start w:w="110" w:type="dxa"/>
-              <w:bottom w:w="70" w:type="dxa"/>
-              <w:end w:w="110" w:type="dxa"/>
-            </w:tcMar>
           </w:tcPr>
           <w:p>
             <w:pPr>
-              <w:spacing w:after="0" w:line="252" w:lineRule="auto"/>
-              <w:jc w:val="left"/>
+              <w:spacing w:after="0"/>
             </w:pPr>
             <w:r>
               <w:rPr>
-                <w:rFonts w:ascii="Aptos" w:hAnsi="Aptos" w:eastAsia="Aptos"/>
-                <w:b w:val="0"/>
-                <w:color w:val="222222"/>
+                <w:rFonts w:ascii="Arial" w:hAnsi="Arial"/>
                 <w:sz w:val="16"/>
               </w:rPr>
               <w:t>Daytime kampung room tone during investigation.</w:t>
@@ -701,32 +294,16 @@
       <w:tr>
         <w:tc>
           <w:tcPr>
-            <w:tcW w:type="dxa" w:w="1512"/>
+            <w:tcW w:type="dxa" w:w="864"/>
             <w:vAlign w:val="center"/>
-            <w:shd w:fill="FCFAF7"/>
-            <w:tcBorders>
-              <w:top w:val="single" w:sz="8" w:space="0" w:color="D9D2C8"/>
-              <w:left w:val="single" w:sz="8" w:space="0" w:color="D9D2C8"/>
-              <w:bottom w:val="single" w:sz="8" w:space="0" w:color="D9D2C8"/>
-              <w:right w:val="single" w:sz="8" w:space="0" w:color="D9D2C8"/>
-            </w:tcBorders>
-            <w:tcMar>
-              <w:top w:w="70" w:type="dxa"/>
-              <w:start w:w="110" w:type="dxa"/>
-              <w:bottom w:w="70" w:type="dxa"/>
-              <w:end w:w="110" w:type="dxa"/>
-            </w:tcMar>
           </w:tcPr>
           <w:p>
             <w:pPr>
-              <w:spacing w:after="0" w:line="252" w:lineRule="auto"/>
-              <w:jc w:val="center"/>
+              <w:spacing w:after="0"/>
             </w:pPr>
             <w:r>
               <w:rPr>
-                <w:rFonts w:ascii="Aptos" w:hAnsi="Aptos" w:eastAsia="Aptos"/>
-                <w:b w:val="0"/>
-                <w:color w:val="222222"/>
+                <w:rFonts w:ascii="Arial" w:hAnsi="Arial"/>
                 <w:sz w:val="16"/>
               </w:rPr>
               <w:t>Ambience</w:t>
@@ -735,32 +312,16 @@
         </w:tc>
         <w:tc>
           <w:tcPr>
-            <w:tcW w:type="dxa" w:w="2951"/>
+            <w:tcW w:type="dxa" w:w="2016"/>
             <w:vAlign w:val="center"/>
-            <w:shd w:fill="FCFAF7"/>
-            <w:tcBorders>
-              <w:top w:val="single" w:sz="8" w:space="0" w:color="D9D2C8"/>
-              <w:left w:val="single" w:sz="8" w:space="0" w:color="D9D2C8"/>
-              <w:bottom w:val="single" w:sz="8" w:space="0" w:color="D9D2C8"/>
-              <w:right w:val="single" w:sz="8" w:space="0" w:color="D9D2C8"/>
-            </w:tcBorders>
-            <w:tcMar>
-              <w:top w:w="70" w:type="dxa"/>
-              <w:start w:w="110" w:type="dxa"/>
-              <w:bottom w:w="70" w:type="dxa"/>
-              <w:end w:w="110" w:type="dxa"/>
-            </w:tcMar>
           </w:tcPr>
           <w:p>
             <w:pPr>
-              <w:spacing w:after="0" w:line="252" w:lineRule="auto"/>
-              <w:jc w:val="left"/>
+              <w:spacing w:after="0"/>
             </w:pPr>
             <w:r>
               <w:rPr>
-                <w:rFonts w:ascii="Aptos" w:hAnsi="Aptos" w:eastAsia="Aptos"/>
-                <w:b w:val="0"/>
-                <w:color w:val="222222"/>
+                <w:rFonts w:ascii="Arial" w:hAnsi="Arial"/>
                 <w:sz w:val="16"/>
               </w:rPr>
               <w:t>amb_restaurant_evening.ogg</w:t>
@@ -769,32 +330,16 @@
         </w:tc>
         <w:tc>
           <w:tcPr>
-            <w:tcW w:type="dxa" w:w="4176"/>
+            <w:tcW w:type="dxa" w:w="2880"/>
             <w:vAlign w:val="center"/>
-            <w:shd w:fill="FCFAF7"/>
-            <w:tcBorders>
-              <w:top w:val="single" w:sz="8" w:space="0" w:color="D9D2C8"/>
-              <w:left w:val="single" w:sz="8" w:space="0" w:color="D9D2C8"/>
-              <w:bottom w:val="single" w:sz="8" w:space="0" w:color="D9D2C8"/>
-              <w:right w:val="single" w:sz="8" w:space="0" w:color="D9D2C8"/>
-            </w:tcBorders>
-            <w:tcMar>
-              <w:top w:w="70" w:type="dxa"/>
-              <w:start w:w="110" w:type="dxa"/>
-              <w:bottom w:w="70" w:type="dxa"/>
-              <w:end w:w="110" w:type="dxa"/>
-            </w:tcMar>
           </w:tcPr>
           <w:p>
             <w:pPr>
-              <w:spacing w:after="0" w:line="252" w:lineRule="auto"/>
-              <w:jc w:val="left"/>
+              <w:spacing w:after="0"/>
             </w:pPr>
             <w:r>
               <w:rPr>
-                <w:rFonts w:ascii="Aptos" w:hAnsi="Aptos" w:eastAsia="Aptos"/>
-                <w:b w:val="0"/>
-                <w:color w:val="222222"/>
+                <w:rFonts w:ascii="Arial" w:hAnsi="Arial"/>
                 <w:sz w:val="16"/>
               </w:rPr>
               <w:t>adv_chapter1</w:t>
@@ -803,35 +348,19 @@
         </w:tc>
         <w:tc>
           <w:tcPr>
-            <w:tcW w:type="dxa" w:w="6048"/>
+            <w:tcW w:type="dxa" w:w="8352"/>
             <w:vAlign w:val="center"/>
-            <w:shd w:fill="FCFAF7"/>
-            <w:tcBorders>
-              <w:top w:val="single" w:sz="8" w:space="0" w:color="D9D2C8"/>
-              <w:left w:val="single" w:sz="8" w:space="0" w:color="D9D2C8"/>
-              <w:bottom w:val="single" w:sz="8" w:space="0" w:color="D9D2C8"/>
-              <w:right w:val="single" w:sz="8" w:space="0" w:color="D9D2C8"/>
-            </w:tcBorders>
-            <w:tcMar>
-              <w:top w:w="70" w:type="dxa"/>
-              <w:start w:w="110" w:type="dxa"/>
-              <w:bottom w:w="70" w:type="dxa"/>
-              <w:end w:w="110" w:type="dxa"/>
-            </w:tcMar>
           </w:tcPr>
           <w:p>
             <w:pPr>
-              <w:spacing w:after="0" w:line="252" w:lineRule="auto"/>
-              <w:jc w:val="left"/>
+              <w:spacing w:after="0"/>
             </w:pPr>
             <w:r>
               <w:rPr>
-                <w:rFonts w:ascii="Aptos" w:hAnsi="Aptos" w:eastAsia="Aptos"/>
-                <w:b w:val="0"/>
-                <w:color w:val="222222"/>
+                <w:rFonts w:ascii="Arial" w:hAnsi="Arial"/>
                 <w:sz w:val="16"/>
               </w:rPr>
-              <w:t>Quiet restaurant ambience for the case briefing and phone call.</w:t>
+              <w:t>Quiet restaurant ambience for briefing and Melur call.</w:t>
             </w:r>
           </w:p>
         </w:tc>
@@ -839,32 +368,16 @@
       <w:tr>
         <w:tc>
           <w:tcPr>
-            <w:tcW w:type="dxa" w:w="1512"/>
+            <w:tcW w:type="dxa" w:w="864"/>
             <w:vAlign w:val="center"/>
-            <w:shd w:fill="F4EFE8"/>
-            <w:tcBorders>
-              <w:top w:val="single" w:sz="8" w:space="0" w:color="D9D2C8"/>
-              <w:left w:val="single" w:sz="8" w:space="0" w:color="D9D2C8"/>
-              <w:bottom w:val="single" w:sz="8" w:space="0" w:color="D9D2C8"/>
-              <w:right w:val="single" w:sz="8" w:space="0" w:color="D9D2C8"/>
-            </w:tcBorders>
-            <w:tcMar>
-              <w:top w:w="70" w:type="dxa"/>
-              <w:start w:w="110" w:type="dxa"/>
-              <w:bottom w:w="70" w:type="dxa"/>
-              <w:end w:w="110" w:type="dxa"/>
-            </w:tcMar>
           </w:tcPr>
           <w:p>
             <w:pPr>
-              <w:spacing w:after="0" w:line="252" w:lineRule="auto"/>
-              <w:jc w:val="center"/>
+              <w:spacing w:after="0"/>
             </w:pPr>
             <w:r>
               <w:rPr>
-                <w:rFonts w:ascii="Aptos" w:hAnsi="Aptos" w:eastAsia="Aptos"/>
-                <w:b w:val="0"/>
-                <w:color w:val="222222"/>
+                <w:rFonts w:ascii="Arial" w:hAnsi="Arial"/>
                 <w:sz w:val="16"/>
               </w:rPr>
               <w:t>Ambience</w:t>
@@ -873,32 +386,16 @@
         </w:tc>
         <w:tc>
           <w:tcPr>
-            <w:tcW w:type="dxa" w:w="2951"/>
+            <w:tcW w:type="dxa" w:w="2016"/>
             <w:vAlign w:val="center"/>
-            <w:shd w:fill="F4EFE8"/>
-            <w:tcBorders>
-              <w:top w:val="single" w:sz="8" w:space="0" w:color="D9D2C8"/>
-              <w:left w:val="single" w:sz="8" w:space="0" w:color="D9D2C8"/>
-              <w:bottom w:val="single" w:sz="8" w:space="0" w:color="D9D2C8"/>
-              <w:right w:val="single" w:sz="8" w:space="0" w:color="D9D2C8"/>
-            </w:tcBorders>
-            <w:tcMar>
-              <w:top w:w="70" w:type="dxa"/>
-              <w:start w:w="110" w:type="dxa"/>
-              <w:bottom w:w="70" w:type="dxa"/>
-              <w:end w:w="110" w:type="dxa"/>
-            </w:tcMar>
           </w:tcPr>
           <w:p>
             <w:pPr>
-              <w:spacing w:after="0" w:line="252" w:lineRule="auto"/>
-              <w:jc w:val="left"/>
+              <w:spacing w:after="0"/>
             </w:pPr>
             <w:r>
               <w:rPr>
-                <w:rFonts w:ascii="Aptos" w:hAnsi="Aptos" w:eastAsia="Aptos"/>
-                <w:b w:val="0"/>
-                <w:color w:val="222222"/>
+                <w:rFonts w:ascii="Arial" w:hAnsi="Arial"/>
                 <w:sz w:val="16"/>
               </w:rPr>
               <w:t>amb_family_house_int.ogg</w:t>
@@ -907,32 +404,16 @@
         </w:tc>
         <w:tc>
           <w:tcPr>
-            <w:tcW w:type="dxa" w:w="4176"/>
+            <w:tcW w:type="dxa" w:w="2880"/>
             <w:vAlign w:val="center"/>
-            <w:shd w:fill="F4EFE8"/>
-            <w:tcBorders>
-              <w:top w:val="single" w:sz="8" w:space="0" w:color="D9D2C8"/>
-              <w:left w:val="single" w:sz="8" w:space="0" w:color="D9D2C8"/>
-              <w:bottom w:val="single" w:sz="8" w:space="0" w:color="D9D2C8"/>
-              <w:right w:val="single" w:sz="8" w:space="0" w:color="D9D2C8"/>
-            </w:tcBorders>
-            <w:tcMar>
-              <w:top w:w="70" w:type="dxa"/>
-              <w:start w:w="110" w:type="dxa"/>
-              <w:bottom w:w="70" w:type="dxa"/>
-              <w:end w:w="110" w:type="dxa"/>
-            </w:tcMar>
           </w:tcPr>
           <w:p>
             <w:pPr>
-              <w:spacing w:after="0" w:line="252" w:lineRule="auto"/>
-              <w:jc w:val="left"/>
+              <w:spacing w:after="0"/>
             </w:pPr>
             <w:r>
               <w:rPr>
-                <w:rFonts w:ascii="Aptos" w:hAnsi="Aptos" w:eastAsia="Aptos"/>
-                <w:b w:val="0"/>
-                <w:color w:val="222222"/>
+                <w:rFonts w:ascii="Arial" w:hAnsi="Arial"/>
                 <w:sz w:val="16"/>
               </w:rPr>
               <w:t>adv_mak_ros_house; adv_old_family_house</w:t>
@@ -941,35 +422,19 @@
         </w:tc>
         <w:tc>
           <w:tcPr>
-            <w:tcW w:type="dxa" w:w="6048"/>
+            <w:tcW w:type="dxa" w:w="8352"/>
             <w:vAlign w:val="center"/>
-            <w:shd w:fill="F4EFE8"/>
-            <w:tcBorders>
-              <w:top w:val="single" w:sz="8" w:space="0" w:color="D9D2C8"/>
-              <w:left w:val="single" w:sz="8" w:space="0" w:color="D9D2C8"/>
-              <w:bottom w:val="single" w:sz="8" w:space="0" w:color="D9D2C8"/>
-              <w:right w:val="single" w:sz="8" w:space="0" w:color="D9D2C8"/>
-            </w:tcBorders>
-            <w:tcMar>
-              <w:top w:w="70" w:type="dxa"/>
-              <w:start w:w="110" w:type="dxa"/>
-              <w:bottom w:w="70" w:type="dxa"/>
-              <w:end w:w="110" w:type="dxa"/>
-            </w:tcMar>
           </w:tcPr>
           <w:p>
             <w:pPr>
-              <w:spacing w:after="0" w:line="252" w:lineRule="auto"/>
-              <w:jc w:val="left"/>
+              <w:spacing w:after="0"/>
             </w:pPr>
             <w:r>
               <w:rPr>
-                <w:rFonts w:ascii="Aptos" w:hAnsi="Aptos" w:eastAsia="Aptos"/>
-                <w:b w:val="0"/>
-                <w:color w:val="222222"/>
+                <w:rFonts w:ascii="Arial" w:hAnsi="Arial"/>
                 <w:sz w:val="16"/>
               </w:rPr>
-              <w:t>Old-house interior tone, subtle wood creaks, and still air.</w:t>
+              <w:t>Old-house interior tone, subtle wood creaks, still air.</w:t>
             </w:r>
           </w:p>
         </w:tc>
@@ -977,32 +442,16 @@
       <w:tr>
         <w:tc>
           <w:tcPr>
-            <w:tcW w:type="dxa" w:w="1512"/>
+            <w:tcW w:type="dxa" w:w="864"/>
             <w:vAlign w:val="center"/>
-            <w:shd w:fill="FCFAF7"/>
-            <w:tcBorders>
-              <w:top w:val="single" w:sz="8" w:space="0" w:color="D9D2C8"/>
-              <w:left w:val="single" w:sz="8" w:space="0" w:color="D9D2C8"/>
-              <w:bottom w:val="single" w:sz="8" w:space="0" w:color="D9D2C8"/>
-              <w:right w:val="single" w:sz="8" w:space="0" w:color="D9D2C8"/>
-            </w:tcBorders>
-            <w:tcMar>
-              <w:top w:w="70" w:type="dxa"/>
-              <w:start w:w="110" w:type="dxa"/>
-              <w:bottom w:w="70" w:type="dxa"/>
-              <w:end w:w="110" w:type="dxa"/>
-            </w:tcMar>
           </w:tcPr>
           <w:p>
             <w:pPr>
-              <w:spacing w:after="0" w:line="252" w:lineRule="auto"/>
-              <w:jc w:val="center"/>
+              <w:spacing w:after="0"/>
             </w:pPr>
             <w:r>
               <w:rPr>
-                <w:rFonts w:ascii="Aptos" w:hAnsi="Aptos" w:eastAsia="Aptos"/>
-                <w:b w:val="0"/>
-                <w:color w:val="222222"/>
+                <w:rFonts w:ascii="Arial" w:hAnsi="Arial"/>
                 <w:sz w:val="16"/>
               </w:rPr>
               <w:t>Ambience</w:t>
@@ -1011,32 +460,16 @@
         </w:tc>
         <w:tc>
           <w:tcPr>
-            <w:tcW w:type="dxa" w:w="2951"/>
+            <w:tcW w:type="dxa" w:w="2016"/>
             <w:vAlign w:val="center"/>
-            <w:shd w:fill="FCFAF7"/>
-            <w:tcBorders>
-              <w:top w:val="single" w:sz="8" w:space="0" w:color="D9D2C8"/>
-              <w:left w:val="single" w:sz="8" w:space="0" w:color="D9D2C8"/>
-              <w:bottom w:val="single" w:sz="8" w:space="0" w:color="D9D2C8"/>
-              <w:right w:val="single" w:sz="8" w:space="0" w:color="D9D2C8"/>
-            </w:tcBorders>
-            <w:tcMar>
-              <w:top w:w="70" w:type="dxa"/>
-              <w:start w:w="110" w:type="dxa"/>
-              <w:bottom w:w="70" w:type="dxa"/>
-              <w:end w:w="110" w:type="dxa"/>
-            </w:tcMar>
           </w:tcPr>
           <w:p>
             <w:pPr>
-              <w:spacing w:after="0" w:line="252" w:lineRule="auto"/>
-              <w:jc w:val="left"/>
+              <w:spacing w:after="0"/>
             </w:pPr>
             <w:r>
               <w:rPr>
-                <w:rFonts w:ascii="Aptos" w:hAnsi="Aptos" w:eastAsia="Aptos"/>
-                <w:b w:val="0"/>
-                <w:color w:val="222222"/>
+                <w:rFonts w:ascii="Arial" w:hAnsi="Arial"/>
                 <w:sz w:val="16"/>
               </w:rPr>
               <w:t>amb_burial_ground.ogg</w:t>
@@ -1045,32 +478,16 @@
         </w:tc>
         <w:tc>
           <w:tcPr>
-            <w:tcW w:type="dxa" w:w="4176"/>
+            <w:tcW w:type="dxa" w:w="2880"/>
             <w:vAlign w:val="center"/>
-            <w:shd w:fill="FCFAF7"/>
-            <w:tcBorders>
-              <w:top w:val="single" w:sz="8" w:space="0" w:color="D9D2C8"/>
-              <w:left w:val="single" w:sz="8" w:space="0" w:color="D9D2C8"/>
-              <w:bottom w:val="single" w:sz="8" w:space="0" w:color="D9D2C8"/>
-              <w:right w:val="single" w:sz="8" w:space="0" w:color="D9D2C8"/>
-            </w:tcBorders>
-            <w:tcMar>
-              <w:top w:w="70" w:type="dxa"/>
-              <w:start w:w="110" w:type="dxa"/>
-              <w:bottom w:w="70" w:type="dxa"/>
-              <w:end w:w="110" w:type="dxa"/>
-            </w:tcMar>
           </w:tcPr>
           <w:p>
             <w:pPr>
-              <w:spacing w:after="0" w:line="252" w:lineRule="auto"/>
-              <w:jc w:val="left"/>
+              <w:spacing w:after="0"/>
             </w:pPr>
             <w:r>
               <w:rPr>
-                <w:rFonts w:ascii="Aptos" w:hAnsi="Aptos" w:eastAsia="Aptos"/>
-                <w:b w:val="0"/>
-                <w:color w:val="222222"/>
+                <w:rFonts w:ascii="Arial" w:hAnsi="Arial"/>
                 <w:sz w:val="16"/>
               </w:rPr>
               <w:t>adv_burial_ground; adv_chapter5</w:t>
@@ -1079,35 +496,19 @@
         </w:tc>
         <w:tc>
           <w:tcPr>
-            <w:tcW w:type="dxa" w:w="6048"/>
+            <w:tcW w:type="dxa" w:w="8352"/>
             <w:vAlign w:val="center"/>
-            <w:shd w:fill="FCFAF7"/>
-            <w:tcBorders>
-              <w:top w:val="single" w:sz="8" w:space="0" w:color="D9D2C8"/>
-              <w:left w:val="single" w:sz="8" w:space="0" w:color="D9D2C8"/>
-              <w:bottom w:val="single" w:sz="8" w:space="0" w:color="D9D2C8"/>
-              <w:right w:val="single" w:sz="8" w:space="0" w:color="D9D2C8"/>
-            </w:tcBorders>
-            <w:tcMar>
-              <w:top w:w="70" w:type="dxa"/>
-              <w:start w:w="110" w:type="dxa"/>
-              <w:bottom w:w="70" w:type="dxa"/>
-              <w:end w:w="110" w:type="dxa"/>
-            </w:tcMar>
           </w:tcPr>
           <w:p>
             <w:pPr>
-              <w:spacing w:after="0" w:line="252" w:lineRule="auto"/>
-              <w:jc w:val="left"/>
+              <w:spacing w:after="0"/>
             </w:pPr>
             <w:r>
               <w:rPr>
-                <w:rFonts w:ascii="Aptos" w:hAnsi="Aptos" w:eastAsia="Aptos"/>
-                <w:b w:val="0"/>
-                <w:color w:val="222222"/>
+                <w:rFonts w:ascii="Arial" w:hAnsi="Arial"/>
                 <w:sz w:val="16"/>
               </w:rPr>
-              <w:t>Graveyard ambience for discovery and the final grave scene.</w:t>
+              <w:t>Graveyard ambience for flashlight discovery and final grave scene.</w:t>
             </w:r>
           </w:p>
         </w:tc>
@@ -1115,32 +516,16 @@
       <w:tr>
         <w:tc>
           <w:tcPr>
-            <w:tcW w:type="dxa" w:w="1512"/>
+            <w:tcW w:type="dxa" w:w="864"/>
             <w:vAlign w:val="center"/>
-            <w:shd w:fill="F4EFE8"/>
-            <w:tcBorders>
-              <w:top w:val="single" w:sz="8" w:space="0" w:color="D9D2C8"/>
-              <w:left w:val="single" w:sz="8" w:space="0" w:color="D9D2C8"/>
-              <w:bottom w:val="single" w:sz="8" w:space="0" w:color="D9D2C8"/>
-              <w:right w:val="single" w:sz="8" w:space="0" w:color="D9D2C8"/>
-            </w:tcBorders>
-            <w:tcMar>
-              <w:top w:w="70" w:type="dxa"/>
-              <w:start w:w="110" w:type="dxa"/>
-              <w:bottom w:w="70" w:type="dxa"/>
-              <w:end w:w="110" w:type="dxa"/>
-            </w:tcMar>
           </w:tcPr>
           <w:p>
             <w:pPr>
-              <w:spacing w:after="0" w:line="252" w:lineRule="auto"/>
-              <w:jc w:val="center"/>
+              <w:spacing w:after="0"/>
             </w:pPr>
             <w:r>
               <w:rPr>
-                <w:rFonts w:ascii="Aptos" w:hAnsi="Aptos" w:eastAsia="Aptos"/>
-                <w:b w:val="0"/>
-                <w:color w:val="222222"/>
+                <w:rFonts w:ascii="Arial" w:hAnsi="Arial"/>
                 <w:sz w:val="16"/>
               </w:rPr>
               <w:t>Music</w:t>
@@ -1149,32 +534,16 @@
         </w:tc>
         <w:tc>
           <w:tcPr>
-            <w:tcW w:type="dxa" w:w="2951"/>
+            <w:tcW w:type="dxa" w:w="2016"/>
             <w:vAlign w:val="center"/>
-            <w:shd w:fill="F4EFE8"/>
-            <w:tcBorders>
-              <w:top w:val="single" w:sz="8" w:space="0" w:color="D9D2C8"/>
-              <w:left w:val="single" w:sz="8" w:space="0" w:color="D9D2C8"/>
-              <w:bottom w:val="single" w:sz="8" w:space="0" w:color="D9D2C8"/>
-              <w:right w:val="single" w:sz="8" w:space="0" w:color="D9D2C8"/>
-            </w:tcBorders>
-            <w:tcMar>
-              <w:top w:w="70" w:type="dxa"/>
-              <w:start w:w="110" w:type="dxa"/>
-              <w:bottom w:w="70" w:type="dxa"/>
-              <w:end w:w="110" w:type="dxa"/>
-            </w:tcMar>
           </w:tcPr>
           <w:p>
             <w:pPr>
-              <w:spacing w:after="0" w:line="252" w:lineRule="auto"/>
-              <w:jc w:val="left"/>
+              <w:spacing w:after="0"/>
             </w:pPr>
             <w:r>
               <w:rPr>
-                <w:rFonts w:ascii="Aptos" w:hAnsi="Aptos" w:eastAsia="Aptos"/>
-                <w:b w:val="0"/>
-                <w:color w:val="222222"/>
+                <w:rFonts w:ascii="Arial" w:hAnsi="Arial"/>
                 <w:sz w:val="16"/>
               </w:rPr>
               <w:t>mus_pocong_theme.ogg</w:t>
@@ -1183,32 +552,16 @@
         </w:tc>
         <w:tc>
           <w:tcPr>
-            <w:tcW w:type="dxa" w:w="4176"/>
+            <w:tcW w:type="dxa" w:w="2880"/>
             <w:vAlign w:val="center"/>
-            <w:shd w:fill="F4EFE8"/>
-            <w:tcBorders>
-              <w:top w:val="single" w:sz="8" w:space="0" w:color="D9D2C8"/>
-              <w:left w:val="single" w:sz="8" w:space="0" w:color="D9D2C8"/>
-              <w:bottom w:val="single" w:sz="8" w:space="0" w:color="D9D2C8"/>
-              <w:right w:val="single" w:sz="8" w:space="0" w:color="D9D2C8"/>
-            </w:tcBorders>
-            <w:tcMar>
-              <w:top w:w="70" w:type="dxa"/>
-              <w:start w:w="110" w:type="dxa"/>
-              <w:bottom w:w="70" w:type="dxa"/>
-              <w:end w:w="110" w:type="dxa"/>
-            </w:tcMar>
           </w:tcPr>
           <w:p>
             <w:pPr>
-              <w:spacing w:after="0" w:line="252" w:lineRule="auto"/>
-              <w:jc w:val="left"/>
+              <w:spacing w:after="0"/>
             </w:pPr>
             <w:r>
               <w:rPr>
-                <w:rFonts w:ascii="Aptos" w:hAnsi="Aptos" w:eastAsia="Aptos"/>
-                <w:b w:val="0"/>
-                <w:color w:val="222222"/>
+                <w:rFonts w:ascii="Arial" w:hAnsi="Arial"/>
                 <w:sz w:val="16"/>
               </w:rPr>
               <w:t>adv_chapter2; adv_chapter4; adv_chapter5</w:t>
@@ -1217,32 +570,16 @@
         </w:tc>
         <w:tc>
           <w:tcPr>
-            <w:tcW w:type="dxa" w:w="6048"/>
+            <w:tcW w:type="dxa" w:w="8352"/>
             <w:vAlign w:val="center"/>
-            <w:shd w:fill="F4EFE8"/>
-            <w:tcBorders>
-              <w:top w:val="single" w:sz="8" w:space="0" w:color="D9D2C8"/>
-              <w:left w:val="single" w:sz="8" w:space="0" w:color="D9D2C8"/>
-              <w:bottom w:val="single" w:sz="8" w:space="0" w:color="D9D2C8"/>
-              <w:right w:val="single" w:sz="8" w:space="0" w:color="D9D2C8"/>
-            </w:tcBorders>
-            <w:tcMar>
-              <w:top w:w="70" w:type="dxa"/>
-              <w:start w:w="110" w:type="dxa"/>
-              <w:bottom w:w="70" w:type="dxa"/>
-              <w:end w:w="110" w:type="dxa"/>
-            </w:tcMar>
           </w:tcPr>
           <w:p>
             <w:pPr>
-              <w:spacing w:after="0" w:line="252" w:lineRule="auto"/>
-              <w:jc w:val="left"/>
+              <w:spacing w:after="0"/>
             </w:pPr>
             <w:r>
               <w:rPr>
-                <w:rFonts w:ascii="Aptos" w:hAnsi="Aptos" w:eastAsia="Aptos"/>
-                <w:b w:val="0"/>
-                <w:color w:val="222222"/>
+                <w:rFonts w:ascii="Arial" w:hAnsi="Arial"/>
                 <w:sz w:val="16"/>
               </w:rPr>
               <w:t>Main tension theme for pocong encounters and confrontation.</w:t>
@@ -1253,32 +590,16 @@
       <w:tr>
         <w:tc>
           <w:tcPr>
-            <w:tcW w:type="dxa" w:w="1512"/>
+            <w:tcW w:type="dxa" w:w="864"/>
             <w:vAlign w:val="center"/>
-            <w:shd w:fill="FCFAF7"/>
-            <w:tcBorders>
-              <w:top w:val="single" w:sz="8" w:space="0" w:color="D9D2C8"/>
-              <w:left w:val="single" w:sz="8" w:space="0" w:color="D9D2C8"/>
-              <w:bottom w:val="single" w:sz="8" w:space="0" w:color="D9D2C8"/>
-              <w:right w:val="single" w:sz="8" w:space="0" w:color="D9D2C8"/>
-            </w:tcBorders>
-            <w:tcMar>
-              <w:top w:w="70" w:type="dxa"/>
-              <w:start w:w="110" w:type="dxa"/>
-              <w:bottom w:w="70" w:type="dxa"/>
-              <w:end w:w="110" w:type="dxa"/>
-            </w:tcMar>
           </w:tcPr>
           <w:p>
             <w:pPr>
-              <w:spacing w:after="0" w:line="252" w:lineRule="auto"/>
-              <w:jc w:val="center"/>
+              <w:spacing w:after="0"/>
             </w:pPr>
             <w:r>
               <w:rPr>
-                <w:rFonts w:ascii="Aptos" w:hAnsi="Aptos" w:eastAsia="Aptos"/>
-                <w:b w:val="0"/>
-                <w:color w:val="222222"/>
+                <w:rFonts w:ascii="Arial" w:hAnsi="Arial"/>
                 <w:sz w:val="16"/>
               </w:rPr>
               <w:t>SFX</w:t>
@@ -1287,32 +608,16 @@
         </w:tc>
         <w:tc>
           <w:tcPr>
-            <w:tcW w:type="dxa" w:w="2951"/>
+            <w:tcW w:type="dxa" w:w="2016"/>
             <w:vAlign w:val="center"/>
-            <w:shd w:fill="FCFAF7"/>
-            <w:tcBorders>
-              <w:top w:val="single" w:sz="8" w:space="0" w:color="D9D2C8"/>
-              <w:left w:val="single" w:sz="8" w:space="0" w:color="D9D2C8"/>
-              <w:bottom w:val="single" w:sz="8" w:space="0" w:color="D9D2C8"/>
-              <w:right w:val="single" w:sz="8" w:space="0" w:color="D9D2C8"/>
-            </w:tcBorders>
-            <w:tcMar>
-              <w:top w:w="70" w:type="dxa"/>
-              <w:start w:w="110" w:type="dxa"/>
-              <w:bottom w:w="70" w:type="dxa"/>
-              <w:end w:w="110" w:type="dxa"/>
-            </w:tcMar>
           </w:tcPr>
           <w:p>
             <w:pPr>
-              <w:spacing w:after="0" w:line="252" w:lineRule="auto"/>
-              <w:jc w:val="left"/>
+              <w:spacing w:after="0"/>
             </w:pPr>
             <w:r>
               <w:rPr>
-                <w:rFonts w:ascii="Aptos" w:hAnsi="Aptos" w:eastAsia="Aptos"/>
-                <w:b w:val="0"/>
-                <w:color w:val="222222"/>
+                <w:rFonts w:ascii="Arial" w:hAnsi="Arial"/>
                 <w:sz w:val="16"/>
               </w:rPr>
               <w:t>sfx_pocong_hop.ogg</w:t>
@@ -1321,69 +626,37 @@
         </w:tc>
         <w:tc>
           <w:tcPr>
-            <w:tcW w:type="dxa" w:w="4176"/>
+            <w:tcW w:type="dxa" w:w="2880"/>
             <w:vAlign w:val="center"/>
-            <w:shd w:fill="FCFAF7"/>
-            <w:tcBorders>
-              <w:top w:val="single" w:sz="8" w:space="0" w:color="D9D2C8"/>
-              <w:left w:val="single" w:sz="8" w:space="0" w:color="D9D2C8"/>
-              <w:bottom w:val="single" w:sz="8" w:space="0" w:color="D9D2C8"/>
-              <w:right w:val="single" w:sz="8" w:space="0" w:color="D9D2C8"/>
-            </w:tcBorders>
-            <w:tcMar>
-              <w:top w:w="70" w:type="dxa"/>
-              <w:start w:w="110" w:type="dxa"/>
-              <w:bottom w:w="70" w:type="dxa"/>
-              <w:end w:w="110" w:type="dxa"/>
-            </w:tcMar>
           </w:tcPr>
           <w:p>
             <w:pPr>
-              <w:spacing w:after="0" w:line="252" w:lineRule="auto"/>
-              <w:jc w:val="left"/>
+              <w:spacing w:after="0"/>
             </w:pPr>
             <w:r>
               <w:rPr>
-                <w:rFonts w:ascii="Aptos" w:hAnsi="Aptos" w:eastAsia="Aptos"/>
-                <w:b w:val="0"/>
-                <w:color w:val="222222"/>
+                <w:rFonts w:ascii="Arial" w:hAnsi="Arial"/>
                 <w:sz w:val="16"/>
               </w:rPr>
-              <w:t>adv_prologue; adv_chapter2; adv_chapter4; adv_abandon_ending</w:t>
+              <w:t>adv_prologue; adv_chapter2; adv_chapter4; adv_chapter5; rhythm mini-game</w:t>
             </w:r>
           </w:p>
         </w:tc>
         <w:tc>
           <w:tcPr>
-            <w:tcW w:type="dxa" w:w="6048"/>
+            <w:tcW w:type="dxa" w:w="8352"/>
             <w:vAlign w:val="center"/>
-            <w:shd w:fill="FCFAF7"/>
-            <w:tcBorders>
-              <w:top w:val="single" w:sz="8" w:space="0" w:color="D9D2C8"/>
-              <w:left w:val="single" w:sz="8" w:space="0" w:color="D9D2C8"/>
-              <w:bottom w:val="single" w:sz="8" w:space="0" w:color="D9D2C8"/>
-              <w:right w:val="single" w:sz="8" w:space="0" w:color="D9D2C8"/>
-            </w:tcBorders>
-            <w:tcMar>
-              <w:top w:w="70" w:type="dxa"/>
-              <w:start w:w="110" w:type="dxa"/>
-              <w:bottom w:w="70" w:type="dxa"/>
-              <w:end w:w="110" w:type="dxa"/>
-            </w:tcMar>
           </w:tcPr>
           <w:p>
             <w:pPr>
-              <w:spacing w:after="0" w:line="252" w:lineRule="auto"/>
-              <w:jc w:val="left"/>
+              <w:spacing w:after="0"/>
             </w:pPr>
             <w:r>
               <w:rPr>
-                <w:rFonts w:ascii="Aptos" w:hAnsi="Aptos" w:eastAsia="Aptos"/>
-                <w:b w:val="0"/>
-                <w:color w:val="222222"/>
+                <w:rFonts w:ascii="Arial" w:hAnsi="Arial"/>
                 <w:sz w:val="16"/>
               </w:rPr>
-              <w:t>The repeated 'Duk. Duk. Duk.' movement cue.</w:t>
+              <w:t>The repeated duk movement cue. Must be clean enough to support Space timing.</w:t>
             </w:r>
           </w:p>
         </w:tc>
@@ -1391,32 +664,16 @@
       <w:tr>
         <w:tc>
           <w:tcPr>
-            <w:tcW w:type="dxa" w:w="1512"/>
+            <w:tcW w:type="dxa" w:w="864"/>
             <w:vAlign w:val="center"/>
-            <w:shd w:fill="F4EFE8"/>
-            <w:tcBorders>
-              <w:top w:val="single" w:sz="8" w:space="0" w:color="D9D2C8"/>
-              <w:left w:val="single" w:sz="8" w:space="0" w:color="D9D2C8"/>
-              <w:bottom w:val="single" w:sz="8" w:space="0" w:color="D9D2C8"/>
-              <w:right w:val="single" w:sz="8" w:space="0" w:color="D9D2C8"/>
-            </w:tcBorders>
-            <w:tcMar>
-              <w:top w:w="70" w:type="dxa"/>
-              <w:start w:w="110" w:type="dxa"/>
-              <w:bottom w:w="70" w:type="dxa"/>
-              <w:end w:w="110" w:type="dxa"/>
-            </w:tcMar>
           </w:tcPr>
           <w:p>
             <w:pPr>
-              <w:spacing w:after="0" w:line="252" w:lineRule="auto"/>
-              <w:jc w:val="center"/>
+              <w:spacing w:after="0"/>
             </w:pPr>
             <w:r>
               <w:rPr>
-                <w:rFonts w:ascii="Aptos" w:hAnsi="Aptos" w:eastAsia="Aptos"/>
-                <w:b w:val="0"/>
-                <w:color w:val="222222"/>
+                <w:rFonts w:ascii="Arial" w:hAnsi="Arial"/>
                 <w:sz w:val="16"/>
               </w:rPr>
               <w:t>SFX</w:t>
@@ -1425,32 +682,16 @@
         </w:tc>
         <w:tc>
           <w:tcPr>
-            <w:tcW w:type="dxa" w:w="2951"/>
+            <w:tcW w:type="dxa" w:w="2016"/>
             <w:vAlign w:val="center"/>
-            <w:shd w:fill="F4EFE8"/>
-            <w:tcBorders>
-              <w:top w:val="single" w:sz="8" w:space="0" w:color="D9D2C8"/>
-              <w:left w:val="single" w:sz="8" w:space="0" w:color="D9D2C8"/>
-              <w:bottom w:val="single" w:sz="8" w:space="0" w:color="D9D2C8"/>
-              <w:right w:val="single" w:sz="8" w:space="0" w:color="D9D2C8"/>
-            </w:tcBorders>
-            <w:tcMar>
-              <w:top w:w="70" w:type="dxa"/>
-              <w:start w:w="110" w:type="dxa"/>
-              <w:bottom w:w="70" w:type="dxa"/>
-              <w:end w:w="110" w:type="dxa"/>
-            </w:tcMar>
           </w:tcPr>
           <w:p>
             <w:pPr>
-              <w:spacing w:after="0" w:line="252" w:lineRule="auto"/>
-              <w:jc w:val="left"/>
+              <w:spacing w:after="0"/>
             </w:pPr>
             <w:r>
               <w:rPr>
-                <w:rFonts w:ascii="Aptos" w:hAnsi="Aptos" w:eastAsia="Aptos"/>
-                <w:b w:val="0"/>
-                <w:color w:val="222222"/>
+                <w:rFonts w:ascii="Arial" w:hAnsi="Arial"/>
                 <w:sz w:val="16"/>
               </w:rPr>
               <w:t>sfx_pocong_cry.ogg</w:t>
@@ -1459,32 +700,16 @@
         </w:tc>
         <w:tc>
           <w:tcPr>
-            <w:tcW w:type="dxa" w:w="4176"/>
+            <w:tcW w:type="dxa" w:w="2880"/>
             <w:vAlign w:val="center"/>
-            <w:shd w:fill="F4EFE8"/>
-            <w:tcBorders>
-              <w:top w:val="single" w:sz="8" w:space="0" w:color="D9D2C8"/>
-              <w:left w:val="single" w:sz="8" w:space="0" w:color="D9D2C8"/>
-              <w:bottom w:val="single" w:sz="8" w:space="0" w:color="D9D2C8"/>
-              <w:right w:val="single" w:sz="8" w:space="0" w:color="D9D2C8"/>
-            </w:tcBorders>
-            <w:tcMar>
-              <w:top w:w="70" w:type="dxa"/>
-              <w:start w:w="110" w:type="dxa"/>
-              <w:bottom w:w="70" w:type="dxa"/>
-              <w:end w:w="110" w:type="dxa"/>
-            </w:tcMar>
           </w:tcPr>
           <w:p>
             <w:pPr>
-              <w:spacing w:after="0" w:line="252" w:lineRule="auto"/>
-              <w:jc w:val="left"/>
+              <w:spacing w:after="0"/>
             </w:pPr>
             <w:r>
               <w:rPr>
-                <w:rFonts w:ascii="Aptos" w:hAnsi="Aptos" w:eastAsia="Aptos"/>
-                <w:b w:val="0"/>
-                <w:color w:val="222222"/>
+                <w:rFonts w:ascii="Arial" w:hAnsi="Arial"/>
                 <w:sz w:val="16"/>
               </w:rPr>
               <w:t>adv_prologue; adv_chapter4</w:t>
@@ -1493,35 +718,19 @@
         </w:tc>
         <w:tc>
           <w:tcPr>
-            <w:tcW w:type="dxa" w:w="6048"/>
+            <w:tcW w:type="dxa" w:w="8352"/>
             <w:vAlign w:val="center"/>
-            <w:shd w:fill="F4EFE8"/>
-            <w:tcBorders>
-              <w:top w:val="single" w:sz="8" w:space="0" w:color="D9D2C8"/>
-              <w:left w:val="single" w:sz="8" w:space="0" w:color="D9D2C8"/>
-              <w:bottom w:val="single" w:sz="8" w:space="0" w:color="D9D2C8"/>
-              <w:right w:val="single" w:sz="8" w:space="0" w:color="D9D2C8"/>
-            </w:tcBorders>
-            <w:tcMar>
-              <w:top w:w="70" w:type="dxa"/>
-              <w:start w:w="110" w:type="dxa"/>
-              <w:bottom w:w="70" w:type="dxa"/>
-              <w:end w:w="110" w:type="dxa"/>
-            </w:tcMar>
           </w:tcPr>
           <w:p>
             <w:pPr>
-              <w:spacing w:after="0" w:line="252" w:lineRule="auto"/>
-              <w:jc w:val="left"/>
+              <w:spacing w:after="0"/>
             </w:pPr>
             <w:r>
               <w:rPr>
-                <w:rFonts w:ascii="Aptos" w:hAnsi="Aptos" w:eastAsia="Aptos"/>
-                <w:b w:val="0"/>
-                <w:color w:val="222222"/>
+                <w:rFonts w:ascii="Arial" w:hAnsi="Arial"/>
                 <w:sz w:val="16"/>
               </w:rPr>
-              <w:t>Distant crying that suggests grief before threat.</w:t>
+              <w:t>Distant crying suggesting grief before threat.</w:t>
             </w:r>
           </w:p>
         </w:tc>
@@ -1529,32 +738,16 @@
       <w:tr>
         <w:tc>
           <w:tcPr>
-            <w:tcW w:type="dxa" w:w="1512"/>
+            <w:tcW w:type="dxa" w:w="864"/>
             <w:vAlign w:val="center"/>
-            <w:shd w:fill="FCFAF7"/>
-            <w:tcBorders>
-              <w:top w:val="single" w:sz="8" w:space="0" w:color="D9D2C8"/>
-              <w:left w:val="single" w:sz="8" w:space="0" w:color="D9D2C8"/>
-              <w:bottom w:val="single" w:sz="8" w:space="0" w:color="D9D2C8"/>
-              <w:right w:val="single" w:sz="8" w:space="0" w:color="D9D2C8"/>
-            </w:tcBorders>
-            <w:tcMar>
-              <w:top w:w="70" w:type="dxa"/>
-              <w:start w:w="110" w:type="dxa"/>
-              <w:bottom w:w="70" w:type="dxa"/>
-              <w:end w:w="110" w:type="dxa"/>
-            </w:tcMar>
           </w:tcPr>
           <w:p>
             <w:pPr>
-              <w:spacing w:after="0" w:line="252" w:lineRule="auto"/>
-              <w:jc w:val="center"/>
+              <w:spacing w:after="0"/>
             </w:pPr>
             <w:r>
               <w:rPr>
-                <w:rFonts w:ascii="Aptos" w:hAnsi="Aptos" w:eastAsia="Aptos"/>
-                <w:b w:val="0"/>
-                <w:color w:val="222222"/>
+                <w:rFonts w:ascii="Arial" w:hAnsi="Arial"/>
                 <w:sz w:val="16"/>
               </w:rPr>
               <w:t>SFX</w:t>
@@ -1563,32 +756,16 @@
         </w:tc>
         <w:tc>
           <w:tcPr>
-            <w:tcW w:type="dxa" w:w="2951"/>
+            <w:tcW w:type="dxa" w:w="2016"/>
             <w:vAlign w:val="center"/>
-            <w:shd w:fill="FCFAF7"/>
-            <w:tcBorders>
-              <w:top w:val="single" w:sz="8" w:space="0" w:color="D9D2C8"/>
-              <w:left w:val="single" w:sz="8" w:space="0" w:color="D9D2C8"/>
-              <w:bottom w:val="single" w:sz="8" w:space="0" w:color="D9D2C8"/>
-              <w:right w:val="single" w:sz="8" w:space="0" w:color="D9D2C8"/>
-            </w:tcBorders>
-            <w:tcMar>
-              <w:top w:w="70" w:type="dxa"/>
-              <w:start w:w="110" w:type="dxa"/>
-              <w:bottom w:w="70" w:type="dxa"/>
-              <w:end w:w="110" w:type="dxa"/>
-            </w:tcMar>
           </w:tcPr>
           <w:p>
             <w:pPr>
-              <w:spacing w:after="0" w:line="252" w:lineRule="auto"/>
-              <w:jc w:val="left"/>
+              <w:spacing w:after="0"/>
             </w:pPr>
             <w:r>
               <w:rPr>
-                <w:rFonts w:ascii="Aptos" w:hAnsi="Aptos" w:eastAsia="Aptos"/>
-                <w:b w:val="0"/>
-                <w:color w:val="222222"/>
+                <w:rFonts w:ascii="Arial" w:hAnsi="Arial"/>
                 <w:sz w:val="16"/>
               </w:rPr>
               <w:t>sfx_pocong_shriek.ogg</w:t>
@@ -1597,32 +774,16 @@
         </w:tc>
         <w:tc>
           <w:tcPr>
-            <w:tcW w:type="dxa" w:w="4176"/>
+            <w:tcW w:type="dxa" w:w="2880"/>
             <w:vAlign w:val="center"/>
-            <w:shd w:fill="FCFAF7"/>
-            <w:tcBorders>
-              <w:top w:val="single" w:sz="8" w:space="0" w:color="D9D2C8"/>
-              <w:left w:val="single" w:sz="8" w:space="0" w:color="D9D2C8"/>
-              <w:bottom w:val="single" w:sz="8" w:space="0" w:color="D9D2C8"/>
-              <w:right w:val="single" w:sz="8" w:space="0" w:color="D9D2C8"/>
-            </w:tcBorders>
-            <w:tcMar>
-              <w:top w:w="70" w:type="dxa"/>
-              <w:start w:w="110" w:type="dxa"/>
-              <w:bottom w:w="70" w:type="dxa"/>
-              <w:end w:w="110" w:type="dxa"/>
-            </w:tcMar>
           </w:tcPr>
           <w:p>
             <w:pPr>
-              <w:spacing w:after="0" w:line="252" w:lineRule="auto"/>
-              <w:jc w:val="left"/>
+              <w:spacing w:after="0"/>
             </w:pPr>
             <w:r>
               <w:rPr>
-                <w:rFonts w:ascii="Aptos" w:hAnsi="Aptos" w:eastAsia="Aptos"/>
-                <w:b w:val="0"/>
-                <w:color w:val="222222"/>
+                <w:rFonts w:ascii="Arial" w:hAnsi="Arial"/>
                 <w:sz w:val="16"/>
               </w:rPr>
               <w:t>adv_prologue; adv_chapter2; adv_chapter4</w:t>
@@ -1631,32 +792,16 @@
         </w:tc>
         <w:tc>
           <w:tcPr>
-            <w:tcW w:type="dxa" w:w="6048"/>
+            <w:tcW w:type="dxa" w:w="8352"/>
             <w:vAlign w:val="center"/>
-            <w:shd w:fill="FCFAF7"/>
-            <w:tcBorders>
-              <w:top w:val="single" w:sz="8" w:space="0" w:color="D9D2C8"/>
-              <w:left w:val="single" w:sz="8" w:space="0" w:color="D9D2C8"/>
-              <w:bottom w:val="single" w:sz="8" w:space="0" w:color="D9D2C8"/>
-              <w:right w:val="single" w:sz="8" w:space="0" w:color="D9D2C8"/>
-            </w:tcBorders>
-            <w:tcMar>
-              <w:top w:w="70" w:type="dxa"/>
-              <w:start w:w="110" w:type="dxa"/>
-              <w:bottom w:w="70" w:type="dxa"/>
-              <w:end w:w="110" w:type="dxa"/>
-            </w:tcMar>
           </w:tcPr>
           <w:p>
             <w:pPr>
-              <w:spacing w:after="0" w:line="252" w:lineRule="auto"/>
-              <w:jc w:val="left"/>
+              <w:spacing w:after="0"/>
             </w:pPr>
             <w:r>
               <w:rPr>
-                <w:rFonts w:ascii="Aptos" w:hAnsi="Aptos" w:eastAsia="Aptos"/>
-                <w:b w:val="0"/>
-                <w:color w:val="222222"/>
+                <w:rFonts w:ascii="Arial" w:hAnsi="Arial"/>
                 <w:sz w:val="16"/>
               </w:rPr>
               <w:t>Attack scream or shock accent during scare beats.</w:t>
@@ -1667,32 +812,16 @@
       <w:tr>
         <w:tc>
           <w:tcPr>
-            <w:tcW w:type="dxa" w:w="1512"/>
+            <w:tcW w:type="dxa" w:w="864"/>
             <w:vAlign w:val="center"/>
-            <w:shd w:fill="F4EFE8"/>
-            <w:tcBorders>
-              <w:top w:val="single" w:sz="8" w:space="0" w:color="D9D2C8"/>
-              <w:left w:val="single" w:sz="8" w:space="0" w:color="D9D2C8"/>
-              <w:bottom w:val="single" w:sz="8" w:space="0" w:color="D9D2C8"/>
-              <w:right w:val="single" w:sz="8" w:space="0" w:color="D9D2C8"/>
-            </w:tcBorders>
-            <w:tcMar>
-              <w:top w:w="70" w:type="dxa"/>
-              <w:start w:w="110" w:type="dxa"/>
-              <w:bottom w:w="70" w:type="dxa"/>
-              <w:end w:w="110" w:type="dxa"/>
-            </w:tcMar>
           </w:tcPr>
           <w:p>
             <w:pPr>
-              <w:spacing w:after="0" w:line="252" w:lineRule="auto"/>
-              <w:jc w:val="center"/>
+              <w:spacing w:after="0"/>
             </w:pPr>
             <w:r>
               <w:rPr>
-                <w:rFonts w:ascii="Aptos" w:hAnsi="Aptos" w:eastAsia="Aptos"/>
-                <w:b w:val="0"/>
-                <w:color w:val="222222"/>
+                <w:rFonts w:ascii="Arial" w:hAnsi="Arial"/>
                 <w:sz w:val="16"/>
               </w:rPr>
               <w:t>SFX</w:t>
@@ -1701,32 +830,16 @@
         </w:tc>
         <w:tc>
           <w:tcPr>
-            <w:tcW w:type="dxa" w:w="2951"/>
+            <w:tcW w:type="dxa" w:w="2016"/>
             <w:vAlign w:val="center"/>
-            <w:shd w:fill="F4EFE8"/>
-            <w:tcBorders>
-              <w:top w:val="single" w:sz="8" w:space="0" w:color="D9D2C8"/>
-              <w:left w:val="single" w:sz="8" w:space="0" w:color="D9D2C8"/>
-              <w:bottom w:val="single" w:sz="8" w:space="0" w:color="D9D2C8"/>
-              <w:right w:val="single" w:sz="8" w:space="0" w:color="D9D2C8"/>
-            </w:tcBorders>
-            <w:tcMar>
-              <w:top w:w="70" w:type="dxa"/>
-              <w:start w:w="110" w:type="dxa"/>
-              <w:bottom w:w="70" w:type="dxa"/>
-              <w:end w:w="110" w:type="dxa"/>
-            </w:tcMar>
           </w:tcPr>
           <w:p>
             <w:pPr>
-              <w:spacing w:after="0" w:line="252" w:lineRule="auto"/>
-              <w:jc w:val="left"/>
+              <w:spacing w:after="0"/>
             </w:pPr>
             <w:r>
               <w:rPr>
-                <w:rFonts w:ascii="Aptos" w:hAnsi="Aptos" w:eastAsia="Aptos"/>
-                <w:b w:val="0"/>
-                <w:color w:val="222222"/>
+                <w:rFonts w:ascii="Arial" w:hAnsi="Arial"/>
                 <w:sz w:val="16"/>
               </w:rPr>
               <w:t>sfx_phone_ring.ogg</w:t>
@@ -1735,32 +848,16 @@
         </w:tc>
         <w:tc>
           <w:tcPr>
-            <w:tcW w:type="dxa" w:w="4176"/>
+            <w:tcW w:type="dxa" w:w="2880"/>
             <w:vAlign w:val="center"/>
-            <w:shd w:fill="F4EFE8"/>
-            <w:tcBorders>
-              <w:top w:val="single" w:sz="8" w:space="0" w:color="D9D2C8"/>
-              <w:left w:val="single" w:sz="8" w:space="0" w:color="D9D2C8"/>
-              <w:bottom w:val="single" w:sz="8" w:space="0" w:color="D9D2C8"/>
-              <w:right w:val="single" w:sz="8" w:space="0" w:color="D9D2C8"/>
-            </w:tcBorders>
-            <w:tcMar>
-              <w:top w:w="70" w:type="dxa"/>
-              <w:start w:w="110" w:type="dxa"/>
-              <w:bottom w:w="70" w:type="dxa"/>
-              <w:end w:w="110" w:type="dxa"/>
-            </w:tcMar>
           </w:tcPr>
           <w:p>
             <w:pPr>
-              <w:spacing w:after="0" w:line="252" w:lineRule="auto"/>
-              <w:jc w:val="left"/>
+              <w:spacing w:after="0"/>
             </w:pPr>
             <w:r>
               <w:rPr>
-                <w:rFonts w:ascii="Aptos" w:hAnsi="Aptos" w:eastAsia="Aptos"/>
-                <w:b w:val="0"/>
-                <w:color w:val="222222"/>
+                <w:rFonts w:ascii="Arial" w:hAnsi="Arial"/>
                 <w:sz w:val="16"/>
               </w:rPr>
               <w:t>adv_chapter1</w:t>
@@ -1769,35 +866,19 @@
         </w:tc>
         <w:tc>
           <w:tcPr>
-            <w:tcW w:type="dxa" w:w="6048"/>
+            <w:tcW w:type="dxa" w:w="8352"/>
             <w:vAlign w:val="center"/>
-            <w:shd w:fill="F4EFE8"/>
-            <w:tcBorders>
-              <w:top w:val="single" w:sz="8" w:space="0" w:color="D9D2C8"/>
-              <w:left w:val="single" w:sz="8" w:space="0" w:color="D9D2C8"/>
-              <w:bottom w:val="single" w:sz="8" w:space="0" w:color="D9D2C8"/>
-              <w:right w:val="single" w:sz="8" w:space="0" w:color="D9D2C8"/>
-            </w:tcBorders>
-            <w:tcMar>
-              <w:top w:w="70" w:type="dxa"/>
-              <w:start w:w="110" w:type="dxa"/>
-              <w:bottom w:w="70" w:type="dxa"/>
-              <w:end w:w="110" w:type="dxa"/>
-            </w:tcMar>
           </w:tcPr>
           <w:p>
             <w:pPr>
-              <w:spacing w:after="0" w:line="252" w:lineRule="auto"/>
-              <w:jc w:val="left"/>
+              <w:spacing w:after="0"/>
             </w:pPr>
             <w:r>
               <w:rPr>
-                <w:rFonts w:ascii="Aptos" w:hAnsi="Aptos" w:eastAsia="Aptos"/>
-                <w:b w:val="0"/>
-                <w:color w:val="222222"/>
+                <w:rFonts w:ascii="Arial" w:hAnsi="Arial"/>
                 <w:sz w:val="16"/>
               </w:rPr>
-              <w:t>Melur's call interrupting the restaurant conversation.</w:t>
+              <w:t>Melur call interrupting restaurant conversation.</w:t>
             </w:r>
           </w:p>
         </w:tc>
@@ -1805,32 +886,16 @@
       <w:tr>
         <w:tc>
           <w:tcPr>
-            <w:tcW w:type="dxa" w:w="1512"/>
+            <w:tcW w:type="dxa" w:w="864"/>
             <w:vAlign w:val="center"/>
-            <w:shd w:fill="FCFAF7"/>
-            <w:tcBorders>
-              <w:top w:val="single" w:sz="8" w:space="0" w:color="D9D2C8"/>
-              <w:left w:val="single" w:sz="8" w:space="0" w:color="D9D2C8"/>
-              <w:bottom w:val="single" w:sz="8" w:space="0" w:color="D9D2C8"/>
-              <w:right w:val="single" w:sz="8" w:space="0" w:color="D9D2C8"/>
-            </w:tcBorders>
-            <w:tcMar>
-              <w:top w:w="70" w:type="dxa"/>
-              <w:start w:w="110" w:type="dxa"/>
-              <w:bottom w:w="70" w:type="dxa"/>
-              <w:end w:w="110" w:type="dxa"/>
-            </w:tcMar>
           </w:tcPr>
           <w:p>
             <w:pPr>
-              <w:spacing w:after="0" w:line="252" w:lineRule="auto"/>
-              <w:jc w:val="center"/>
+              <w:spacing w:after="0"/>
             </w:pPr>
             <w:r>
               <w:rPr>
-                <w:rFonts w:ascii="Aptos" w:hAnsi="Aptos" w:eastAsia="Aptos"/>
-                <w:b w:val="0"/>
-                <w:color w:val="222222"/>
+                <w:rFonts w:ascii="Arial" w:hAnsi="Arial"/>
                 <w:sz w:val="16"/>
               </w:rPr>
               <w:t>SFX</w:t>
@@ -1839,32 +904,16 @@
         </w:tc>
         <w:tc>
           <w:tcPr>
-            <w:tcW w:type="dxa" w:w="2951"/>
+            <w:tcW w:type="dxa" w:w="2016"/>
             <w:vAlign w:val="center"/>
-            <w:shd w:fill="FCFAF7"/>
-            <w:tcBorders>
-              <w:top w:val="single" w:sz="8" w:space="0" w:color="D9D2C8"/>
-              <w:left w:val="single" w:sz="8" w:space="0" w:color="D9D2C8"/>
-              <w:bottom w:val="single" w:sz="8" w:space="0" w:color="D9D2C8"/>
-              <w:right w:val="single" w:sz="8" w:space="0" w:color="D9D2C8"/>
-            </w:tcBorders>
-            <w:tcMar>
-              <w:top w:w="70" w:type="dxa"/>
-              <w:start w:w="110" w:type="dxa"/>
-              <w:bottom w:w="70" w:type="dxa"/>
-              <w:end w:w="110" w:type="dxa"/>
-            </w:tcMar>
           </w:tcPr>
           <w:p>
             <w:pPr>
-              <w:spacing w:after="0" w:line="252" w:lineRule="auto"/>
-              <w:jc w:val="left"/>
+              <w:spacing w:after="0"/>
             </w:pPr>
             <w:r>
               <w:rPr>
-                <w:rFonts w:ascii="Aptos" w:hAnsi="Aptos" w:eastAsia="Aptos"/>
-                <w:b w:val="0"/>
-                <w:color w:val="222222"/>
+                <w:rFonts w:ascii="Arial" w:hAnsi="Arial"/>
                 <w:sz w:val="16"/>
               </w:rPr>
               <w:t>sfx_villager_scream.ogg</w:t>
@@ -1873,32 +922,16 @@
         </w:tc>
         <w:tc>
           <w:tcPr>
-            <w:tcW w:type="dxa" w:w="4176"/>
+            <w:tcW w:type="dxa" w:w="2880"/>
             <w:vAlign w:val="center"/>
-            <w:shd w:fill="FCFAF7"/>
-            <w:tcBorders>
-              <w:top w:val="single" w:sz="8" w:space="0" w:color="D9D2C8"/>
-              <w:left w:val="single" w:sz="8" w:space="0" w:color="D9D2C8"/>
-              <w:bottom w:val="single" w:sz="8" w:space="0" w:color="D9D2C8"/>
-              <w:right w:val="single" w:sz="8" w:space="0" w:color="D9D2C8"/>
-            </w:tcBorders>
-            <w:tcMar>
-              <w:top w:w="70" w:type="dxa"/>
-              <w:start w:w="110" w:type="dxa"/>
-              <w:bottom w:w="70" w:type="dxa"/>
-              <w:end w:w="110" w:type="dxa"/>
-            </w:tcMar>
           </w:tcPr>
           <w:p>
             <w:pPr>
-              <w:spacing w:after="0" w:line="252" w:lineRule="auto"/>
-              <w:jc w:val="left"/>
+              <w:spacing w:after="0"/>
             </w:pPr>
             <w:r>
               <w:rPr>
-                <w:rFonts w:ascii="Aptos" w:hAnsi="Aptos" w:eastAsia="Aptos"/>
-                <w:b w:val="0"/>
-                <w:color w:val="222222"/>
+                <w:rFonts w:ascii="Arial" w:hAnsi="Arial"/>
                 <w:sz w:val="16"/>
               </w:rPr>
               <w:t>adv_chapter2</w:t>
@@ -1907,35 +940,19 @@
         </w:tc>
         <w:tc>
           <w:tcPr>
-            <w:tcW w:type="dxa" w:w="6048"/>
+            <w:tcW w:type="dxa" w:w="8352"/>
             <w:vAlign w:val="center"/>
-            <w:shd w:fill="FCFAF7"/>
-            <w:tcBorders>
-              <w:top w:val="single" w:sz="8" w:space="0" w:color="D9D2C8"/>
-              <w:left w:val="single" w:sz="8" w:space="0" w:color="D9D2C8"/>
-              <w:bottom w:val="single" w:sz="8" w:space="0" w:color="D9D2C8"/>
-              <w:right w:val="single" w:sz="8" w:space="0" w:color="D9D2C8"/>
-            </w:tcBorders>
-            <w:tcMar>
-              <w:top w:w="70" w:type="dxa"/>
-              <w:start w:w="110" w:type="dxa"/>
-              <w:bottom w:w="70" w:type="dxa"/>
-              <w:end w:w="110" w:type="dxa"/>
-            </w:tcMar>
           </w:tcPr>
           <w:p>
             <w:pPr>
-              <w:spacing w:after="0" w:line="252" w:lineRule="auto"/>
-              <w:jc w:val="left"/>
+              <w:spacing w:after="0"/>
             </w:pPr>
             <w:r>
               <w:rPr>
-                <w:rFonts w:ascii="Aptos" w:hAnsi="Aptos" w:eastAsia="Aptos"/>
-                <w:b w:val="0"/>
-                <w:color w:val="222222"/>
+                <w:rFonts w:ascii="Arial" w:hAnsi="Arial"/>
                 <w:sz w:val="16"/>
               </w:rPr>
-              <w:t>Villager panic when the pocong appears at the village gate.</w:t>
+              <w:t>Villager panic when pocong appears at the village gate.</w:t>
             </w:r>
           </w:p>
         </w:tc>
@@ -1943,32 +960,16 @@
       <w:tr>
         <w:tc>
           <w:tcPr>
-            <w:tcW w:type="dxa" w:w="1512"/>
+            <w:tcW w:type="dxa" w:w="864"/>
             <w:vAlign w:val="center"/>
-            <w:shd w:fill="F4EFE8"/>
-            <w:tcBorders>
-              <w:top w:val="single" w:sz="8" w:space="0" w:color="D9D2C8"/>
-              <w:left w:val="single" w:sz="8" w:space="0" w:color="D9D2C8"/>
-              <w:bottom w:val="single" w:sz="8" w:space="0" w:color="D9D2C8"/>
-              <w:right w:val="single" w:sz="8" w:space="0" w:color="D9D2C8"/>
-            </w:tcBorders>
-            <w:tcMar>
-              <w:top w:w="70" w:type="dxa"/>
-              <w:start w:w="110" w:type="dxa"/>
-              <w:bottom w:w="70" w:type="dxa"/>
-              <w:end w:w="110" w:type="dxa"/>
-            </w:tcMar>
           </w:tcPr>
           <w:p>
             <w:pPr>
-              <w:spacing w:after="0" w:line="252" w:lineRule="auto"/>
-              <w:jc w:val="center"/>
+              <w:spacing w:after="0"/>
             </w:pPr>
             <w:r>
               <w:rPr>
-                <w:rFonts w:ascii="Aptos" w:hAnsi="Aptos" w:eastAsia="Aptos"/>
-                <w:b w:val="0"/>
-                <w:color w:val="222222"/>
+                <w:rFonts w:ascii="Arial" w:hAnsi="Arial"/>
                 <w:sz w:val="16"/>
               </w:rPr>
               <w:t>SFX</w:t>
@@ -1977,32 +978,16 @@
         </w:tc>
         <w:tc>
           <w:tcPr>
-            <w:tcW w:type="dxa" w:w="2951"/>
+            <w:tcW w:type="dxa" w:w="2016"/>
             <w:vAlign w:val="center"/>
-            <w:shd w:fill="F4EFE8"/>
-            <w:tcBorders>
-              <w:top w:val="single" w:sz="8" w:space="0" w:color="D9D2C8"/>
-              <w:left w:val="single" w:sz="8" w:space="0" w:color="D9D2C8"/>
-              <w:bottom w:val="single" w:sz="8" w:space="0" w:color="D9D2C8"/>
-              <w:right w:val="single" w:sz="8" w:space="0" w:color="D9D2C8"/>
-            </w:tcBorders>
-            <w:tcMar>
-              <w:top w:w="70" w:type="dxa"/>
-              <w:start w:w="110" w:type="dxa"/>
-              <w:bottom w:w="70" w:type="dxa"/>
-              <w:end w:w="110" w:type="dxa"/>
-            </w:tcMar>
           </w:tcPr>
           <w:p>
             <w:pPr>
-              <w:spacing w:after="0" w:line="252" w:lineRule="auto"/>
-              <w:jc w:val="left"/>
+              <w:spacing w:after="0"/>
             </w:pPr>
             <w:r>
               <w:rPr>
-                <w:rFonts w:ascii="Aptos" w:hAnsi="Aptos" w:eastAsia="Aptos"/>
-                <w:b w:val="0"/>
-                <w:color w:val="222222"/>
+                <w:rFonts w:ascii="Arial" w:hAnsi="Arial"/>
                 <w:sz w:val="16"/>
               </w:rPr>
               <w:t>sfx_distant_scream.ogg</w:t>
@@ -2011,32 +996,16 @@
         </w:tc>
         <w:tc>
           <w:tcPr>
-            <w:tcW w:type="dxa" w:w="4176"/>
+            <w:tcW w:type="dxa" w:w="2880"/>
             <w:vAlign w:val="center"/>
-            <w:shd w:fill="F4EFE8"/>
-            <w:tcBorders>
-              <w:top w:val="single" w:sz="8" w:space="0" w:color="D9D2C8"/>
-              <w:left w:val="single" w:sz="8" w:space="0" w:color="D9D2C8"/>
-              <w:bottom w:val="single" w:sz="8" w:space="0" w:color="D9D2C8"/>
-              <w:right w:val="single" w:sz="8" w:space="0" w:color="D9D2C8"/>
-            </w:tcBorders>
-            <w:tcMar>
-              <w:top w:w="70" w:type="dxa"/>
-              <w:start w:w="110" w:type="dxa"/>
-              <w:bottom w:w="70" w:type="dxa"/>
-              <w:end w:w="110" w:type="dxa"/>
-            </w:tcMar>
           </w:tcPr>
           <w:p>
             <w:pPr>
-              <w:spacing w:after="0" w:line="252" w:lineRule="auto"/>
-              <w:jc w:val="left"/>
+              <w:spacing w:after="0"/>
             </w:pPr>
             <w:r>
               <w:rPr>
-                <w:rFonts w:ascii="Aptos" w:hAnsi="Aptos" w:eastAsia="Aptos"/>
-                <w:b w:val="0"/>
-                <w:color w:val="222222"/>
+                <w:rFonts w:ascii="Arial" w:hAnsi="Arial"/>
                 <w:sz w:val="16"/>
               </w:rPr>
               <w:t>adv_chapter2</w:t>
@@ -2045,35 +1014,19 @@
         </w:tc>
         <w:tc>
           <w:tcPr>
-            <w:tcW w:type="dxa" w:w="6048"/>
+            <w:tcW w:type="dxa" w:w="8352"/>
             <w:vAlign w:val="center"/>
-            <w:shd w:fill="F4EFE8"/>
-            <w:tcBorders>
-              <w:top w:val="single" w:sz="8" w:space="0" w:color="D9D2C8"/>
-              <w:left w:val="single" w:sz="8" w:space="0" w:color="D9D2C8"/>
-              <w:bottom w:val="single" w:sz="8" w:space="0" w:color="D9D2C8"/>
-              <w:right w:val="single" w:sz="8" w:space="0" w:color="D9D2C8"/>
-            </w:tcBorders>
-            <w:tcMar>
-              <w:top w:w="70" w:type="dxa"/>
-              <w:start w:w="110" w:type="dxa"/>
-              <w:bottom w:w="70" w:type="dxa"/>
-              <w:end w:w="110" w:type="dxa"/>
-            </w:tcMar>
           </w:tcPr>
           <w:p>
             <w:pPr>
-              <w:spacing w:after="0" w:line="252" w:lineRule="auto"/>
-              <w:jc w:val="left"/>
+              <w:spacing w:after="0"/>
             </w:pPr>
             <w:r>
               <w:rPr>
-                <w:rFonts w:ascii="Aptos" w:hAnsi="Aptos" w:eastAsia="Aptos"/>
-                <w:b w:val="0"/>
-                <w:color w:val="222222"/>
+                <w:rFonts w:ascii="Arial" w:hAnsi="Arial"/>
                 <w:sz w:val="16"/>
               </w:rPr>
-              <w:t>Far scream from inside Batu Layar before the attack.</w:t>
+              <w:t>Far scream from inside Batu Layar before attack.</w:t>
             </w:r>
           </w:p>
         </w:tc>
@@ -2081,32 +1034,16 @@
       <w:tr>
         <w:tc>
           <w:tcPr>
-            <w:tcW w:type="dxa" w:w="1512"/>
+            <w:tcW w:type="dxa" w:w="864"/>
             <w:vAlign w:val="center"/>
-            <w:shd w:fill="FCFAF7"/>
-            <w:tcBorders>
-              <w:top w:val="single" w:sz="8" w:space="0" w:color="D9D2C8"/>
-              <w:left w:val="single" w:sz="8" w:space="0" w:color="D9D2C8"/>
-              <w:bottom w:val="single" w:sz="8" w:space="0" w:color="D9D2C8"/>
-              <w:right w:val="single" w:sz="8" w:space="0" w:color="D9D2C8"/>
-            </w:tcBorders>
-            <w:tcMar>
-              <w:top w:w="70" w:type="dxa"/>
-              <w:start w:w="110" w:type="dxa"/>
-              <w:bottom w:w="70" w:type="dxa"/>
-              <w:end w:w="110" w:type="dxa"/>
-            </w:tcMar>
           </w:tcPr>
           <w:p>
             <w:pPr>
-              <w:spacing w:after="0" w:line="252" w:lineRule="auto"/>
-              <w:jc w:val="center"/>
+              <w:spacing w:after="0"/>
             </w:pPr>
             <w:r>
               <w:rPr>
-                <w:rFonts w:ascii="Aptos" w:hAnsi="Aptos" w:eastAsia="Aptos"/>
-                <w:b w:val="0"/>
-                <w:color w:val="222222"/>
+                <w:rFonts w:ascii="Arial" w:hAnsi="Arial"/>
                 <w:sz w:val="16"/>
               </w:rPr>
               <w:t>SFX</w:t>
@@ -2115,32 +1052,16 @@
         </w:tc>
         <w:tc>
           <w:tcPr>
-            <w:tcW w:type="dxa" w:w="2951"/>
+            <w:tcW w:type="dxa" w:w="2016"/>
             <w:vAlign w:val="center"/>
-            <w:shd w:fill="FCFAF7"/>
-            <w:tcBorders>
-              <w:top w:val="single" w:sz="8" w:space="0" w:color="D9D2C8"/>
-              <w:left w:val="single" w:sz="8" w:space="0" w:color="D9D2C8"/>
-              <w:bottom w:val="single" w:sz="8" w:space="0" w:color="D9D2C8"/>
-              <w:right w:val="single" w:sz="8" w:space="0" w:color="D9D2C8"/>
-            </w:tcBorders>
-            <w:tcMar>
-              <w:top w:w="70" w:type="dxa"/>
-              <w:start w:w="110" w:type="dxa"/>
-              <w:bottom w:w="70" w:type="dxa"/>
-              <w:end w:w="110" w:type="dxa"/>
-            </w:tcMar>
           </w:tcPr>
           <w:p>
             <w:pPr>
-              <w:spacing w:after="0" w:line="252" w:lineRule="auto"/>
-              <w:jc w:val="left"/>
+              <w:spacing w:after="0"/>
             </w:pPr>
             <w:r>
               <w:rPr>
-                <w:rFonts w:ascii="Aptos" w:hAnsi="Aptos" w:eastAsia="Aptos"/>
-                <w:b w:val="0"/>
-                <w:color w:val="222222"/>
+                <w:rFonts w:ascii="Arial" w:hAnsi="Arial"/>
                 <w:sz w:val="16"/>
               </w:rPr>
               <w:t>sfx_body_hit.ogg</w:t>
@@ -2149,32 +1070,16 @@
         </w:tc>
         <w:tc>
           <w:tcPr>
-            <w:tcW w:type="dxa" w:w="4176"/>
+            <w:tcW w:type="dxa" w:w="2880"/>
             <w:vAlign w:val="center"/>
-            <w:shd w:fill="FCFAF7"/>
-            <w:tcBorders>
-              <w:top w:val="single" w:sz="8" w:space="0" w:color="D9D2C8"/>
-              <w:left w:val="single" w:sz="8" w:space="0" w:color="D9D2C8"/>
-              <w:bottom w:val="single" w:sz="8" w:space="0" w:color="D9D2C8"/>
-              <w:right w:val="single" w:sz="8" w:space="0" w:color="D9D2C8"/>
-            </w:tcBorders>
-            <w:tcMar>
-              <w:top w:w="70" w:type="dxa"/>
-              <w:start w:w="110" w:type="dxa"/>
-              <w:bottom w:w="70" w:type="dxa"/>
-              <w:end w:w="110" w:type="dxa"/>
-            </w:tcMar>
           </w:tcPr>
           <w:p>
             <w:pPr>
-              <w:spacing w:after="0" w:line="252" w:lineRule="auto"/>
-              <w:jc w:val="left"/>
+              <w:spacing w:after="0"/>
             </w:pPr>
             <w:r>
               <w:rPr>
-                <w:rFonts w:ascii="Aptos" w:hAnsi="Aptos" w:eastAsia="Aptos"/>
-                <w:b w:val="0"/>
-                <w:color w:val="222222"/>
+                <w:rFonts w:ascii="Arial" w:hAnsi="Arial"/>
                 <w:sz w:val="16"/>
               </w:rPr>
               <w:t>adv_chapter2; adv_chapter4; adv_death_ending</w:t>
@@ -2183,32 +1088,16 @@
         </w:tc>
         <w:tc>
           <w:tcPr>
-            <w:tcW w:type="dxa" w:w="6048"/>
+            <w:tcW w:type="dxa" w:w="8352"/>
             <w:vAlign w:val="center"/>
-            <w:shd w:fill="FCFAF7"/>
-            <w:tcBorders>
-              <w:top w:val="single" w:sz="8" w:space="0" w:color="D9D2C8"/>
-              <w:left w:val="single" w:sz="8" w:space="0" w:color="D9D2C8"/>
-              <w:bottom w:val="single" w:sz="8" w:space="0" w:color="D9D2C8"/>
-              <w:right w:val="single" w:sz="8" w:space="0" w:color="D9D2C8"/>
-            </w:tcBorders>
-            <w:tcMar>
-              <w:top w:w="70" w:type="dxa"/>
-              <w:start w:w="110" w:type="dxa"/>
-              <w:bottom w:w="70" w:type="dxa"/>
-              <w:end w:w="110" w:type="dxa"/>
-            </w:tcMar>
           </w:tcPr>
           <w:p>
             <w:pPr>
-              <w:spacing w:after="0" w:line="252" w:lineRule="auto"/>
-              <w:jc w:val="left"/>
+              <w:spacing w:after="0"/>
             </w:pPr>
             <w:r>
               <w:rPr>
-                <w:rFonts w:ascii="Aptos" w:hAnsi="Aptos" w:eastAsia="Aptos"/>
-                <w:b w:val="0"/>
-                <w:color w:val="222222"/>
+                <w:rFonts w:ascii="Arial" w:hAnsi="Arial"/>
                 <w:sz w:val="16"/>
               </w:rPr>
               <w:t>MC being struck, knocked down, or physically overwhelmed.</w:t>
@@ -2219,32 +1108,16 @@
       <w:tr>
         <w:tc>
           <w:tcPr>
-            <w:tcW w:type="dxa" w:w="1512"/>
+            <w:tcW w:type="dxa" w:w="864"/>
             <w:vAlign w:val="center"/>
-            <w:shd w:fill="F4EFE8"/>
-            <w:tcBorders>
-              <w:top w:val="single" w:sz="8" w:space="0" w:color="D9D2C8"/>
-              <w:left w:val="single" w:sz="8" w:space="0" w:color="D9D2C8"/>
-              <w:bottom w:val="single" w:sz="8" w:space="0" w:color="D9D2C8"/>
-              <w:right w:val="single" w:sz="8" w:space="0" w:color="D9D2C8"/>
-            </w:tcBorders>
-            <w:tcMar>
-              <w:top w:w="70" w:type="dxa"/>
-              <w:start w:w="110" w:type="dxa"/>
-              <w:bottom w:w="70" w:type="dxa"/>
-              <w:end w:w="110" w:type="dxa"/>
-            </w:tcMar>
           </w:tcPr>
           <w:p>
             <w:pPr>
-              <w:spacing w:after="0" w:line="252" w:lineRule="auto"/>
-              <w:jc w:val="center"/>
+              <w:spacing w:after="0"/>
             </w:pPr>
             <w:r>
               <w:rPr>
-                <w:rFonts w:ascii="Aptos" w:hAnsi="Aptos" w:eastAsia="Aptos"/>
-                <w:b w:val="0"/>
-                <w:color w:val="222222"/>
+                <w:rFonts w:ascii="Arial" w:hAnsi="Arial"/>
                 <w:sz w:val="16"/>
               </w:rPr>
               <w:t>SFX</w:t>
@@ -2253,32 +1126,16 @@
         </w:tc>
         <w:tc>
           <w:tcPr>
-            <w:tcW w:type="dxa" w:w="2951"/>
+            <w:tcW w:type="dxa" w:w="2016"/>
             <w:vAlign w:val="center"/>
-            <w:shd w:fill="F4EFE8"/>
-            <w:tcBorders>
-              <w:top w:val="single" w:sz="8" w:space="0" w:color="D9D2C8"/>
-              <w:left w:val="single" w:sz="8" w:space="0" w:color="D9D2C8"/>
-              <w:bottom w:val="single" w:sz="8" w:space="0" w:color="D9D2C8"/>
-              <w:right w:val="single" w:sz="8" w:space="0" w:color="D9D2C8"/>
-            </w:tcBorders>
-            <w:tcMar>
-              <w:top w:w="70" w:type="dxa"/>
-              <w:start w:w="110" w:type="dxa"/>
-              <w:bottom w:w="70" w:type="dxa"/>
-              <w:end w:w="110" w:type="dxa"/>
-            </w:tcMar>
           </w:tcPr>
           <w:p>
             <w:pPr>
-              <w:spacing w:after="0" w:line="252" w:lineRule="auto"/>
-              <w:jc w:val="left"/>
+              <w:spacing w:after="0"/>
             </w:pPr>
             <w:r>
               <w:rPr>
-                <w:rFonts w:ascii="Aptos" w:hAnsi="Aptos" w:eastAsia="Aptos"/>
-                <w:b w:val="0"/>
-                <w:color w:val="222222"/>
+                <w:rFonts w:ascii="Arial" w:hAnsi="Arial"/>
                 <w:sz w:val="16"/>
               </w:rPr>
               <w:t>sfx_thread_pull.ogg</w:t>
@@ -2287,32 +1144,16 @@
         </w:tc>
         <w:tc>
           <w:tcPr>
-            <w:tcW w:type="dxa" w:w="4176"/>
+            <w:tcW w:type="dxa" w:w="2880"/>
             <w:vAlign w:val="center"/>
-            <w:shd w:fill="F4EFE8"/>
-            <w:tcBorders>
-              <w:top w:val="single" w:sz="8" w:space="0" w:color="D9D2C8"/>
-              <w:left w:val="single" w:sz="8" w:space="0" w:color="D9D2C8"/>
-              <w:bottom w:val="single" w:sz="8" w:space="0" w:color="D9D2C8"/>
-              <w:right w:val="single" w:sz="8" w:space="0" w:color="D9D2C8"/>
-            </w:tcBorders>
-            <w:tcMar>
-              <w:top w:w="70" w:type="dxa"/>
-              <w:start w:w="110" w:type="dxa"/>
-              <w:bottom w:w="70" w:type="dxa"/>
-              <w:end w:w="110" w:type="dxa"/>
-            </w:tcMar>
           </w:tcPr>
           <w:p>
             <w:pPr>
-              <w:spacing w:after="0" w:line="252" w:lineRule="auto"/>
-              <w:jc w:val="left"/>
+              <w:spacing w:after="0"/>
             </w:pPr>
             <w:r>
               <w:rPr>
-                <w:rFonts w:ascii="Aptos" w:hAnsi="Aptos" w:eastAsia="Aptos"/>
-                <w:b w:val="0"/>
-                <w:color w:val="222222"/>
+                <w:rFonts w:ascii="Arial" w:hAnsi="Arial"/>
                 <w:sz w:val="16"/>
               </w:rPr>
               <w:t>adv_burial_ground</w:t>
@@ -2321,35 +1162,19 @@
         </w:tc>
         <w:tc>
           <w:tcPr>
-            <w:tcW w:type="dxa" w:w="6048"/>
+            <w:tcW w:type="dxa" w:w="8352"/>
             <w:vAlign w:val="center"/>
-            <w:shd w:fill="F4EFE8"/>
-            <w:tcBorders>
-              <w:top w:val="single" w:sz="8" w:space="0" w:color="D9D2C8"/>
-              <w:left w:val="single" w:sz="8" w:space="0" w:color="D9D2C8"/>
-              <w:bottom w:val="single" w:sz="8" w:space="0" w:color="D9D2C8"/>
-              <w:right w:val="single" w:sz="8" w:space="0" w:color="D9D2C8"/>
-            </w:tcBorders>
-            <w:tcMar>
-              <w:top w:w="70" w:type="dxa"/>
-              <w:start w:w="110" w:type="dxa"/>
-              <w:bottom w:w="70" w:type="dxa"/>
-              <w:end w:w="110" w:type="dxa"/>
-            </w:tcMar>
           </w:tcPr>
           <w:p>
             <w:pPr>
-              <w:spacing w:after="0" w:line="252" w:lineRule="auto"/>
-              <w:jc w:val="left"/>
+              <w:spacing w:after="0"/>
             </w:pPr>
             <w:r>
               <w:rPr>
-                <w:rFonts w:ascii="Aptos" w:hAnsi="Aptos" w:eastAsia="Aptos"/>
-                <w:b w:val="0"/>
-                <w:color w:val="222222"/>
+                <w:rFonts w:ascii="Arial" w:hAnsi="Arial"/>
                 <w:sz w:val="16"/>
               </w:rPr>
-              <w:t>Pulling the kafan thread from the grave soil.</w:t>
+              <w:t>Pulling kafan thread from grave soil.</w:t>
             </w:r>
           </w:p>
         </w:tc>
@@ -2357,32 +1182,16 @@
       <w:tr>
         <w:tc>
           <w:tcPr>
-            <w:tcW w:type="dxa" w:w="1512"/>
+            <w:tcW w:type="dxa" w:w="864"/>
             <w:vAlign w:val="center"/>
-            <w:shd w:fill="FCFAF7"/>
-            <w:tcBorders>
-              <w:top w:val="single" w:sz="8" w:space="0" w:color="D9D2C8"/>
-              <w:left w:val="single" w:sz="8" w:space="0" w:color="D9D2C8"/>
-              <w:bottom w:val="single" w:sz="8" w:space="0" w:color="D9D2C8"/>
-              <w:right w:val="single" w:sz="8" w:space="0" w:color="D9D2C8"/>
-            </w:tcBorders>
-            <w:tcMar>
-              <w:top w:w="70" w:type="dxa"/>
-              <w:start w:w="110" w:type="dxa"/>
-              <w:bottom w:w="70" w:type="dxa"/>
-              <w:end w:w="110" w:type="dxa"/>
-            </w:tcMar>
           </w:tcPr>
           <w:p>
             <w:pPr>
-              <w:spacing w:after="0" w:line="252" w:lineRule="auto"/>
-              <w:jc w:val="center"/>
+              <w:spacing w:after="0"/>
             </w:pPr>
             <w:r>
               <w:rPr>
-                <w:rFonts w:ascii="Aptos" w:hAnsi="Aptos" w:eastAsia="Aptos"/>
-                <w:b w:val="0"/>
-                <w:color w:val="222222"/>
+                <w:rFonts w:ascii="Arial" w:hAnsi="Arial"/>
                 <w:sz w:val="16"/>
               </w:rPr>
               <w:t>SFX</w:t>
@@ -2391,32 +1200,16 @@
         </w:tc>
         <w:tc>
           <w:tcPr>
-            <w:tcW w:type="dxa" w:w="2951"/>
+            <w:tcW w:type="dxa" w:w="2016"/>
             <w:vAlign w:val="center"/>
-            <w:shd w:fill="FCFAF7"/>
-            <w:tcBorders>
-              <w:top w:val="single" w:sz="8" w:space="0" w:color="D9D2C8"/>
-              <w:left w:val="single" w:sz="8" w:space="0" w:color="D9D2C8"/>
-              <w:bottom w:val="single" w:sz="8" w:space="0" w:color="D9D2C8"/>
-              <w:right w:val="single" w:sz="8" w:space="0" w:color="D9D2C8"/>
-            </w:tcBorders>
-            <w:tcMar>
-              <w:top w:w="70" w:type="dxa"/>
-              <w:start w:w="110" w:type="dxa"/>
-              <w:bottom w:w="70" w:type="dxa"/>
-              <w:end w:w="110" w:type="dxa"/>
-            </w:tcMar>
           </w:tcPr>
           <w:p>
             <w:pPr>
-              <w:spacing w:after="0" w:line="252" w:lineRule="auto"/>
-              <w:jc w:val="left"/>
+              <w:spacing w:after="0"/>
             </w:pPr>
             <w:r>
               <w:rPr>
-                <w:rFonts w:ascii="Aptos" w:hAnsi="Aptos" w:eastAsia="Aptos"/>
-                <w:b w:val="0"/>
-                <w:color w:val="222222"/>
+                <w:rFonts w:ascii="Arial" w:hAnsi="Arial"/>
                 <w:sz w:val="16"/>
               </w:rPr>
               <w:t>sfx_paper_unfold.ogg</w:t>
@@ -2425,32 +1218,16 @@
         </w:tc>
         <w:tc>
           <w:tcPr>
-            <w:tcW w:type="dxa" w:w="4176"/>
+            <w:tcW w:type="dxa" w:w="2880"/>
             <w:vAlign w:val="center"/>
-            <w:shd w:fill="FCFAF7"/>
-            <w:tcBorders>
-              <w:top w:val="single" w:sz="8" w:space="0" w:color="D9D2C8"/>
-              <w:left w:val="single" w:sz="8" w:space="0" w:color="D9D2C8"/>
-              <w:bottom w:val="single" w:sz="8" w:space="0" w:color="D9D2C8"/>
-              <w:right w:val="single" w:sz="8" w:space="0" w:color="D9D2C8"/>
-            </w:tcBorders>
-            <w:tcMar>
-              <w:top w:w="70" w:type="dxa"/>
-              <w:start w:w="110" w:type="dxa"/>
-              <w:bottom w:w="70" w:type="dxa"/>
-              <w:end w:w="110" w:type="dxa"/>
-            </w:tcMar>
           </w:tcPr>
           <w:p>
             <w:pPr>
-              <w:spacing w:after="0" w:line="252" w:lineRule="auto"/>
-              <w:jc w:val="left"/>
+              <w:spacing w:after="0"/>
             </w:pPr>
             <w:r>
               <w:rPr>
-                <w:rFonts w:ascii="Aptos" w:hAnsi="Aptos" w:eastAsia="Aptos"/>
-                <w:b w:val="0"/>
-                <w:color w:val="222222"/>
+                <w:rFonts w:ascii="Arial" w:hAnsi="Arial"/>
                 <w:sz w:val="16"/>
               </w:rPr>
               <w:t>adv_old_family_house</w:t>
@@ -2459,35 +1236,19 @@
         </w:tc>
         <w:tc>
           <w:tcPr>
-            <w:tcW w:type="dxa" w:w="6048"/>
+            <w:tcW w:type="dxa" w:w="8352"/>
             <w:vAlign w:val="center"/>
-            <w:shd w:fill="FCFAF7"/>
-            <w:tcBorders>
-              <w:top w:val="single" w:sz="8" w:space="0" w:color="D9D2C8"/>
-              <w:left w:val="single" w:sz="8" w:space="0" w:color="D9D2C8"/>
-              <w:bottom w:val="single" w:sz="8" w:space="0" w:color="D9D2C8"/>
-              <w:right w:val="single" w:sz="8" w:space="0" w:color="D9D2C8"/>
-            </w:tcBorders>
-            <w:tcMar>
-              <w:top w:w="70" w:type="dxa"/>
-              <w:start w:w="110" w:type="dxa"/>
-              <w:bottom w:w="70" w:type="dxa"/>
-              <w:end w:w="110" w:type="dxa"/>
-            </w:tcMar>
           </w:tcPr>
           <w:p>
             <w:pPr>
-              <w:spacing w:after="0" w:line="252" w:lineRule="auto"/>
-              <w:jc w:val="left"/>
+              <w:spacing w:after="0"/>
             </w:pPr>
             <w:r>
               <w:rPr>
-                <w:rFonts w:ascii="Aptos" w:hAnsi="Aptos" w:eastAsia="Aptos"/>
-                <w:b w:val="0"/>
-                <w:color w:val="222222"/>
+                <w:rFonts w:ascii="Arial" w:hAnsi="Arial"/>
                 <w:sz w:val="16"/>
               </w:rPr>
-              <w:t>Opening the old letter during the family-house clue scene.</w:t>
+              <w:t>Opening the old letter during family-house clue scene.</w:t>
             </w:r>
           </w:p>
         </w:tc>
@@ -2495,32 +1256,16 @@
       <w:tr>
         <w:tc>
           <w:tcPr>
-            <w:tcW w:type="dxa" w:w="1512"/>
+            <w:tcW w:type="dxa" w:w="864"/>
             <w:vAlign w:val="center"/>
-            <w:shd w:fill="F4EFE8"/>
-            <w:tcBorders>
-              <w:top w:val="single" w:sz="8" w:space="0" w:color="D9D2C8"/>
-              <w:left w:val="single" w:sz="8" w:space="0" w:color="D9D2C8"/>
-              <w:bottom w:val="single" w:sz="8" w:space="0" w:color="D9D2C8"/>
-              <w:right w:val="single" w:sz="8" w:space="0" w:color="D9D2C8"/>
-            </w:tcBorders>
-            <w:tcMar>
-              <w:top w:w="70" w:type="dxa"/>
-              <w:start w:w="110" w:type="dxa"/>
-              <w:bottom w:w="70" w:type="dxa"/>
-              <w:end w:w="110" w:type="dxa"/>
-            </w:tcMar>
           </w:tcPr>
           <w:p>
             <w:pPr>
-              <w:spacing w:after="0" w:line="252" w:lineRule="auto"/>
-              <w:jc w:val="center"/>
+              <w:spacing w:after="0"/>
             </w:pPr>
             <w:r>
               <w:rPr>
-                <w:rFonts w:ascii="Aptos" w:hAnsi="Aptos" w:eastAsia="Aptos"/>
-                <w:b w:val="0"/>
-                <w:color w:val="222222"/>
+                <w:rFonts w:ascii="Arial" w:hAnsi="Arial"/>
                 <w:sz w:val="16"/>
               </w:rPr>
               <w:t>SFX</w:t>
@@ -2529,32 +1274,16 @@
         </w:tc>
         <w:tc>
           <w:tcPr>
-            <w:tcW w:type="dxa" w:w="2951"/>
+            <w:tcW w:type="dxa" w:w="2016"/>
             <w:vAlign w:val="center"/>
-            <w:shd w:fill="F4EFE8"/>
-            <w:tcBorders>
-              <w:top w:val="single" w:sz="8" w:space="0" w:color="D9D2C8"/>
-              <w:left w:val="single" w:sz="8" w:space="0" w:color="D9D2C8"/>
-              <w:bottom w:val="single" w:sz="8" w:space="0" w:color="D9D2C8"/>
-              <w:right w:val="single" w:sz="8" w:space="0" w:color="D9D2C8"/>
-            </w:tcBorders>
-            <w:tcMar>
-              <w:top w:w="70" w:type="dxa"/>
-              <w:start w:w="110" w:type="dxa"/>
-              <w:bottom w:w="70" w:type="dxa"/>
-              <w:end w:w="110" w:type="dxa"/>
-            </w:tcMar>
           </w:tcPr>
           <w:p>
             <w:pPr>
-              <w:spacing w:after="0" w:line="252" w:lineRule="auto"/>
-              <w:jc w:val="left"/>
+              <w:spacing w:after="0"/>
             </w:pPr>
             <w:r>
               <w:rPr>
-                <w:rFonts w:ascii="Aptos" w:hAnsi="Aptos" w:eastAsia="Aptos"/>
-                <w:b w:val="0"/>
-                <w:color w:val="222222"/>
+                <w:rFonts w:ascii="Arial" w:hAnsi="Arial"/>
                 <w:sz w:val="16"/>
               </w:rPr>
               <w:t>sfx_tasbih_beads.ogg</w:t>
@@ -2563,32 +1292,16 @@
         </w:tc>
         <w:tc>
           <w:tcPr>
-            <w:tcW w:type="dxa" w:w="4176"/>
+            <w:tcW w:type="dxa" w:w="2880"/>
             <w:vAlign w:val="center"/>
-            <w:shd w:fill="F4EFE8"/>
-            <w:tcBorders>
-              <w:top w:val="single" w:sz="8" w:space="0" w:color="D9D2C8"/>
-              <w:left w:val="single" w:sz="8" w:space="0" w:color="D9D2C8"/>
-              <w:bottom w:val="single" w:sz="8" w:space="0" w:color="D9D2C8"/>
-              <w:right w:val="single" w:sz="8" w:space="0" w:color="D9D2C8"/>
-            </w:tcBorders>
-            <w:tcMar>
-              <w:top w:w="70" w:type="dxa"/>
-              <w:start w:w="110" w:type="dxa"/>
-              <w:bottom w:w="70" w:type="dxa"/>
-              <w:end w:w="110" w:type="dxa"/>
-            </w:tcMar>
           </w:tcPr>
           <w:p>
             <w:pPr>
-              <w:spacing w:after="0" w:line="252" w:lineRule="auto"/>
-              <w:jc w:val="left"/>
+              <w:spacing w:after="0"/>
             </w:pPr>
             <w:r>
               <w:rPr>
-                <w:rFonts w:ascii="Aptos" w:hAnsi="Aptos" w:eastAsia="Aptos"/>
-                <w:b w:val="0"/>
-                <w:color w:val="222222"/>
+                <w:rFonts w:ascii="Arial" w:hAnsi="Arial"/>
                 <w:sz w:val="16"/>
               </w:rPr>
               <w:t>adv_old_family_house; adv_release_ending</w:t>
@@ -2597,32 +1310,16 @@
         </w:tc>
         <w:tc>
           <w:tcPr>
-            <w:tcW w:type="dxa" w:w="6048"/>
+            <w:tcW w:type="dxa" w:w="8352"/>
             <w:vAlign w:val="center"/>
-            <w:shd w:fill="F4EFE8"/>
-            <w:tcBorders>
-              <w:top w:val="single" w:sz="8" w:space="0" w:color="D9D2C8"/>
-              <w:left w:val="single" w:sz="8" w:space="0" w:color="D9D2C8"/>
-              <w:bottom w:val="single" w:sz="8" w:space="0" w:color="D9D2C8"/>
-              <w:right w:val="single" w:sz="8" w:space="0" w:color="D9D2C8"/>
-            </w:tcBorders>
-            <w:tcMar>
-              <w:top w:w="70" w:type="dxa"/>
-              <w:start w:w="110" w:type="dxa"/>
-              <w:bottom w:w="70" w:type="dxa"/>
-              <w:end w:w="110" w:type="dxa"/>
-            </w:tcMar>
           </w:tcPr>
           <w:p>
             <w:pPr>
-              <w:spacing w:after="0" w:line="252" w:lineRule="auto"/>
-              <w:jc w:val="left"/>
+              <w:spacing w:after="0"/>
             </w:pPr>
             <w:r>
               <w:rPr>
-                <w:rFonts w:ascii="Aptos" w:hAnsi="Aptos" w:eastAsia="Aptos"/>
-                <w:b w:val="0"/>
-                <w:color w:val="222222"/>
+                <w:rFonts w:ascii="Arial" w:hAnsi="Arial"/>
                 <w:sz w:val="16"/>
               </w:rPr>
               <w:t>Handling tasbih beads before prayer or release.</w:t>
@@ -2633,32 +1330,16 @@
       <w:tr>
         <w:tc>
           <w:tcPr>
-            <w:tcW w:type="dxa" w:w="1512"/>
+            <w:tcW w:type="dxa" w:w="864"/>
             <w:vAlign w:val="center"/>
-            <w:shd w:fill="FCFAF7"/>
-            <w:tcBorders>
-              <w:top w:val="single" w:sz="8" w:space="0" w:color="D9D2C8"/>
-              <w:left w:val="single" w:sz="8" w:space="0" w:color="D9D2C8"/>
-              <w:bottom w:val="single" w:sz="8" w:space="0" w:color="D9D2C8"/>
-              <w:right w:val="single" w:sz="8" w:space="0" w:color="D9D2C8"/>
-            </w:tcBorders>
-            <w:tcMar>
-              <w:top w:w="70" w:type="dxa"/>
-              <w:start w:w="110" w:type="dxa"/>
-              <w:bottom w:w="70" w:type="dxa"/>
-              <w:end w:w="110" w:type="dxa"/>
-            </w:tcMar>
           </w:tcPr>
           <w:p>
             <w:pPr>
-              <w:spacing w:after="0" w:line="252" w:lineRule="auto"/>
-              <w:jc w:val="center"/>
+              <w:spacing w:after="0"/>
             </w:pPr>
             <w:r>
               <w:rPr>
-                <w:rFonts w:ascii="Aptos" w:hAnsi="Aptos" w:eastAsia="Aptos"/>
-                <w:b w:val="0"/>
-                <w:color w:val="222222"/>
+                <w:rFonts w:ascii="Arial" w:hAnsi="Arial"/>
                 <w:sz w:val="16"/>
               </w:rPr>
               <w:t>SFX</w:t>
@@ -2667,32 +1348,16 @@
         </w:tc>
         <w:tc>
           <w:tcPr>
-            <w:tcW w:type="dxa" w:w="2951"/>
+            <w:tcW w:type="dxa" w:w="2016"/>
             <w:vAlign w:val="center"/>
-            <w:shd w:fill="FCFAF7"/>
-            <w:tcBorders>
-              <w:top w:val="single" w:sz="8" w:space="0" w:color="D9D2C8"/>
-              <w:left w:val="single" w:sz="8" w:space="0" w:color="D9D2C8"/>
-              <w:bottom w:val="single" w:sz="8" w:space="0" w:color="D9D2C8"/>
-              <w:right w:val="single" w:sz="8" w:space="0" w:color="D9D2C8"/>
-            </w:tcBorders>
-            <w:tcMar>
-              <w:top w:w="70" w:type="dxa"/>
-              <w:start w:w="110" w:type="dxa"/>
-              <w:bottom w:w="70" w:type="dxa"/>
-              <w:end w:w="110" w:type="dxa"/>
-            </w:tcMar>
           </w:tcPr>
           <w:p>
             <w:pPr>
-              <w:spacing w:after="0" w:line="252" w:lineRule="auto"/>
-              <w:jc w:val="left"/>
+              <w:spacing w:after="0"/>
             </w:pPr>
             <w:r>
               <w:rPr>
-                <w:rFonts w:ascii="Aptos" w:hAnsi="Aptos" w:eastAsia="Aptos"/>
-                <w:b w:val="0"/>
-                <w:color w:val="222222"/>
+                <w:rFonts w:ascii="Arial" w:hAnsi="Arial"/>
                 <w:sz w:val="16"/>
               </w:rPr>
               <w:t>sfx_keris_draw.ogg</w:t>
@@ -2701,32 +1366,16 @@
         </w:tc>
         <w:tc>
           <w:tcPr>
-            <w:tcW w:type="dxa" w:w="4176"/>
+            <w:tcW w:type="dxa" w:w="2880"/>
             <w:vAlign w:val="center"/>
-            <w:shd w:fill="FCFAF7"/>
-            <w:tcBorders>
-              <w:top w:val="single" w:sz="8" w:space="0" w:color="D9D2C8"/>
-              <w:left w:val="single" w:sz="8" w:space="0" w:color="D9D2C8"/>
-              <w:bottom w:val="single" w:sz="8" w:space="0" w:color="D9D2C8"/>
-              <w:right w:val="single" w:sz="8" w:space="0" w:color="D9D2C8"/>
-            </w:tcBorders>
-            <w:tcMar>
-              <w:top w:w="70" w:type="dxa"/>
-              <w:start w:w="110" w:type="dxa"/>
-              <w:bottom w:w="70" w:type="dxa"/>
-              <w:end w:w="110" w:type="dxa"/>
-            </w:tcMar>
           </w:tcPr>
           <w:p>
             <w:pPr>
-              <w:spacing w:after="0" w:line="252" w:lineRule="auto"/>
-              <w:jc w:val="left"/>
+              <w:spacing w:after="0"/>
             </w:pPr>
             <w:r>
               <w:rPr>
-                <w:rFonts w:ascii="Aptos" w:hAnsi="Aptos" w:eastAsia="Aptos"/>
-                <w:b w:val="0"/>
-                <w:color w:val="222222"/>
+                <w:rFonts w:ascii="Arial" w:hAnsi="Arial"/>
                 <w:sz w:val="16"/>
               </w:rPr>
               <w:t>adv_chapter4; adv_chapter5</w:t>
@@ -2735,35 +1384,19 @@
         </w:tc>
         <w:tc>
           <w:tcPr>
-            <w:tcW w:type="dxa" w:w="6048"/>
+            <w:tcW w:type="dxa" w:w="8352"/>
             <w:vAlign w:val="center"/>
-            <w:shd w:fill="FCFAF7"/>
-            <w:tcBorders>
-              <w:top w:val="single" w:sz="8" w:space="0" w:color="D9D2C8"/>
-              <w:left w:val="single" w:sz="8" w:space="0" w:color="D9D2C8"/>
-              <w:bottom w:val="single" w:sz="8" w:space="0" w:color="D9D2C8"/>
-              <w:right w:val="single" w:sz="8" w:space="0" w:color="D9D2C8"/>
-            </w:tcBorders>
-            <w:tcMar>
-              <w:top w:w="70" w:type="dxa"/>
-              <w:start w:w="110" w:type="dxa"/>
-              <w:bottom w:w="70" w:type="dxa"/>
-              <w:end w:w="110" w:type="dxa"/>
-            </w:tcMar>
           </w:tcPr>
           <w:p>
             <w:pPr>
-              <w:spacing w:after="0" w:line="252" w:lineRule="auto"/>
-              <w:jc w:val="left"/>
+              <w:spacing w:after="0"/>
             </w:pPr>
             <w:r>
               <w:rPr>
-                <w:rFonts w:ascii="Aptos" w:hAnsi="Aptos" w:eastAsia="Aptos"/>
-                <w:b w:val="0"/>
-                <w:color w:val="222222"/>
+                <w:rFonts w:ascii="Arial" w:hAnsi="Arial"/>
                 <w:sz w:val="16"/>
               </w:rPr>
-              <w:t>Drawing or raising the keris for aggressive choices.</w:t>
+              <w:t>Drawing or raising keris for aggressive choices.</w:t>
             </w:r>
           </w:p>
         </w:tc>
@@ -2771,32 +1404,16 @@
       <w:tr>
         <w:tc>
           <w:tcPr>
-            <w:tcW w:type="dxa" w:w="1512"/>
+            <w:tcW w:type="dxa" w:w="864"/>
             <w:vAlign w:val="center"/>
-            <w:shd w:fill="F4EFE8"/>
-            <w:tcBorders>
-              <w:top w:val="single" w:sz="8" w:space="0" w:color="D9D2C8"/>
-              <w:left w:val="single" w:sz="8" w:space="0" w:color="D9D2C8"/>
-              <w:bottom w:val="single" w:sz="8" w:space="0" w:color="D9D2C8"/>
-              <w:right w:val="single" w:sz="8" w:space="0" w:color="D9D2C8"/>
-            </w:tcBorders>
-            <w:tcMar>
-              <w:top w:w="70" w:type="dxa"/>
-              <w:start w:w="110" w:type="dxa"/>
-              <w:bottom w:w="70" w:type="dxa"/>
-              <w:end w:w="110" w:type="dxa"/>
-            </w:tcMar>
           </w:tcPr>
           <w:p>
             <w:pPr>
-              <w:spacing w:after="0" w:line="252" w:lineRule="auto"/>
-              <w:jc w:val="center"/>
+              <w:spacing w:after="0"/>
             </w:pPr>
             <w:r>
               <w:rPr>
-                <w:rFonts w:ascii="Aptos" w:hAnsi="Aptos" w:eastAsia="Aptos"/>
-                <w:b w:val="0"/>
-                <w:color w:val="222222"/>
+                <w:rFonts w:ascii="Arial" w:hAnsi="Arial"/>
                 <w:sz w:val="16"/>
               </w:rPr>
               <w:t>SFX</w:t>
@@ -2805,32 +1422,16 @@
         </w:tc>
         <w:tc>
           <w:tcPr>
-            <w:tcW w:type="dxa" w:w="2951"/>
+            <w:tcW w:type="dxa" w:w="2016"/>
             <w:vAlign w:val="center"/>
-            <w:shd w:fill="F4EFE8"/>
-            <w:tcBorders>
-              <w:top w:val="single" w:sz="8" w:space="0" w:color="D9D2C8"/>
-              <w:left w:val="single" w:sz="8" w:space="0" w:color="D9D2C8"/>
-              <w:bottom w:val="single" w:sz="8" w:space="0" w:color="D9D2C8"/>
-              <w:right w:val="single" w:sz="8" w:space="0" w:color="D9D2C8"/>
-            </w:tcBorders>
-            <w:tcMar>
-              <w:top w:w="70" w:type="dxa"/>
-              <w:start w:w="110" w:type="dxa"/>
-              <w:bottom w:w="70" w:type="dxa"/>
-              <w:end w:w="110" w:type="dxa"/>
-            </w:tcMar>
           </w:tcPr>
           <w:p>
             <w:pPr>
-              <w:spacing w:after="0" w:line="252" w:lineRule="auto"/>
-              <w:jc w:val="left"/>
+              <w:spacing w:after="0"/>
             </w:pPr>
             <w:r>
               <w:rPr>
-                <w:rFonts w:ascii="Aptos" w:hAnsi="Aptos" w:eastAsia="Aptos"/>
-                <w:b w:val="0"/>
-                <w:color w:val="222222"/>
+                <w:rFonts w:ascii="Arial" w:hAnsi="Arial"/>
                 <w:sz w:val="16"/>
               </w:rPr>
               <w:t>sfx_prayer_low.ogg</w:t>
@@ -2839,32 +1440,16 @@
         </w:tc>
         <w:tc>
           <w:tcPr>
-            <w:tcW w:type="dxa" w:w="4176"/>
+            <w:tcW w:type="dxa" w:w="2880"/>
             <w:vAlign w:val="center"/>
-            <w:shd w:fill="F4EFE8"/>
-            <w:tcBorders>
-              <w:top w:val="single" w:sz="8" w:space="0" w:color="D9D2C8"/>
-              <w:left w:val="single" w:sz="8" w:space="0" w:color="D9D2C8"/>
-              <w:bottom w:val="single" w:sz="8" w:space="0" w:color="D9D2C8"/>
-              <w:right w:val="single" w:sz="8" w:space="0" w:color="D9D2C8"/>
-            </w:tcBorders>
-            <w:tcMar>
-              <w:top w:w="70" w:type="dxa"/>
-              <w:start w:w="110" w:type="dxa"/>
-              <w:bottom w:w="70" w:type="dxa"/>
-              <w:end w:w="110" w:type="dxa"/>
-            </w:tcMar>
           </w:tcPr>
           <w:p>
             <w:pPr>
-              <w:spacing w:after="0" w:line="252" w:lineRule="auto"/>
-              <w:jc w:val="left"/>
+              <w:spacing w:after="0"/>
             </w:pPr>
             <w:r>
               <w:rPr>
-                <w:rFonts w:ascii="Aptos" w:hAnsi="Aptos" w:eastAsia="Aptos"/>
-                <w:b w:val="0"/>
-                <w:color w:val="222222"/>
+                <w:rFonts w:ascii="Arial" w:hAnsi="Arial"/>
                 <w:sz w:val="16"/>
               </w:rPr>
               <w:t>adv_chapter4; adv_release_ending; adv_ignorance_ending</w:t>
@@ -2873,35 +1458,19 @@
         </w:tc>
         <w:tc>
           <w:tcPr>
-            <w:tcW w:type="dxa" w:w="6048"/>
+            <w:tcW w:type="dxa" w:w="8352"/>
             <w:vAlign w:val="center"/>
-            <w:shd w:fill="F4EFE8"/>
-            <w:tcBorders>
-              <w:top w:val="single" w:sz="8" w:space="0" w:color="D9D2C8"/>
-              <w:left w:val="single" w:sz="8" w:space="0" w:color="D9D2C8"/>
-              <w:bottom w:val="single" w:sz="8" w:space="0" w:color="D9D2C8"/>
-              <w:right w:val="single" w:sz="8" w:space="0" w:color="D9D2C8"/>
-            </w:tcBorders>
-            <w:tcMar>
-              <w:top w:w="70" w:type="dxa"/>
-              <w:start w:w="110" w:type="dxa"/>
-              <w:bottom w:w="70" w:type="dxa"/>
-              <w:end w:w="110" w:type="dxa"/>
-            </w:tcMar>
           </w:tcPr>
           <w:p>
             <w:pPr>
-              <w:spacing w:after="0" w:line="252" w:lineRule="auto"/>
-              <w:jc w:val="left"/>
+              <w:spacing w:after="0"/>
             </w:pPr>
             <w:r>
               <w:rPr>
-                <w:rFonts w:ascii="Aptos" w:hAnsi="Aptos" w:eastAsia="Aptos"/>
-                <w:b w:val="0"/>
-                <w:color w:val="222222"/>
+                <w:rFonts w:ascii="Arial" w:hAnsi="Arial"/>
                 <w:sz w:val="16"/>
               </w:rPr>
-              <w:t>Low prayer or recitation for ritual choices.</w:t>
+              <w:t>Low prayer/recitation for ritual choices.</w:t>
             </w:r>
           </w:p>
         </w:tc>
@@ -2909,32 +1478,16 @@
       <w:tr>
         <w:tc>
           <w:tcPr>
-            <w:tcW w:type="dxa" w:w="1512"/>
+            <w:tcW w:type="dxa" w:w="864"/>
             <w:vAlign w:val="center"/>
-            <w:shd w:fill="FCFAF7"/>
-            <w:tcBorders>
-              <w:top w:val="single" w:sz="8" w:space="0" w:color="D9D2C8"/>
-              <w:left w:val="single" w:sz="8" w:space="0" w:color="D9D2C8"/>
-              <w:bottom w:val="single" w:sz="8" w:space="0" w:color="D9D2C8"/>
-              <w:right w:val="single" w:sz="8" w:space="0" w:color="D9D2C8"/>
-            </w:tcBorders>
-            <w:tcMar>
-              <w:top w:w="70" w:type="dxa"/>
-              <w:start w:w="110" w:type="dxa"/>
-              <w:bottom w:w="70" w:type="dxa"/>
-              <w:end w:w="110" w:type="dxa"/>
-            </w:tcMar>
           </w:tcPr>
           <w:p>
             <w:pPr>
-              <w:spacing w:after="0" w:line="252" w:lineRule="auto"/>
-              <w:jc w:val="center"/>
+              <w:spacing w:after="0"/>
             </w:pPr>
             <w:r>
               <w:rPr>
-                <w:rFonts w:ascii="Aptos" w:hAnsi="Aptos" w:eastAsia="Aptos"/>
-                <w:b w:val="0"/>
-                <w:color w:val="222222"/>
+                <w:rFonts w:ascii="Arial" w:hAnsi="Arial"/>
                 <w:sz w:val="16"/>
               </w:rPr>
               <w:t>SFX</w:t>
@@ -2943,32 +1496,16 @@
         </w:tc>
         <w:tc>
           <w:tcPr>
-            <w:tcW w:type="dxa" w:w="2951"/>
+            <w:tcW w:type="dxa" w:w="2016"/>
             <w:vAlign w:val="center"/>
-            <w:shd w:fill="FCFAF7"/>
-            <w:tcBorders>
-              <w:top w:val="single" w:sz="8" w:space="0" w:color="D9D2C8"/>
-              <w:left w:val="single" w:sz="8" w:space="0" w:color="D9D2C8"/>
-              <w:bottom w:val="single" w:sz="8" w:space="0" w:color="D9D2C8"/>
-              <w:right w:val="single" w:sz="8" w:space="0" w:color="D9D2C8"/>
-            </w:tcBorders>
-            <w:tcMar>
-              <w:top w:w="70" w:type="dxa"/>
-              <w:start w:w="110" w:type="dxa"/>
-              <w:bottom w:w="70" w:type="dxa"/>
-              <w:end w:w="110" w:type="dxa"/>
-            </w:tcMar>
           </w:tcPr>
           <w:p>
             <w:pPr>
-              <w:spacing w:after="0" w:line="252" w:lineRule="auto"/>
-              <w:jc w:val="left"/>
+              <w:spacing w:after="0"/>
             </w:pPr>
             <w:r>
               <w:rPr>
-                <w:rFonts w:ascii="Aptos" w:hAnsi="Aptos" w:eastAsia="Aptos"/>
-                <w:b w:val="0"/>
-                <w:color w:val="222222"/>
+                <w:rFonts w:ascii="Arial" w:hAnsi="Arial"/>
                 <w:sz w:val="16"/>
               </w:rPr>
               <w:t>sfx_salt_throw.ogg</w:t>
@@ -2977,32 +1514,16 @@
         </w:tc>
         <w:tc>
           <w:tcPr>
-            <w:tcW w:type="dxa" w:w="4176"/>
+            <w:tcW w:type="dxa" w:w="2880"/>
             <w:vAlign w:val="center"/>
-            <w:shd w:fill="FCFAF7"/>
-            <w:tcBorders>
-              <w:top w:val="single" w:sz="8" w:space="0" w:color="D9D2C8"/>
-              <w:left w:val="single" w:sz="8" w:space="0" w:color="D9D2C8"/>
-              <w:bottom w:val="single" w:sz="8" w:space="0" w:color="D9D2C8"/>
-              <w:right w:val="single" w:sz="8" w:space="0" w:color="D9D2C8"/>
-            </w:tcBorders>
-            <w:tcMar>
-              <w:top w:w="70" w:type="dxa"/>
-              <w:start w:w="110" w:type="dxa"/>
-              <w:bottom w:w="70" w:type="dxa"/>
-              <w:end w:w="110" w:type="dxa"/>
-            </w:tcMar>
           </w:tcPr>
           <w:p>
             <w:pPr>
-              <w:spacing w:after="0" w:line="252" w:lineRule="auto"/>
-              <w:jc w:val="left"/>
+              <w:spacing w:after="0"/>
             </w:pPr>
             <w:r>
               <w:rPr>
-                <w:rFonts w:ascii="Aptos" w:hAnsi="Aptos" w:eastAsia="Aptos"/>
-                <w:b w:val="0"/>
-                <w:color w:val="222222"/>
+                <w:rFonts w:ascii="Arial" w:hAnsi="Arial"/>
                 <w:sz w:val="16"/>
               </w:rPr>
               <w:t>adv_chapter4</w:t>
@@ -3011,35 +1532,19 @@
         </w:tc>
         <w:tc>
           <w:tcPr>
-            <w:tcW w:type="dxa" w:w="6048"/>
+            <w:tcW w:type="dxa" w:w="8352"/>
             <w:vAlign w:val="center"/>
-            <w:shd w:fill="FCFAF7"/>
-            <w:tcBorders>
-              <w:top w:val="single" w:sz="8" w:space="0" w:color="D9D2C8"/>
-              <w:left w:val="single" w:sz="8" w:space="0" w:color="D9D2C8"/>
-              <w:bottom w:val="single" w:sz="8" w:space="0" w:color="D9D2C8"/>
-              <w:right w:val="single" w:sz="8" w:space="0" w:color="D9D2C8"/>
-            </w:tcBorders>
-            <w:tcMar>
-              <w:top w:w="70" w:type="dxa"/>
-              <w:start w:w="110" w:type="dxa"/>
-              <w:bottom w:w="70" w:type="dxa"/>
-              <w:end w:w="110" w:type="dxa"/>
-            </w:tcMar>
           </w:tcPr>
           <w:p>
             <w:pPr>
-              <w:spacing w:after="0" w:line="252" w:lineRule="auto"/>
-              <w:jc w:val="left"/>
+              <w:spacing w:after="0"/>
             </w:pPr>
             <w:r>
               <w:rPr>
-                <w:rFonts w:ascii="Aptos" w:hAnsi="Aptos" w:eastAsia="Aptos"/>
-                <w:b w:val="0"/>
-                <w:color w:val="222222"/>
+                <w:rFonts w:ascii="Arial" w:hAnsi="Arial"/>
                 <w:sz w:val="16"/>
               </w:rPr>
-              <w:t>Throwing salt during the night preparation choice.</w:t>
+              <w:t>Throwing salt during night preparation choice.</w:t>
             </w:r>
           </w:p>
         </w:tc>
@@ -3047,32 +1552,16 @@
       <w:tr>
         <w:tc>
           <w:tcPr>
-            <w:tcW w:type="dxa" w:w="1512"/>
+            <w:tcW w:type="dxa" w:w="864"/>
             <w:vAlign w:val="center"/>
-            <w:shd w:fill="F4EFE8"/>
-            <w:tcBorders>
-              <w:top w:val="single" w:sz="8" w:space="0" w:color="D9D2C8"/>
-              <w:left w:val="single" w:sz="8" w:space="0" w:color="D9D2C8"/>
-              <w:bottom w:val="single" w:sz="8" w:space="0" w:color="D9D2C8"/>
-              <w:right w:val="single" w:sz="8" w:space="0" w:color="D9D2C8"/>
-            </w:tcBorders>
-            <w:tcMar>
-              <w:top w:w="70" w:type="dxa"/>
-              <w:start w:w="110" w:type="dxa"/>
-              <w:bottom w:w="70" w:type="dxa"/>
-              <w:end w:w="110" w:type="dxa"/>
-            </w:tcMar>
           </w:tcPr>
           <w:p>
             <w:pPr>
-              <w:spacing w:after="0" w:line="252" w:lineRule="auto"/>
-              <w:jc w:val="center"/>
+              <w:spacing w:after="0"/>
             </w:pPr>
             <w:r>
               <w:rPr>
-                <w:rFonts w:ascii="Aptos" w:hAnsi="Aptos" w:eastAsia="Aptos"/>
-                <w:b w:val="0"/>
-                <w:color w:val="222222"/>
+                <w:rFonts w:ascii="Arial" w:hAnsi="Arial"/>
                 <w:sz w:val="16"/>
               </w:rPr>
               <w:t>SFX</w:t>
@@ -3081,32 +1570,16 @@
         </w:tc>
         <w:tc>
           <w:tcPr>
-            <w:tcW w:type="dxa" w:w="2951"/>
+            <w:tcW w:type="dxa" w:w="2016"/>
             <w:vAlign w:val="center"/>
-            <w:shd w:fill="F4EFE8"/>
-            <w:tcBorders>
-              <w:top w:val="single" w:sz="8" w:space="0" w:color="D9D2C8"/>
-              <w:left w:val="single" w:sz="8" w:space="0" w:color="D9D2C8"/>
-              <w:bottom w:val="single" w:sz="8" w:space="0" w:color="D9D2C8"/>
-              <w:right w:val="single" w:sz="8" w:space="0" w:color="D9D2C8"/>
-            </w:tcBorders>
-            <w:tcMar>
-              <w:top w:w="70" w:type="dxa"/>
-              <w:start w:w="110" w:type="dxa"/>
-              <w:bottom w:w="70" w:type="dxa"/>
-              <w:end w:w="110" w:type="dxa"/>
-            </w:tcMar>
           </w:tcPr>
           <w:p>
             <w:pPr>
-              <w:spacing w:after="0" w:line="252" w:lineRule="auto"/>
-              <w:jc w:val="left"/>
+              <w:spacing w:after="0"/>
             </w:pPr>
             <w:r>
               <w:rPr>
-                <w:rFonts w:ascii="Aptos" w:hAnsi="Aptos" w:eastAsia="Aptos"/>
-                <w:b w:val="0"/>
-                <w:color w:val="222222"/>
+                <w:rFonts w:ascii="Arial" w:hAnsi="Arial"/>
                 <w:sz w:val="16"/>
               </w:rPr>
               <w:t>sfx_knot_untied.ogg</w:t>
@@ -3115,32 +1588,16 @@
         </w:tc>
         <w:tc>
           <w:tcPr>
-            <w:tcW w:type="dxa" w:w="4176"/>
+            <w:tcW w:type="dxa" w:w="2880"/>
             <w:vAlign w:val="center"/>
-            <w:shd w:fill="F4EFE8"/>
-            <w:tcBorders>
-              <w:top w:val="single" w:sz="8" w:space="0" w:color="D9D2C8"/>
-              <w:left w:val="single" w:sz="8" w:space="0" w:color="D9D2C8"/>
-              <w:bottom w:val="single" w:sz="8" w:space="0" w:color="D9D2C8"/>
-              <w:right w:val="single" w:sz="8" w:space="0" w:color="D9D2C8"/>
-            </w:tcBorders>
-            <w:tcMar>
-              <w:top w:w="70" w:type="dxa"/>
-              <w:start w:w="110" w:type="dxa"/>
-              <w:bottom w:w="70" w:type="dxa"/>
-              <w:end w:w="110" w:type="dxa"/>
-            </w:tcMar>
           </w:tcPr>
           <w:p>
             <w:pPr>
-              <w:spacing w:after="0" w:line="252" w:lineRule="auto"/>
-              <w:jc w:val="left"/>
+              <w:spacing w:after="0"/>
             </w:pPr>
             <w:r>
               <w:rPr>
-                <w:rFonts w:ascii="Aptos" w:hAnsi="Aptos" w:eastAsia="Aptos"/>
-                <w:b w:val="0"/>
-                <w:color w:val="222222"/>
+                <w:rFonts w:ascii="Arial" w:hAnsi="Arial"/>
                 <w:sz w:val="16"/>
               </w:rPr>
               <w:t>adv_release_ending</w:t>
@@ -3149,32 +1606,16 @@
         </w:tc>
         <w:tc>
           <w:tcPr>
-            <w:tcW w:type="dxa" w:w="6048"/>
+            <w:tcW w:type="dxa" w:w="8352"/>
             <w:vAlign w:val="center"/>
-            <w:shd w:fill="F4EFE8"/>
-            <w:tcBorders>
-              <w:top w:val="single" w:sz="8" w:space="0" w:color="D9D2C8"/>
-              <w:left w:val="single" w:sz="8" w:space="0" w:color="D9D2C8"/>
-              <w:bottom w:val="single" w:sz="8" w:space="0" w:color="D9D2C8"/>
-              <w:right w:val="single" w:sz="8" w:space="0" w:color="D9D2C8"/>
-            </w:tcBorders>
-            <w:tcMar>
-              <w:top w:w="70" w:type="dxa"/>
-              <w:start w:w="110" w:type="dxa"/>
-              <w:bottom w:w="70" w:type="dxa"/>
-              <w:end w:w="110" w:type="dxa"/>
-            </w:tcMar>
           </w:tcPr>
           <w:p>
             <w:pPr>
-              <w:spacing w:after="0" w:line="252" w:lineRule="auto"/>
-              <w:jc w:val="left"/>
+              <w:spacing w:after="0"/>
             </w:pPr>
             <w:r>
               <w:rPr>
-                <w:rFonts w:ascii="Aptos" w:hAnsi="Aptos" w:eastAsia="Aptos"/>
-                <w:b w:val="0"/>
-                <w:color w:val="222222"/>
+                <w:rFonts w:ascii="Arial" w:hAnsi="Arial"/>
                 <w:sz w:val="16"/>
               </w:rPr>
               <w:t>Opening the final kafan knot.</w:t>
@@ -3185,32 +1626,16 @@
       <w:tr>
         <w:tc>
           <w:tcPr>
-            <w:tcW w:type="dxa" w:w="1512"/>
+            <w:tcW w:type="dxa" w:w="864"/>
             <w:vAlign w:val="center"/>
-            <w:shd w:fill="FCFAF7"/>
-            <w:tcBorders>
-              <w:top w:val="single" w:sz="8" w:space="0" w:color="D9D2C8"/>
-              <w:left w:val="single" w:sz="8" w:space="0" w:color="D9D2C8"/>
-              <w:bottom w:val="single" w:sz="8" w:space="0" w:color="D9D2C8"/>
-              <w:right w:val="single" w:sz="8" w:space="0" w:color="D9D2C8"/>
-            </w:tcBorders>
-            <w:tcMar>
-              <w:top w:w="70" w:type="dxa"/>
-              <w:start w:w="110" w:type="dxa"/>
-              <w:bottom w:w="70" w:type="dxa"/>
-              <w:end w:w="110" w:type="dxa"/>
-            </w:tcMar>
           </w:tcPr>
           <w:p>
             <w:pPr>
-              <w:spacing w:after="0" w:line="252" w:lineRule="auto"/>
-              <w:jc w:val="center"/>
+              <w:spacing w:after="0"/>
             </w:pPr>
             <w:r>
               <w:rPr>
-                <w:rFonts w:ascii="Aptos" w:hAnsi="Aptos" w:eastAsia="Aptos"/>
-                <w:b w:val="0"/>
-                <w:color w:val="222222"/>
+                <w:rFonts w:ascii="Arial" w:hAnsi="Arial"/>
                 <w:sz w:val="16"/>
               </w:rPr>
               <w:t>SFX</w:t>
@@ -3219,32 +1644,16 @@
         </w:tc>
         <w:tc>
           <w:tcPr>
-            <w:tcW w:type="dxa" w:w="2951"/>
+            <w:tcW w:type="dxa" w:w="2016"/>
             <w:vAlign w:val="center"/>
-            <w:shd w:fill="FCFAF7"/>
-            <w:tcBorders>
-              <w:top w:val="single" w:sz="8" w:space="0" w:color="D9D2C8"/>
-              <w:left w:val="single" w:sz="8" w:space="0" w:color="D9D2C8"/>
-              <w:bottom w:val="single" w:sz="8" w:space="0" w:color="D9D2C8"/>
-              <w:right w:val="single" w:sz="8" w:space="0" w:color="D9D2C8"/>
-            </w:tcBorders>
-            <w:tcMar>
-              <w:top w:w="70" w:type="dxa"/>
-              <w:start w:w="110" w:type="dxa"/>
-              <w:bottom w:w="70" w:type="dxa"/>
-              <w:end w:w="110" w:type="dxa"/>
-            </w:tcMar>
           </w:tcPr>
           <w:p>
             <w:pPr>
-              <w:spacing w:after="0" w:line="252" w:lineRule="auto"/>
-              <w:jc w:val="left"/>
+              <w:spacing w:after="0"/>
             </w:pPr>
             <w:r>
               <w:rPr>
-                <w:rFonts w:ascii="Aptos" w:hAnsi="Aptos" w:eastAsia="Aptos"/>
-                <w:b w:val="0"/>
-                <w:color w:val="222222"/>
+                <w:rFonts w:ascii="Arial" w:hAnsi="Arial"/>
                 <w:sz w:val="16"/>
               </w:rPr>
               <w:t>sfx_keris_strike.ogg</w:t>
@@ -3253,32 +1662,16 @@
         </w:tc>
         <w:tc>
           <w:tcPr>
-            <w:tcW w:type="dxa" w:w="4176"/>
+            <w:tcW w:type="dxa" w:w="2880"/>
             <w:vAlign w:val="center"/>
-            <w:shd w:fill="FCFAF7"/>
-            <w:tcBorders>
-              <w:top w:val="single" w:sz="8" w:space="0" w:color="D9D2C8"/>
-              <w:left w:val="single" w:sz="8" w:space="0" w:color="D9D2C8"/>
-              <w:bottom w:val="single" w:sz="8" w:space="0" w:color="D9D2C8"/>
-              <w:right w:val="single" w:sz="8" w:space="0" w:color="D9D2C8"/>
-            </w:tcBorders>
-            <w:tcMar>
-              <w:top w:w="70" w:type="dxa"/>
-              <w:start w:w="110" w:type="dxa"/>
-              <w:bottom w:w="70" w:type="dxa"/>
-              <w:end w:w="110" w:type="dxa"/>
-            </w:tcMar>
           </w:tcPr>
           <w:p>
             <w:pPr>
-              <w:spacing w:after="0" w:line="252" w:lineRule="auto"/>
-              <w:jc w:val="left"/>
+              <w:spacing w:after="0"/>
             </w:pPr>
             <w:r>
               <w:rPr>
-                <w:rFonts w:ascii="Aptos" w:hAnsi="Aptos" w:eastAsia="Aptos"/>
-                <w:b w:val="0"/>
-                <w:color w:val="222222"/>
+                <w:rFonts w:ascii="Arial" w:hAnsi="Arial"/>
                 <w:sz w:val="16"/>
               </w:rPr>
               <w:t>adv_ignorance_ending</w:t>
@@ -3287,35 +1680,19 @@
         </w:tc>
         <w:tc>
           <w:tcPr>
-            <w:tcW w:type="dxa" w:w="6048"/>
+            <w:tcW w:type="dxa" w:w="8352"/>
             <w:vAlign w:val="center"/>
-            <w:shd w:fill="FCFAF7"/>
-            <w:tcBorders>
-              <w:top w:val="single" w:sz="8" w:space="0" w:color="D9D2C8"/>
-              <w:left w:val="single" w:sz="8" w:space="0" w:color="D9D2C8"/>
-              <w:bottom w:val="single" w:sz="8" w:space="0" w:color="D9D2C8"/>
-              <w:right w:val="single" w:sz="8" w:space="0" w:color="D9D2C8"/>
-            </w:tcBorders>
-            <w:tcMar>
-              <w:top w:w="70" w:type="dxa"/>
-              <w:start w:w="110" w:type="dxa"/>
-              <w:bottom w:w="70" w:type="dxa"/>
-              <w:end w:w="110" w:type="dxa"/>
-            </w:tcMar>
           </w:tcPr>
           <w:p>
             <w:pPr>
-              <w:spacing w:after="0" w:line="252" w:lineRule="auto"/>
-              <w:jc w:val="left"/>
+              <w:spacing w:after="0"/>
             </w:pPr>
             <w:r>
               <w:rPr>
-                <w:rFonts w:ascii="Aptos" w:hAnsi="Aptos" w:eastAsia="Aptos"/>
-                <w:b w:val="0"/>
-                <w:color w:val="222222"/>
+                <w:rFonts w:ascii="Arial" w:hAnsi="Arial"/>
                 <w:sz w:val="16"/>
               </w:rPr>
-              <w:t>Aggressive route impact when MC forces the pocong down.</w:t>
+              <w:t>Aggressive route impact when MC forces pocong down.</w:t>
             </w:r>
           </w:p>
         </w:tc>
@@ -3323,32 +1700,16 @@
       <w:tr>
         <w:tc>
           <w:tcPr>
-            <w:tcW w:type="dxa" w:w="1512"/>
+            <w:tcW w:type="dxa" w:w="864"/>
             <w:vAlign w:val="center"/>
-            <w:shd w:fill="F4EFE8"/>
-            <w:tcBorders>
-              <w:top w:val="single" w:sz="8" w:space="0" w:color="D9D2C8"/>
-              <w:left w:val="single" w:sz="8" w:space="0" w:color="D9D2C8"/>
-              <w:bottom w:val="single" w:sz="8" w:space="0" w:color="D9D2C8"/>
-              <w:right w:val="single" w:sz="8" w:space="0" w:color="D9D2C8"/>
-            </w:tcBorders>
-            <w:tcMar>
-              <w:top w:w="70" w:type="dxa"/>
-              <w:start w:w="110" w:type="dxa"/>
-              <w:bottom w:w="70" w:type="dxa"/>
-              <w:end w:w="110" w:type="dxa"/>
-            </w:tcMar>
           </w:tcPr>
           <w:p>
             <w:pPr>
-              <w:spacing w:after="0" w:line="252" w:lineRule="auto"/>
-              <w:jc w:val="center"/>
+              <w:spacing w:after="0"/>
             </w:pPr>
             <w:r>
               <w:rPr>
-                <w:rFonts w:ascii="Aptos" w:hAnsi="Aptos" w:eastAsia="Aptos"/>
-                <w:b w:val="0"/>
-                <w:color w:val="222222"/>
+                <w:rFonts w:ascii="Arial" w:hAnsi="Arial"/>
                 <w:sz w:val="16"/>
               </w:rPr>
               <w:t>SFX</w:t>
@@ -3357,32 +1718,16 @@
         </w:tc>
         <w:tc>
           <w:tcPr>
-            <w:tcW w:type="dxa" w:w="2951"/>
+            <w:tcW w:type="dxa" w:w="2016"/>
             <w:vAlign w:val="center"/>
-            <w:shd w:fill="F4EFE8"/>
-            <w:tcBorders>
-              <w:top w:val="single" w:sz="8" w:space="0" w:color="D9D2C8"/>
-              <w:left w:val="single" w:sz="8" w:space="0" w:color="D9D2C8"/>
-              <w:bottom w:val="single" w:sz="8" w:space="0" w:color="D9D2C8"/>
-              <w:right w:val="single" w:sz="8" w:space="0" w:color="D9D2C8"/>
-            </w:tcBorders>
-            <w:tcMar>
-              <w:top w:w="70" w:type="dxa"/>
-              <w:start w:w="110" w:type="dxa"/>
-              <w:bottom w:w="70" w:type="dxa"/>
-              <w:end w:w="110" w:type="dxa"/>
-            </w:tcMar>
           </w:tcPr>
           <w:p>
             <w:pPr>
-              <w:spacing w:after="0" w:line="252" w:lineRule="auto"/>
-              <w:jc w:val="left"/>
+              <w:spacing w:after="0"/>
             </w:pPr>
             <w:r>
               <w:rPr>
-                <w:rFonts w:ascii="Aptos" w:hAnsi="Aptos" w:eastAsia="Aptos"/>
-                <w:b w:val="0"/>
-                <w:color w:val="222222"/>
+                <w:rFonts w:ascii="Arial" w:hAnsi="Arial"/>
                 <w:sz w:val="16"/>
               </w:rPr>
               <w:t>sfx_arwah_cry_pain.ogg</w:t>
@@ -3391,32 +1736,16 @@
         </w:tc>
         <w:tc>
           <w:tcPr>
-            <w:tcW w:type="dxa" w:w="4176"/>
+            <w:tcW w:type="dxa" w:w="2880"/>
             <w:vAlign w:val="center"/>
-            <w:shd w:fill="F4EFE8"/>
-            <w:tcBorders>
-              <w:top w:val="single" w:sz="8" w:space="0" w:color="D9D2C8"/>
-              <w:left w:val="single" w:sz="8" w:space="0" w:color="D9D2C8"/>
-              <w:bottom w:val="single" w:sz="8" w:space="0" w:color="D9D2C8"/>
-              <w:right w:val="single" w:sz="8" w:space="0" w:color="D9D2C8"/>
-            </w:tcBorders>
-            <w:tcMar>
-              <w:top w:w="70" w:type="dxa"/>
-              <w:start w:w="110" w:type="dxa"/>
-              <w:bottom w:w="70" w:type="dxa"/>
-              <w:end w:w="110" w:type="dxa"/>
-            </w:tcMar>
           </w:tcPr>
           <w:p>
             <w:pPr>
-              <w:spacing w:after="0" w:line="252" w:lineRule="auto"/>
-              <w:jc w:val="left"/>
+              <w:spacing w:after="0"/>
             </w:pPr>
             <w:r>
               <w:rPr>
-                <w:rFonts w:ascii="Aptos" w:hAnsi="Aptos" w:eastAsia="Aptos"/>
-                <w:b w:val="0"/>
-                <w:color w:val="222222"/>
+                <w:rFonts w:ascii="Arial" w:hAnsi="Arial"/>
                 <w:sz w:val="16"/>
               </w:rPr>
               <w:t>adv_ignorance_ending; adv_death_ending</w:t>
@@ -3425,32 +1754,16 @@
         </w:tc>
         <w:tc>
           <w:tcPr>
-            <w:tcW w:type="dxa" w:w="6048"/>
+            <w:tcW w:type="dxa" w:w="8352"/>
             <w:vAlign w:val="center"/>
-            <w:shd w:fill="F4EFE8"/>
-            <w:tcBorders>
-              <w:top w:val="single" w:sz="8" w:space="0" w:color="D9D2C8"/>
-              <w:left w:val="single" w:sz="8" w:space="0" w:color="D9D2C8"/>
-              <w:bottom w:val="single" w:sz="8" w:space="0" w:color="D9D2C8"/>
-              <w:right w:val="single" w:sz="8" w:space="0" w:color="D9D2C8"/>
-            </w:tcBorders>
-            <w:tcMar>
-              <w:top w:w="70" w:type="dxa"/>
-              <w:start w:w="110" w:type="dxa"/>
-              <w:bottom w:w="70" w:type="dxa"/>
-              <w:end w:w="110" w:type="dxa"/>
-            </w:tcMar>
           </w:tcPr>
           <w:p>
             <w:pPr>
-              <w:spacing w:after="0" w:line="252" w:lineRule="auto"/>
-              <w:jc w:val="left"/>
+              <w:spacing w:after="0"/>
             </w:pPr>
             <w:r>
               <w:rPr>
-                <w:rFonts w:ascii="Aptos" w:hAnsi="Aptos" w:eastAsia="Aptos"/>
-                <w:b w:val="0"/>
-                <w:color w:val="222222"/>
+                <w:rFonts w:ascii="Arial" w:hAnsi="Arial"/>
                 <w:sz w:val="16"/>
               </w:rPr>
               <w:t>Spirit pain cry for bad or violent outcomes.</w:t>
@@ -3461,32 +1774,16 @@
       <w:tr>
         <w:tc>
           <w:tcPr>
-            <w:tcW w:type="dxa" w:w="1512"/>
+            <w:tcW w:type="dxa" w:w="864"/>
             <w:vAlign w:val="center"/>
-            <w:shd w:fill="FCFAF7"/>
-            <w:tcBorders>
-              <w:top w:val="single" w:sz="8" w:space="0" w:color="D9D2C8"/>
-              <w:left w:val="single" w:sz="8" w:space="0" w:color="D9D2C8"/>
-              <w:bottom w:val="single" w:sz="8" w:space="0" w:color="D9D2C8"/>
-              <w:right w:val="single" w:sz="8" w:space="0" w:color="D9D2C8"/>
-            </w:tcBorders>
-            <w:tcMar>
-              <w:top w:w="70" w:type="dxa"/>
-              <w:start w:w="110" w:type="dxa"/>
-              <w:bottom w:w="70" w:type="dxa"/>
-              <w:end w:w="110" w:type="dxa"/>
-            </w:tcMar>
           </w:tcPr>
           <w:p>
             <w:pPr>
-              <w:spacing w:after="0" w:line="252" w:lineRule="auto"/>
-              <w:jc w:val="center"/>
+              <w:spacing w:after="0"/>
             </w:pPr>
             <w:r>
               <w:rPr>
-                <w:rFonts w:ascii="Aptos" w:hAnsi="Aptos" w:eastAsia="Aptos"/>
-                <w:b w:val="0"/>
-                <w:color w:val="222222"/>
+                <w:rFonts w:ascii="Arial" w:hAnsi="Arial"/>
                 <w:sz w:val="16"/>
               </w:rPr>
               <w:t>SFX</w:t>
@@ -3495,32 +1792,16 @@
         </w:tc>
         <w:tc>
           <w:tcPr>
-            <w:tcW w:type="dxa" w:w="2951"/>
+            <w:tcW w:type="dxa" w:w="2016"/>
             <w:vAlign w:val="center"/>
-            <w:shd w:fill="FCFAF7"/>
-            <w:tcBorders>
-              <w:top w:val="single" w:sz="8" w:space="0" w:color="D9D2C8"/>
-              <w:left w:val="single" w:sz="8" w:space="0" w:color="D9D2C8"/>
-              <w:bottom w:val="single" w:sz="8" w:space="0" w:color="D9D2C8"/>
-              <w:right w:val="single" w:sz="8" w:space="0" w:color="D9D2C8"/>
-            </w:tcBorders>
-            <w:tcMar>
-              <w:top w:w="70" w:type="dxa"/>
-              <w:start w:w="110" w:type="dxa"/>
-              <w:bottom w:w="70" w:type="dxa"/>
-              <w:end w:w="110" w:type="dxa"/>
-            </w:tcMar>
           </w:tcPr>
           <w:p>
             <w:pPr>
-              <w:spacing w:after="0" w:line="252" w:lineRule="auto"/>
-              <w:jc w:val="left"/>
+              <w:spacing w:after="0"/>
             </w:pPr>
             <w:r>
               <w:rPr>
-                <w:rFonts w:ascii="Aptos" w:hAnsi="Aptos" w:eastAsia="Aptos"/>
-                <w:b w:val="0"/>
-                <w:color w:val="222222"/>
+                <w:rFonts w:ascii="Arial" w:hAnsi="Arial"/>
                 <w:sz w:val="16"/>
               </w:rPr>
               <w:t>sfx_arwah_final.ogg</w:t>
@@ -3529,32 +1810,16 @@
         </w:tc>
         <w:tc>
           <w:tcPr>
-            <w:tcW w:type="dxa" w:w="4176"/>
+            <w:tcW w:type="dxa" w:w="2880"/>
             <w:vAlign w:val="center"/>
-            <w:shd w:fill="FCFAF7"/>
-            <w:tcBorders>
-              <w:top w:val="single" w:sz="8" w:space="0" w:color="D9D2C8"/>
-              <w:left w:val="single" w:sz="8" w:space="0" w:color="D9D2C8"/>
-              <w:bottom w:val="single" w:sz="8" w:space="0" w:color="D9D2C8"/>
-              <w:right w:val="single" w:sz="8" w:space="0" w:color="D9D2C8"/>
-            </w:tcBorders>
-            <w:tcMar>
-              <w:top w:w="70" w:type="dxa"/>
-              <w:start w:w="110" w:type="dxa"/>
-              <w:bottom w:w="70" w:type="dxa"/>
-              <w:end w:w="110" w:type="dxa"/>
-            </w:tcMar>
           </w:tcPr>
           <w:p>
             <w:pPr>
-              <w:spacing w:after="0" w:line="252" w:lineRule="auto"/>
-              <w:jc w:val="left"/>
+              <w:spacing w:after="0"/>
             </w:pPr>
             <w:r>
               <w:rPr>
-                <w:rFonts w:ascii="Aptos" w:hAnsi="Aptos" w:eastAsia="Aptos"/>
-                <w:b w:val="0"/>
-                <w:color w:val="222222"/>
+                <w:rFonts w:ascii="Arial" w:hAnsi="Arial"/>
                 <w:sz w:val="16"/>
               </w:rPr>
               <w:t>adv_release_ending</w:t>
@@ -3563,43 +1828,836 @@
         </w:tc>
         <w:tc>
           <w:tcPr>
-            <w:tcW w:type="dxa" w:w="6048"/>
+            <w:tcW w:type="dxa" w:w="8352"/>
             <w:vAlign w:val="center"/>
-            <w:shd w:fill="FCFAF7"/>
-            <w:tcBorders>
-              <w:top w:val="single" w:sz="8" w:space="0" w:color="D9D2C8"/>
-              <w:left w:val="single" w:sz="8" w:space="0" w:color="D9D2C8"/>
-              <w:bottom w:val="single" w:sz="8" w:space="0" w:color="D9D2C8"/>
-              <w:right w:val="single" w:sz="8" w:space="0" w:color="D9D2C8"/>
-            </w:tcBorders>
-            <w:tcMar>
-              <w:top w:w="70" w:type="dxa"/>
-              <w:start w:w="110" w:type="dxa"/>
-              <w:bottom w:w="70" w:type="dxa"/>
-              <w:end w:w="110" w:type="dxa"/>
-            </w:tcMar>
           </w:tcPr>
           <w:p>
             <w:pPr>
-              <w:spacing w:after="0" w:line="252" w:lineRule="auto"/>
-              <w:jc w:val="left"/>
+              <w:spacing w:after="0"/>
             </w:pPr>
             <w:r>
               <w:rPr>
-                <w:rFonts w:ascii="Aptos" w:hAnsi="Aptos" w:eastAsia="Aptos"/>
-                <w:b w:val="0"/>
-                <w:color w:val="222222"/>
+                <w:rFonts w:ascii="Arial" w:hAnsi="Arial"/>
                 <w:sz w:val="16"/>
               </w:rPr>
-              <w:t>Final release sound when the spirit is allowed to leave.</w:t>
+              <w:t>Final release sound when the spirit leaves.</w:t>
+            </w:r>
+          </w:p>
+        </w:tc>
+      </w:tr>
+      <w:tr>
+        <w:tc>
+          <w:tcPr>
+            <w:tcW w:type="dxa" w:w="864"/>
+            <w:vAlign w:val="center"/>
+          </w:tcPr>
+          <w:p>
+            <w:pPr>
+              <w:spacing w:after="0"/>
+            </w:pPr>
+            <w:r>
+              <w:rPr>
+                <w:rFonts w:ascii="Arial" w:hAnsi="Arial"/>
+                <w:sz w:val="16"/>
+              </w:rPr>
+              <w:t>SFX</w:t>
+            </w:r>
+          </w:p>
+        </w:tc>
+        <w:tc>
+          <w:tcPr>
+            <w:tcW w:type="dxa" w:w="2016"/>
+            <w:vAlign w:val="center"/>
+          </w:tcPr>
+          <w:p>
+            <w:pPr>
+              <w:spacing w:after="0"/>
+            </w:pPr>
+            <w:r>
+              <w:rPr>
+                <w:rFonts w:ascii="Arial" w:hAnsi="Arial"/>
+                <w:sz w:val="16"/>
+              </w:rPr>
+              <w:t>sfx_flashlight_on.ogg</w:t>
+            </w:r>
+          </w:p>
+        </w:tc>
+        <w:tc>
+          <w:tcPr>
+            <w:tcW w:type="dxa" w:w="2880"/>
+            <w:vAlign w:val="center"/>
+          </w:tcPr>
+          <w:p>
+            <w:pPr>
+              <w:spacing w:after="0"/>
+            </w:pPr>
+            <w:r>
+              <w:rPr>
+                <w:rFonts w:ascii="Arial" w:hAnsi="Arial"/>
+                <w:sz w:val="16"/>
+              </w:rPr>
+              <w:t>adv_flashlight_search</w:t>
+            </w:r>
+          </w:p>
+        </w:tc>
+        <w:tc>
+          <w:tcPr>
+            <w:tcW w:type="dxa" w:w="8352"/>
+            <w:vAlign w:val="center"/>
+          </w:tcPr>
+          <w:p>
+            <w:pPr>
+              <w:spacing w:after="0"/>
+            </w:pPr>
+            <w:r>
+              <w:rPr>
+                <w:rFonts w:ascii="Arial" w:hAnsi="Arial"/>
+                <w:sz w:val="16"/>
+              </w:rPr>
+              <w:t>Flashlight click/on cue before Ch3 grave search.</w:t>
+            </w:r>
+          </w:p>
+        </w:tc>
+      </w:tr>
+      <w:tr>
+        <w:tc>
+          <w:tcPr>
+            <w:tcW w:type="dxa" w:w="864"/>
+            <w:vAlign w:val="center"/>
+          </w:tcPr>
+          <w:p>
+            <w:pPr>
+              <w:spacing w:after="0"/>
+            </w:pPr>
+            <w:r>
+              <w:rPr>
+                <w:rFonts w:ascii="Arial" w:hAnsi="Arial"/>
+                <w:sz w:val="16"/>
+              </w:rPr>
+              <w:t>SFX</w:t>
+            </w:r>
+          </w:p>
+        </w:tc>
+        <w:tc>
+          <w:tcPr>
+            <w:tcW w:type="dxa" w:w="2016"/>
+            <w:vAlign w:val="center"/>
+          </w:tcPr>
+          <w:p>
+            <w:pPr>
+              <w:spacing w:after="0"/>
+            </w:pPr>
+            <w:r>
+              <w:rPr>
+                <w:rFonts w:ascii="Arial" w:hAnsi="Arial"/>
+                <w:sz w:val="16"/>
+              </w:rPr>
+              <w:t>sfx_flashlight_sweep.ogg</w:t>
+            </w:r>
+          </w:p>
+        </w:tc>
+        <w:tc>
+          <w:tcPr>
+            <w:tcW w:type="dxa" w:w="2880"/>
+            <w:vAlign w:val="center"/>
+          </w:tcPr>
+          <w:p>
+            <w:pPr>
+              <w:spacing w:after="0"/>
+            </w:pPr>
+            <w:r>
+              <w:rPr>
+                <w:rFonts w:ascii="Arial" w:hAnsi="Arial"/>
+                <w:sz w:val="16"/>
+              </w:rPr>
+              <w:t>adv_flashlight_search</w:t>
+            </w:r>
+          </w:p>
+        </w:tc>
+        <w:tc>
+          <w:tcPr>
+            <w:tcW w:type="dxa" w:w="8352"/>
+            <w:vAlign w:val="center"/>
+          </w:tcPr>
+          <w:p>
+            <w:pPr>
+              <w:spacing w:after="0"/>
+            </w:pPr>
+            <w:r>
+              <w:rPr>
+                <w:rFonts w:ascii="Arial" w:hAnsi="Arial"/>
+                <w:sz w:val="16"/>
+              </w:rPr>
+              <w:t>Very soft loop or movement texture while cursor beam searches graveyard.</w:t>
+            </w:r>
+          </w:p>
+        </w:tc>
+      </w:tr>
+      <w:tr>
+        <w:tc>
+          <w:tcPr>
+            <w:tcW w:type="dxa" w:w="864"/>
+            <w:vAlign w:val="center"/>
+          </w:tcPr>
+          <w:p>
+            <w:pPr>
+              <w:spacing w:after="0"/>
+            </w:pPr>
+            <w:r>
+              <w:rPr>
+                <w:rFonts w:ascii="Arial" w:hAnsi="Arial"/>
+                <w:sz w:val="16"/>
+              </w:rPr>
+              <w:t>SFX</w:t>
+            </w:r>
+          </w:p>
+        </w:tc>
+        <w:tc>
+          <w:tcPr>
+            <w:tcW w:type="dxa" w:w="2016"/>
+            <w:vAlign w:val="center"/>
+          </w:tcPr>
+          <w:p>
+            <w:pPr>
+              <w:spacing w:after="0"/>
+            </w:pPr>
+            <w:r>
+              <w:rPr>
+                <w:rFonts w:ascii="Arial" w:hAnsi="Arial"/>
+                <w:sz w:val="16"/>
+              </w:rPr>
+              <w:t>sfx_clue_reveal.ogg</w:t>
+            </w:r>
+          </w:p>
+        </w:tc>
+        <w:tc>
+          <w:tcPr>
+            <w:tcW w:type="dxa" w:w="2880"/>
+            <w:vAlign w:val="center"/>
+          </w:tcPr>
+          <w:p>
+            <w:pPr>
+              <w:spacing w:after="0"/>
+            </w:pPr>
+            <w:r>
+              <w:rPr>
+                <w:rFonts w:ascii="Arial" w:hAnsi="Arial"/>
+                <w:sz w:val="16"/>
+              </w:rPr>
+              <w:t>adv_flashlight_search</w:t>
+            </w:r>
+          </w:p>
+        </w:tc>
+        <w:tc>
+          <w:tcPr>
+            <w:tcW w:type="dxa" w:w="8352"/>
+            <w:vAlign w:val="center"/>
+          </w:tcPr>
+          <w:p>
+            <w:pPr>
+              <w:spacing w:after="0"/>
+            </w:pPr>
+            <w:r>
+              <w:rPr>
+                <w:rFonts w:ascii="Arial" w:hAnsi="Arial"/>
+                <w:sz w:val="16"/>
+              </w:rPr>
+              <w:t>Short discovery accent when soil, thread, or marker is clicked.</w:t>
+            </w:r>
+          </w:p>
+        </w:tc>
+      </w:tr>
+      <w:tr>
+        <w:tc>
+          <w:tcPr>
+            <w:tcW w:type="dxa" w:w="864"/>
+            <w:vAlign w:val="center"/>
+          </w:tcPr>
+          <w:p>
+            <w:pPr>
+              <w:spacing w:after="0"/>
+            </w:pPr>
+            <w:r>
+              <w:rPr>
+                <w:rFonts w:ascii="Arial" w:hAnsi="Arial"/>
+                <w:sz w:val="16"/>
+              </w:rPr>
+              <w:t>SFX</w:t>
+            </w:r>
+          </w:p>
+        </w:tc>
+        <w:tc>
+          <w:tcPr>
+            <w:tcW w:type="dxa" w:w="2016"/>
+            <w:vAlign w:val="center"/>
+          </w:tcPr>
+          <w:p>
+            <w:pPr>
+              <w:spacing w:after="0"/>
+            </w:pPr>
+            <w:r>
+              <w:rPr>
+                <w:rFonts w:ascii="Arial" w:hAnsi="Arial"/>
+                <w:sz w:val="16"/>
+              </w:rPr>
+              <w:t>sfx_rhythm_countdown.ogg</w:t>
+            </w:r>
+          </w:p>
+        </w:tc>
+        <w:tc>
+          <w:tcPr>
+            <w:tcW w:type="dxa" w:w="2880"/>
+            <w:vAlign w:val="center"/>
+          </w:tcPr>
+          <w:p>
+            <w:pPr>
+              <w:spacing w:after="0"/>
+            </w:pPr>
+            <w:r>
+              <w:rPr>
+                <w:rFonts w:ascii="Arial" w:hAnsi="Arial"/>
+                <w:sz w:val="16"/>
+              </w:rPr>
+              <w:t>adv_stillness</w:t>
+            </w:r>
+          </w:p>
+        </w:tc>
+        <w:tc>
+          <w:tcPr>
+            <w:tcW w:type="dxa" w:w="8352"/>
+            <w:vAlign w:val="center"/>
+          </w:tcPr>
+          <w:p>
+            <w:pPr>
+              <w:spacing w:after="0"/>
+            </w:pPr>
+            <w:r>
+              <w:rPr>
+                <w:rFonts w:ascii="Arial" w:hAnsi="Arial"/>
+                <w:sz w:val="16"/>
+              </w:rPr>
+              <w:t>Low pulse during 5-second prep countdown.</w:t>
+            </w:r>
+          </w:p>
+        </w:tc>
+      </w:tr>
+      <w:tr>
+        <w:tc>
+          <w:tcPr>
+            <w:tcW w:type="dxa" w:w="864"/>
+            <w:vAlign w:val="center"/>
+          </w:tcPr>
+          <w:p>
+            <w:pPr>
+              <w:spacing w:after="0"/>
+            </w:pPr>
+            <w:r>
+              <w:rPr>
+                <w:rFonts w:ascii="Arial" w:hAnsi="Arial"/>
+                <w:sz w:val="16"/>
+              </w:rPr>
+              <w:t>SFX</w:t>
+            </w:r>
+          </w:p>
+        </w:tc>
+        <w:tc>
+          <w:tcPr>
+            <w:tcW w:type="dxa" w:w="2016"/>
+            <w:vAlign w:val="center"/>
+          </w:tcPr>
+          <w:p>
+            <w:pPr>
+              <w:spacing w:after="0"/>
+            </w:pPr>
+            <w:r>
+              <w:rPr>
+                <w:rFonts w:ascii="Arial" w:hAnsi="Arial"/>
+                <w:sz w:val="16"/>
+              </w:rPr>
+              <w:t>sfx_rhythm_hit.ogg</w:t>
+            </w:r>
+          </w:p>
+        </w:tc>
+        <w:tc>
+          <w:tcPr>
+            <w:tcW w:type="dxa" w:w="2880"/>
+            <w:vAlign w:val="center"/>
+          </w:tcPr>
+          <w:p>
+            <w:pPr>
+              <w:spacing w:after="0"/>
+            </w:pPr>
+            <w:r>
+              <w:rPr>
+                <w:rFonts w:ascii="Arial" w:hAnsi="Arial"/>
+                <w:sz w:val="16"/>
+              </w:rPr>
+              <w:t>adv_stillness</w:t>
+            </w:r>
+          </w:p>
+        </w:tc>
+        <w:tc>
+          <w:tcPr>
+            <w:tcW w:type="dxa" w:w="8352"/>
+            <w:vAlign w:val="center"/>
+          </w:tcPr>
+          <w:p>
+            <w:pPr>
+              <w:spacing w:after="0"/>
+            </w:pPr>
+            <w:r>
+              <w:rPr>
+                <w:rFonts w:ascii="Arial" w:hAnsi="Arial"/>
+                <w:sz w:val="16"/>
+              </w:rPr>
+              <w:t>Subtle confirmation for correct Space press.</w:t>
+            </w:r>
+          </w:p>
+        </w:tc>
+      </w:tr>
+      <w:tr>
+        <w:tc>
+          <w:tcPr>
+            <w:tcW w:type="dxa" w:w="864"/>
+            <w:vAlign w:val="center"/>
+          </w:tcPr>
+          <w:p>
+            <w:pPr>
+              <w:spacing w:after="0"/>
+            </w:pPr>
+            <w:r>
+              <w:rPr>
+                <w:rFonts w:ascii="Arial" w:hAnsi="Arial"/>
+                <w:sz w:val="16"/>
+              </w:rPr>
+              <w:t>SFX</w:t>
+            </w:r>
+          </w:p>
+        </w:tc>
+        <w:tc>
+          <w:tcPr>
+            <w:tcW w:type="dxa" w:w="2016"/>
+            <w:vAlign w:val="center"/>
+          </w:tcPr>
+          <w:p>
+            <w:pPr>
+              <w:spacing w:after="0"/>
+            </w:pPr>
+            <w:r>
+              <w:rPr>
+                <w:rFonts w:ascii="Arial" w:hAnsi="Arial"/>
+                <w:sz w:val="16"/>
+              </w:rPr>
+              <w:t>sfx_rhythm_miss.ogg</w:t>
+            </w:r>
+          </w:p>
+        </w:tc>
+        <w:tc>
+          <w:tcPr>
+            <w:tcW w:type="dxa" w:w="2880"/>
+            <w:vAlign w:val="center"/>
+          </w:tcPr>
+          <w:p>
+            <w:pPr>
+              <w:spacing w:after="0"/>
+            </w:pPr>
+            <w:r>
+              <w:rPr>
+                <w:rFonts w:ascii="Arial" w:hAnsi="Arial"/>
+                <w:sz w:val="16"/>
+              </w:rPr>
+              <w:t>adv_stillness</w:t>
+            </w:r>
+          </w:p>
+        </w:tc>
+        <w:tc>
+          <w:tcPr>
+            <w:tcW w:type="dxa" w:w="8352"/>
+            <w:vAlign w:val="center"/>
+          </w:tcPr>
+          <w:p>
+            <w:pPr>
+              <w:spacing w:after="0"/>
+            </w:pPr>
+            <w:r>
+              <w:rPr>
+                <w:rFonts w:ascii="Arial" w:hAnsi="Arial"/>
+                <w:sz w:val="16"/>
+              </w:rPr>
+              <w:t>Sharp stumble/panic cue for wrong Space press or mouse click.</w:t>
+            </w:r>
+          </w:p>
+        </w:tc>
+      </w:tr>
+      <w:tr>
+        <w:tc>
+          <w:tcPr>
+            <w:tcW w:type="dxa" w:w="864"/>
+            <w:vAlign w:val="center"/>
+          </w:tcPr>
+          <w:p>
+            <w:pPr>
+              <w:spacing w:after="0"/>
+            </w:pPr>
+            <w:r>
+              <w:rPr>
+                <w:rFonts w:ascii="Arial" w:hAnsi="Arial"/>
+                <w:sz w:val="16"/>
+              </w:rPr>
+              <w:t>SFX</w:t>
+            </w:r>
+          </w:p>
+        </w:tc>
+        <w:tc>
+          <w:tcPr>
+            <w:tcW w:type="dxa" w:w="2016"/>
+            <w:vAlign w:val="center"/>
+          </w:tcPr>
+          <w:p>
+            <w:pPr>
+              <w:spacing w:after="0"/>
+            </w:pPr>
+            <w:r>
+              <w:rPr>
+                <w:rFonts w:ascii="Arial" w:hAnsi="Arial"/>
+                <w:sz w:val="16"/>
+              </w:rPr>
+              <w:t>sfx_rhythm_complete.ogg</w:t>
+            </w:r>
+          </w:p>
+        </w:tc>
+        <w:tc>
+          <w:tcPr>
+            <w:tcW w:type="dxa" w:w="2880"/>
+            <w:vAlign w:val="center"/>
+          </w:tcPr>
+          <w:p>
+            <w:pPr>
+              <w:spacing w:after="0"/>
+            </w:pPr>
+            <w:r>
+              <w:rPr>
+                <w:rFonts w:ascii="Arial" w:hAnsi="Arial"/>
+                <w:sz w:val="16"/>
+              </w:rPr>
+              <w:t>adv_stillness</w:t>
+            </w:r>
+          </w:p>
+        </w:tc>
+        <w:tc>
+          <w:tcPr>
+            <w:tcW w:type="dxa" w:w="8352"/>
+            <w:vAlign w:val="center"/>
+          </w:tcPr>
+          <w:p>
+            <w:pPr>
+              <w:spacing w:after="0"/>
+            </w:pPr>
+            <w:r>
+              <w:rPr>
+                <w:rFonts w:ascii="Arial" w:hAnsi="Arial"/>
+                <w:sz w:val="16"/>
+              </w:rPr>
+              <w:t>Release of tension after four correct rhythm presses.</w:t>
+            </w:r>
+          </w:p>
+        </w:tc>
+      </w:tr>
+      <w:tr>
+        <w:tc>
+          <w:tcPr>
+            <w:tcW w:type="dxa" w:w="864"/>
+            <w:vAlign w:val="center"/>
+          </w:tcPr>
+          <w:p>
+            <w:pPr>
+              <w:spacing w:after="0"/>
+            </w:pPr>
+            <w:r>
+              <w:rPr>
+                <w:rFonts w:ascii="Arial" w:hAnsi="Arial"/>
+                <w:sz w:val="16"/>
+              </w:rPr>
+              <w:t>SFX</w:t>
+            </w:r>
+          </w:p>
+        </w:tc>
+        <w:tc>
+          <w:tcPr>
+            <w:tcW w:type="dxa" w:w="2016"/>
+            <w:vAlign w:val="center"/>
+          </w:tcPr>
+          <w:p>
+            <w:pPr>
+              <w:spacing w:after="0"/>
+            </w:pPr>
+            <w:r>
+              <w:rPr>
+                <w:rFonts w:ascii="Arial" w:hAnsi="Arial"/>
+                <w:sz w:val="16"/>
+              </w:rPr>
+              <w:t>sfx_ui_confirm.ogg</w:t>
+            </w:r>
+          </w:p>
+        </w:tc>
+        <w:tc>
+          <w:tcPr>
+            <w:tcW w:type="dxa" w:w="2880"/>
+            <w:vAlign w:val="center"/>
+          </w:tcPr>
+          <w:p>
+            <w:pPr>
+              <w:spacing w:after="0"/>
+            </w:pPr>
+            <w:r>
+              <w:rPr>
+                <w:rFonts w:ascii="Arial" w:hAnsi="Arial"/>
+                <w:sz w:val="16"/>
+              </w:rPr>
+              <w:t>adv_case_summary; adv_flashlight_search</w:t>
+            </w:r>
+          </w:p>
+        </w:tc>
+        <w:tc>
+          <w:tcPr>
+            <w:tcW w:type="dxa" w:w="8352"/>
+            <w:vAlign w:val="center"/>
+          </w:tcPr>
+          <w:p>
+            <w:pPr>
+              <w:spacing w:after="0"/>
+            </w:pPr>
+            <w:r>
+              <w:rPr>
+                <w:rFonts w:ascii="Arial" w:hAnsi="Arial"/>
+                <w:sz w:val="16"/>
+              </w:rPr>
+              <w:t>Soft UI confirmation for Selesai/continue actions if desired.</w:t>
             </w:r>
           </w:p>
         </w:tc>
       </w:tr>
     </w:tbl>
+    <w:p/>
+    <w:p>
+      <w:pPr>
+        <w:pStyle w:val="Heading1"/>
+      </w:pPr>
+      <w:r>
+        <w:t>Implementation Notes</w:t>
+      </w:r>
+    </w:p>
+    <w:p>
+      <w:pPr>
+        <w:spacing w:after="120"/>
+      </w:pPr>
+      <w:r>
+        <w:t>These notes align production with the current code state.</w:t>
+      </w:r>
+    </w:p>
+    <w:tbl>
+      <w:tblPr>
+        <w:tblStyle w:val="TableGrid"/>
+        <w:tblW w:type="auto" w:w="0"/>
+        <w:jc w:val="center"/>
+        <w:tblLayout w:type="fixed"/>
+        <w:tblLook w:firstColumn="1" w:firstRow="1" w:lastColumn="0" w:lastRow="0" w:noHBand="0" w:noVBand="1" w:val="04A0"/>
+      </w:tblPr>
+      <w:tblGrid>
+        <w:gridCol w:w="7200"/>
+        <w:gridCol w:w="7200"/>
+      </w:tblGrid>
+      <w:tr>
+        <w:tc>
+          <w:tcPr>
+            <w:tcW w:type="dxa" w:w="2448"/>
+            <w:vAlign w:val="center"/>
+          </w:tcPr>
+          <w:p>
+            <w:r>
+              <w:rPr>
+                <w:rFonts w:ascii="Arial" w:hAnsi="Arial"/>
+                <w:b/>
+                <w:sz w:val="17"/>
+              </w:rPr>
+              <w:t>Area</w:t>
+            </w:r>
+          </w:p>
+        </w:tc>
+        <w:tc>
+          <w:tcPr>
+            <w:tcW w:type="dxa" w:w="11664"/>
+            <w:vAlign w:val="center"/>
+          </w:tcPr>
+          <w:p>
+            <w:r>
+              <w:rPr>
+                <w:rFonts w:ascii="Arial" w:hAnsi="Arial"/>
+                <w:b/>
+                <w:sz w:val="17"/>
+              </w:rPr>
+              <w:t>Requirement</w:t>
+            </w:r>
+          </w:p>
+        </w:tc>
+      </w:tr>
+      <w:tr>
+        <w:tc>
+          <w:tcPr>
+            <w:tcW w:type="dxa" w:w="2448"/>
+            <w:vAlign w:val="center"/>
+          </w:tcPr>
+          <w:p>
+            <w:pPr>
+              <w:spacing w:after="0"/>
+            </w:pPr>
+            <w:r>
+              <w:rPr>
+                <w:rFonts w:ascii="Arial" w:hAnsi="Arial"/>
+                <w:sz w:val="16"/>
+              </w:rPr>
+              <w:t>Current code state</w:t>
+            </w:r>
+          </w:p>
+        </w:tc>
+        <w:tc>
+          <w:tcPr>
+            <w:tcW w:type="dxa" w:w="11664"/>
+            <w:vAlign w:val="center"/>
+          </w:tcPr>
+          <w:p>
+            <w:pPr>
+              <w:spacing w:after="0"/>
+            </w:pPr>
+            <w:r>
+              <w:rPr>
+                <w:rFonts w:ascii="Arial" w:hAnsi="Arial"/>
+                <w:sz w:val="16"/>
+              </w:rPr>
+              <w:t>audio.rpy aliases are still commented until files exist. Add new aliases for the mechanic SFX when assets are delivered.</w:t>
+            </w:r>
+          </w:p>
+        </w:tc>
+      </w:tr>
+      <w:tr>
+        <w:tc>
+          <w:tcPr>
+            <w:tcW w:type="dxa" w:w="2448"/>
+            <w:vAlign w:val="center"/>
+          </w:tcPr>
+          <w:p>
+            <w:pPr>
+              <w:spacing w:after="0"/>
+            </w:pPr>
+            <w:r>
+              <w:rPr>
+                <w:rFonts w:ascii="Arial" w:hAnsi="Arial"/>
+                <w:sz w:val="16"/>
+              </w:rPr>
+              <w:t>Rhythm rule</w:t>
+            </w:r>
+          </w:p>
+        </w:tc>
+        <w:tc>
+          <w:tcPr>
+            <w:tcW w:type="dxa" w:w="11664"/>
+            <w:vAlign w:val="center"/>
+          </w:tcPr>
+          <w:p>
+            <w:pPr>
+              <w:spacing w:after="0"/>
+            </w:pPr>
+            <w:r>
+              <w:rPr>
+                <w:rFonts w:ascii="Arial" w:hAnsi="Arial"/>
+                <w:sz w:val="16"/>
+              </w:rPr>
+              <w:t>The stillness mini-game now requires four correct Space presses. Audio should reinforce timing without making success impossible for players with lower volume.</w:t>
+            </w:r>
+          </w:p>
+        </w:tc>
+      </w:tr>
+      <w:tr>
+        <w:tc>
+          <w:tcPr>
+            <w:tcW w:type="dxa" w:w="2448"/>
+            <w:vAlign w:val="center"/>
+          </w:tcPr>
+          <w:p>
+            <w:pPr>
+              <w:spacing w:after="0"/>
+            </w:pPr>
+            <w:r>
+              <w:rPr>
+                <w:rFonts w:ascii="Arial" w:hAnsi="Arial"/>
+                <w:sz w:val="16"/>
+              </w:rPr>
+              <w:t>Flashlight rule</w:t>
+            </w:r>
+          </w:p>
+        </w:tc>
+        <w:tc>
+          <w:tcPr>
+            <w:tcW w:type="dxa" w:w="11664"/>
+            <w:vAlign w:val="center"/>
+          </w:tcPr>
+          <w:p>
+            <w:pPr>
+              <w:spacing w:after="0"/>
+            </w:pPr>
+            <w:r>
+              <w:rPr>
+                <w:rFonts w:ascii="Arial" w:hAnsi="Arial"/>
+                <w:sz w:val="16"/>
+              </w:rPr>
+              <w:t>The grave search uses a cursor beam and scattered clues. Audio should reward discovery but not loop loudly over dialogue.</w:t>
+            </w:r>
+          </w:p>
+        </w:tc>
+      </w:tr>
+      <w:tr>
+        <w:tc>
+          <w:tcPr>
+            <w:tcW w:type="dxa" w:w="2448"/>
+            <w:vAlign w:val="center"/>
+          </w:tcPr>
+          <w:p>
+            <w:pPr>
+              <w:spacing w:after="0"/>
+            </w:pPr>
+            <w:r>
+              <w:rPr>
+                <w:rFonts w:ascii="Arial" w:hAnsi="Arial"/>
+                <w:sz w:val="16"/>
+              </w:rPr>
+              <w:t>Mixing</w:t>
+            </w:r>
+          </w:p>
+        </w:tc>
+        <w:tc>
+          <w:tcPr>
+            <w:tcW w:type="dxa" w:w="11664"/>
+            <w:vAlign w:val="center"/>
+          </w:tcPr>
+          <w:p>
+            <w:pPr>
+              <w:spacing w:after="0"/>
+            </w:pPr>
+            <w:r>
+              <w:rPr>
+                <w:rFonts w:ascii="Arial" w:hAnsi="Arial"/>
+                <w:sz w:val="16"/>
+              </w:rPr>
+              <w:t>Keep pocong duk, rhythm hit/miss, and shriek distinct. Avoid using the same transient for body hit and rhythm miss.</w:t>
+            </w:r>
+          </w:p>
+        </w:tc>
+      </w:tr>
+    </w:tbl>
+    <w:p/>
     <w:sectPr>
       <w:pgSz w:w="15840" w:h="12240" w:orient="landscape"/>
-      <w:pgMar w:top="504" w:right="576" w:bottom="504" w:left="576" w:header="720" w:footer="720" w:gutter="0"/>
+      <w:pgMar w:top="720" w:right="720" w:bottom="720" w:left="720" w:header="720" w:footer="720" w:gutter="0"/>
       <w:cols w:space="720"/>
       <w:docGrid w:linePitch="360"/>
     </w:sectPr>
@@ -3971,8 +3029,8 @@
     <w:qFormat/>
     <w:rsid w:val="00FC693F"/>
     <w:rPr>
-      <w:rFonts w:ascii="Aptos" w:hAnsi="Aptos" w:eastAsia="Aptos"/>
-      <w:sz w:val="18"/>
+      <w:rFonts w:ascii="Arial" w:hAnsi="Arial" w:eastAsia="Aptos"/>
+      <w:sz w:val="19"/>
     </w:rPr>
   </w:style>
   <w:style w:type="paragraph" w:styleId="Header">
@@ -4030,11 +3088,11 @@
     <w:pPr>
       <w:keepNext/>
       <w:keepLines/>
-      <w:spacing w:before="480" w:after="0"/>
+      <w:spacing w:before="200" w:after="80"/>
       <w:outlineLvl w:val="0"/>
     </w:pPr>
     <w:rPr>
-      <w:rFonts w:asciiTheme="majorHAnsi" w:eastAsiaTheme="majorEastAsia" w:hAnsiTheme="majorHAnsi" w:cstheme="majorBidi"/>
+      <w:rFonts w:asciiTheme="majorHAnsi" w:eastAsiaTheme="majorEastAsia" w:hAnsiTheme="majorHAnsi" w:cstheme="majorBidi" w:ascii="Arial" w:hAnsi="Arial"/>
       <w:b/>
       <w:bCs/>
       <w:color w:val="365F91" w:themeColor="accent1" w:themeShade="BF"/>
@@ -4054,15 +3112,15 @@
     <w:pPr>
       <w:keepNext/>
       <w:keepLines/>
-      <w:spacing w:before="200" w:after="0"/>
+      <w:spacing w:before="140" w:after="60"/>
       <w:outlineLvl w:val="1"/>
     </w:pPr>
     <w:rPr>
-      <w:rFonts w:asciiTheme="majorHAnsi" w:eastAsiaTheme="majorEastAsia" w:hAnsiTheme="majorHAnsi" w:cstheme="majorBidi"/>
+      <w:rFonts w:asciiTheme="majorHAnsi" w:eastAsiaTheme="majorEastAsia" w:hAnsiTheme="majorHAnsi" w:cstheme="majorBidi" w:ascii="Arial" w:hAnsi="Arial"/>
       <w:b/>
       <w:bCs/>
       <w:color w:val="4F81BD" w:themeColor="accent1"/>
-      <w:sz w:val="26"/>
+      <w:sz w:val="23"/>
       <w:szCs w:val="26"/>
     </w:rPr>
   </w:style>
@@ -4319,15 +3377,15 @@
       <w:pBdr>
         <w:bottom w:val="single" w:sz="8" w:space="4" w:color="4F81BD" w:themeColor="accent1"/>
       </w:pBdr>
-      <w:spacing w:after="300" w:line="240" w:lineRule="auto"/>
+      <w:spacing w:after="60" w:line="240" w:lineRule="auto" w:before="0"/>
       <w:contextualSpacing/>
     </w:pPr>
     <w:rPr>
-      <w:rFonts w:asciiTheme="majorHAnsi" w:eastAsiaTheme="majorEastAsia" w:hAnsiTheme="majorHAnsi" w:cstheme="majorBidi"/>
+      <w:rFonts w:asciiTheme="majorHAnsi" w:eastAsiaTheme="majorEastAsia" w:hAnsiTheme="majorHAnsi" w:cstheme="majorBidi" w:ascii="Arial" w:hAnsi="Arial"/>
       <w:color w:val="17365D" w:themeColor="text2" w:themeShade="BF"/>
       <w:spacing w:val="5"/>
       <w:kern w:val="28"/>
-      <w:sz w:val="52"/>
+      <w:sz w:val="40"/>
       <w:szCs w:val="52"/>
     </w:rPr>
   </w:style>
@@ -4358,14 +3416,15 @@
       <w:numPr>
         <w:ilvl w:val="1"/>
       </w:numPr>
+      <w:spacing w:before="0" w:after="160"/>
     </w:pPr>
     <w:rPr>
-      <w:rFonts w:asciiTheme="majorHAnsi" w:eastAsiaTheme="majorEastAsia" w:hAnsiTheme="majorHAnsi" w:cstheme="majorBidi"/>
+      <w:rFonts w:asciiTheme="majorHAnsi" w:eastAsiaTheme="majorEastAsia" w:hAnsiTheme="majorHAnsi" w:cstheme="majorBidi" w:ascii="Arial" w:hAnsi="Arial"/>
       <w:i/>
       <w:iCs/>
       <w:color w:val="4F81BD" w:themeColor="accent1"/>
       <w:spacing w:val="15"/>
-      <w:sz w:val="24"/>
+      <w:sz w:val="21"/>
       <w:szCs w:val="24"/>
     </w:rPr>
   </w:style>

</xml_diff>